<commit_message>
Date: 11 Sept 2025
</commit_message>
<xml_diff>
--- a/Assignments.docx
+++ b/Assignments.docx
@@ -372,316 +372,458 @@
           <w:szCs w:val="24"/>
           <w:lang w:val="en-US"/>
         </w:rPr>
+        <w:t>Ac</w:t>
+      </w:r>
+      <w:r>
+        <w:rPr>
+          <w:sz w:val="24"/>
+          <w:szCs w:val="24"/>
+          <w:lang w:val="en-US"/>
+        </w:rPr>
+        <w:t>cept marks of 5 subjects and cal</w:t>
+      </w:r>
+      <w:r>
+        <w:rPr>
+          <w:sz w:val="24"/>
+          <w:szCs w:val="24"/>
+          <w:lang w:val="en-US"/>
+        </w:rPr>
+        <w:t>culate total and average marks also display the grade as follows</w:t>
+      </w:r>
+      <w:r>
+        <w:rPr>
+          <w:sz w:val="24"/>
+          <w:szCs w:val="24"/>
+          <w:lang w:val="en-US"/>
+        </w:rPr>
+        <w:br/>
+      </w:r>
+      <w:r>
+        <w:rPr>
+          <w:sz w:val="24"/>
+          <w:szCs w:val="24"/>
+          <w:lang w:val="en-US"/>
+        </w:rPr>
+        <w:tab/>
+      </w:r>
+      <w:r>
+        <w:rPr>
+          <w:sz w:val="24"/>
+          <w:szCs w:val="24"/>
+          <w:lang w:val="en-US"/>
+        </w:rPr>
+        <w:t xml:space="preserve">Average </w:t>
+      </w:r>
+      <w:r>
+        <w:rPr>
+          <w:sz w:val="24"/>
+          <w:szCs w:val="24"/>
+          <w:lang w:val="en-US"/>
+        </w:rPr>
+        <w:t>Marks</w:t>
+      </w:r>
+      <w:r>
+        <w:rPr>
+          <w:sz w:val="24"/>
+          <w:szCs w:val="24"/>
+          <w:lang w:val="en-US"/>
+        </w:rPr>
+        <w:tab/>
+        <w:t>Grade</w:t>
+      </w:r>
+      <w:r>
+        <w:rPr>
+          <w:sz w:val="24"/>
+          <w:szCs w:val="24"/>
+          <w:lang w:val="en-US"/>
+        </w:rPr>
+        <w:br/>
+      </w:r>
+      <w:r>
+        <w:rPr>
+          <w:sz w:val="24"/>
+          <w:szCs w:val="24"/>
+          <w:lang w:val="en-US"/>
+        </w:rPr>
+        <w:tab/>
+        <w:t>&gt;= 85</w:t>
+      </w:r>
+      <w:r>
+        <w:rPr>
+          <w:sz w:val="24"/>
+          <w:szCs w:val="24"/>
+          <w:lang w:val="en-US"/>
+        </w:rPr>
+        <w:tab/>
+      </w:r>
+      <w:r>
+        <w:rPr>
+          <w:sz w:val="24"/>
+          <w:szCs w:val="24"/>
+          <w:lang w:val="en-US"/>
+        </w:rPr>
+        <w:tab/>
+      </w:r>
+      <w:r>
+        <w:rPr>
+          <w:sz w:val="24"/>
+          <w:szCs w:val="24"/>
+          <w:lang w:val="en-US"/>
+        </w:rPr>
+        <w:tab/>
+      </w:r>
+      <w:proofErr w:type="spellStart"/>
+      <w:r>
+        <w:rPr>
+          <w:sz w:val="24"/>
+          <w:szCs w:val="24"/>
+          <w:lang w:val="en-US"/>
+        </w:rPr>
+        <w:t>Dist</w:t>
+      </w:r>
+      <w:proofErr w:type="spellEnd"/>
+      <w:r>
+        <w:rPr>
+          <w:sz w:val="24"/>
+          <w:szCs w:val="24"/>
+          <w:lang w:val="en-US"/>
+        </w:rPr>
+        <w:br/>
+      </w:r>
+      <w:r>
+        <w:rPr>
+          <w:sz w:val="24"/>
+          <w:szCs w:val="24"/>
+          <w:lang w:val="en-US"/>
+        </w:rPr>
+        <w:tab/>
+        <w:t>&lt; 85 &amp; &gt;= 75</w:t>
+      </w:r>
+      <w:r>
+        <w:rPr>
+          <w:sz w:val="24"/>
+          <w:szCs w:val="24"/>
+          <w:lang w:val="en-US"/>
+        </w:rPr>
+        <w:tab/>
+      </w:r>
+      <w:r>
+        <w:rPr>
+          <w:sz w:val="24"/>
+          <w:szCs w:val="24"/>
+          <w:lang w:val="en-US"/>
+        </w:rPr>
+        <w:tab/>
         <w:t>A</w:t>
+      </w:r>
+      <w:r>
+        <w:rPr>
+          <w:sz w:val="24"/>
+          <w:szCs w:val="24"/>
+          <w:lang w:val="en-US"/>
+        </w:rPr>
+        <w:br/>
+      </w:r>
+      <w:r>
+        <w:rPr>
+          <w:sz w:val="24"/>
+          <w:szCs w:val="24"/>
+          <w:lang w:val="en-US"/>
+        </w:rPr>
+        <w:tab/>
+        <w:t>&lt; 75 &amp; &gt;= 60</w:t>
+      </w:r>
+      <w:r>
+        <w:rPr>
+          <w:sz w:val="24"/>
+          <w:szCs w:val="24"/>
+          <w:lang w:val="en-US"/>
+        </w:rPr>
+        <w:tab/>
+      </w:r>
+      <w:r>
+        <w:rPr>
+          <w:sz w:val="24"/>
+          <w:szCs w:val="24"/>
+          <w:lang w:val="en-US"/>
+        </w:rPr>
+        <w:tab/>
+        <w:t>B</w:t>
+      </w:r>
+      <w:r>
+        <w:rPr>
+          <w:sz w:val="24"/>
+          <w:szCs w:val="24"/>
+          <w:lang w:val="en-US"/>
+        </w:rPr>
+        <w:br/>
+      </w:r>
+      <w:r>
+        <w:rPr>
+          <w:sz w:val="24"/>
+          <w:szCs w:val="24"/>
+          <w:lang w:val="en-US"/>
+        </w:rPr>
+        <w:tab/>
+        <w:t>&lt; 60 &amp; &gt;= 50</w:t>
+      </w:r>
+      <w:r>
+        <w:rPr>
+          <w:sz w:val="24"/>
+          <w:szCs w:val="24"/>
+          <w:lang w:val="en-US"/>
+        </w:rPr>
+        <w:tab/>
+      </w:r>
+      <w:r>
+        <w:rPr>
+          <w:sz w:val="24"/>
+          <w:szCs w:val="24"/>
+          <w:lang w:val="en-US"/>
+        </w:rPr>
+        <w:tab/>
+        <w:t>C</w:t>
+      </w:r>
+      <w:r>
+        <w:rPr>
+          <w:sz w:val="24"/>
+          <w:szCs w:val="24"/>
+          <w:lang w:val="en-US"/>
+        </w:rPr>
+        <w:br/>
+      </w:r>
+      <w:r>
+        <w:rPr>
+          <w:sz w:val="24"/>
+          <w:szCs w:val="24"/>
+          <w:lang w:val="en-US"/>
+        </w:rPr>
+        <w:tab/>
+        <w:t>&lt; 50 &amp; &gt;= 35</w:t>
+      </w:r>
+      <w:r>
+        <w:rPr>
+          <w:sz w:val="24"/>
+          <w:szCs w:val="24"/>
+          <w:lang w:val="en-US"/>
+        </w:rPr>
+        <w:tab/>
+      </w:r>
+      <w:r>
+        <w:rPr>
+          <w:sz w:val="24"/>
+          <w:szCs w:val="24"/>
+          <w:lang w:val="en-US"/>
+        </w:rPr>
+        <w:tab/>
+        <w:t>D</w:t>
+      </w:r>
+      <w:r>
+        <w:rPr>
+          <w:sz w:val="24"/>
+          <w:szCs w:val="24"/>
+          <w:lang w:val="en-US"/>
+        </w:rPr>
+        <w:br/>
+      </w:r>
+      <w:r>
+        <w:rPr>
+          <w:sz w:val="24"/>
+          <w:szCs w:val="24"/>
+          <w:lang w:val="en-US"/>
+        </w:rPr>
+        <w:tab/>
+        <w:t>&lt; 35</w:t>
+      </w:r>
+      <w:r>
+        <w:rPr>
+          <w:sz w:val="24"/>
+          <w:szCs w:val="24"/>
+          <w:lang w:val="en-US"/>
+        </w:rPr>
+        <w:tab/>
+      </w:r>
+      <w:r>
+        <w:rPr>
+          <w:sz w:val="24"/>
+          <w:szCs w:val="24"/>
+          <w:lang w:val="en-US"/>
+        </w:rPr>
+        <w:tab/>
+      </w:r>
+      <w:r>
+        <w:rPr>
+          <w:sz w:val="24"/>
+          <w:szCs w:val="24"/>
+          <w:lang w:val="en-US"/>
+        </w:rPr>
+        <w:tab/>
+        <w:t>Fail</w:t>
+      </w:r>
+    </w:p>
+    <w:p>
+      <w:pPr>
+        <w:pStyle w:val="ListParagraph"/>
+        <w:numPr>
+          <w:ilvl w:val="0"/>
+          <w:numId w:val="1"/>
+        </w:numPr>
+        <w:rPr>
+          <w:lang w:val="en-US"/>
+        </w:rPr>
+      </w:pPr>
+      <w:r>
+        <w:rPr>
+          <w:lang w:val="en-US"/>
+        </w:rPr>
+        <w:t xml:space="preserve">Create a Class with name Bank having following </w:t>
+      </w:r>
+    </w:p>
+    <w:p>
+      <w:pPr>
+        <w:pStyle w:val="ListParagraph"/>
+        <w:numPr>
+          <w:ilvl w:val="1"/>
+          <w:numId w:val="1"/>
+        </w:numPr>
+        <w:rPr>
+          <w:lang w:val="en-US"/>
+        </w:rPr>
+      </w:pPr>
+      <w:r>
+        <w:rPr>
+          <w:lang w:val="en-US"/>
+        </w:rPr>
+        <w:t>Data Members</w:t>
+      </w:r>
+    </w:p>
+    <w:p>
+      <w:pPr>
+        <w:pStyle w:val="ListParagraph"/>
+        <w:numPr>
+          <w:ilvl w:val="2"/>
+          <w:numId w:val="1"/>
+        </w:numPr>
+        <w:rPr>
+          <w:lang w:val="en-US"/>
+        </w:rPr>
+      </w:pPr>
+      <w:proofErr w:type="spellStart"/>
+      <w:r>
+        <w:rPr>
+          <w:lang w:val="en-US"/>
+        </w:rPr>
+        <w:t>AccountNo</w:t>
+      </w:r>
+      <w:proofErr w:type="spellEnd"/>
+    </w:p>
+    <w:p>
+      <w:pPr>
+        <w:pStyle w:val="ListParagraph"/>
+        <w:numPr>
+          <w:ilvl w:val="2"/>
+          <w:numId w:val="1"/>
+        </w:numPr>
+        <w:rPr>
+          <w:lang w:val="en-US"/>
+        </w:rPr>
+      </w:pPr>
+      <w:proofErr w:type="spellStart"/>
+      <w:r>
+        <w:rPr>
+          <w:lang w:val="en-US"/>
+        </w:rPr>
+        <w:t>AccountHolderName</w:t>
+      </w:r>
+      <w:proofErr w:type="spellEnd"/>
+    </w:p>
+    <w:p>
+      <w:pPr>
+        <w:pStyle w:val="ListParagraph"/>
+        <w:numPr>
+          <w:ilvl w:val="2"/>
+          <w:numId w:val="1"/>
+        </w:numPr>
+        <w:rPr>
+          <w:lang w:val="en-US"/>
+        </w:rPr>
+      </w:pPr>
+      <w:r>
+        <w:rPr>
+          <w:lang w:val="en-US"/>
+        </w:rPr>
+        <w:t>Balance</w:t>
+      </w:r>
+    </w:p>
+    <w:p>
+      <w:pPr>
+        <w:pStyle w:val="ListParagraph"/>
+        <w:numPr>
+          <w:ilvl w:val="2"/>
+          <w:numId w:val="1"/>
+        </w:numPr>
+        <w:rPr>
+          <w:lang w:val="en-US"/>
+        </w:rPr>
+      </w:pPr>
+      <w:r>
+        <w:rPr>
+          <w:lang w:val="en-US"/>
+        </w:rPr>
+        <w:t>Gender</w:t>
+      </w:r>
+    </w:p>
+    <w:p>
+      <w:pPr>
+        <w:pStyle w:val="ListParagraph"/>
+        <w:numPr>
+          <w:ilvl w:val="1"/>
+          <w:numId w:val="1"/>
+        </w:numPr>
+        <w:rPr>
+          <w:lang w:val="en-US"/>
+        </w:rPr>
+      </w:pPr>
+      <w:r>
+        <w:rPr>
+          <w:lang w:val="en-US"/>
+        </w:rPr>
+        <w:t>Member function</w:t>
+      </w:r>
+    </w:p>
+    <w:p>
+      <w:pPr>
+        <w:pStyle w:val="ListParagraph"/>
+        <w:numPr>
+          <w:ilvl w:val="2"/>
+          <w:numId w:val="1"/>
+        </w:numPr>
+        <w:rPr>
+          <w:lang w:val="en-US"/>
+        </w:rPr>
+      </w:pPr>
+      <w:proofErr w:type="spellStart"/>
+      <w:r>
+        <w:rPr>
+          <w:lang w:val="en-US"/>
+        </w:rPr>
+        <w:t>Displa</w:t>
       </w:r>
       <w:bookmarkStart w:id="0" w:name="_GoBack"/>
       <w:bookmarkEnd w:id="0"/>
       <w:r>
         <w:rPr>
-          <w:sz w:val="24"/>
-          <w:szCs w:val="24"/>
-          <w:lang w:val="en-US"/>
-        </w:rPr>
-        <w:t>c</w:t>
-      </w:r>
-      <w:r>
-        <w:rPr>
-          <w:sz w:val="24"/>
-          <w:szCs w:val="24"/>
-          <w:lang w:val="en-US"/>
-        </w:rPr>
-        <w:t>cept marks of 5 subjects and cal</w:t>
-      </w:r>
-      <w:r>
-        <w:rPr>
-          <w:sz w:val="24"/>
-          <w:szCs w:val="24"/>
-          <w:lang w:val="en-US"/>
-        </w:rPr>
-        <w:t>culate total and average marks also display the grade as follows</w:t>
-      </w:r>
-      <w:r>
-        <w:rPr>
-          <w:sz w:val="24"/>
-          <w:szCs w:val="24"/>
-          <w:lang w:val="en-US"/>
-        </w:rPr>
-        <w:br/>
-      </w:r>
-      <w:r>
-        <w:rPr>
-          <w:sz w:val="24"/>
-          <w:szCs w:val="24"/>
-          <w:lang w:val="en-US"/>
-        </w:rPr>
-        <w:tab/>
-      </w:r>
-      <w:r>
-        <w:rPr>
-          <w:sz w:val="24"/>
-          <w:szCs w:val="24"/>
-          <w:lang w:val="en-US"/>
-        </w:rPr>
-        <w:t xml:space="preserve">Average </w:t>
-      </w:r>
-      <w:r>
-        <w:rPr>
-          <w:sz w:val="24"/>
-          <w:szCs w:val="24"/>
-          <w:lang w:val="en-US"/>
-        </w:rPr>
-        <w:t>Marks</w:t>
-      </w:r>
-      <w:r>
-        <w:rPr>
-          <w:sz w:val="24"/>
-          <w:szCs w:val="24"/>
-          <w:lang w:val="en-US"/>
-        </w:rPr>
-        <w:tab/>
-        <w:t>Grade</w:t>
-      </w:r>
-      <w:r>
-        <w:rPr>
-          <w:sz w:val="24"/>
-          <w:szCs w:val="24"/>
-          <w:lang w:val="en-US"/>
-        </w:rPr>
-        <w:br/>
-      </w:r>
-      <w:r>
-        <w:rPr>
-          <w:sz w:val="24"/>
-          <w:szCs w:val="24"/>
-          <w:lang w:val="en-US"/>
-        </w:rPr>
-        <w:tab/>
-        <w:t>&gt;= 85</w:t>
-      </w:r>
-      <w:r>
-        <w:rPr>
-          <w:sz w:val="24"/>
-          <w:szCs w:val="24"/>
-          <w:lang w:val="en-US"/>
-        </w:rPr>
-        <w:tab/>
-      </w:r>
-      <w:r>
-        <w:rPr>
-          <w:sz w:val="24"/>
-          <w:szCs w:val="24"/>
-          <w:lang w:val="en-US"/>
-        </w:rPr>
-        <w:tab/>
-      </w:r>
-      <w:r>
-        <w:rPr>
-          <w:sz w:val="24"/>
-          <w:szCs w:val="24"/>
-          <w:lang w:val="en-US"/>
-        </w:rPr>
-        <w:tab/>
-      </w:r>
-      <w:proofErr w:type="spellStart"/>
-      <w:r>
-        <w:rPr>
-          <w:sz w:val="24"/>
-          <w:szCs w:val="24"/>
-          <w:lang w:val="en-US"/>
-        </w:rPr>
-        <w:t>Dist</w:t>
+          <w:lang w:val="en-US"/>
+        </w:rPr>
+        <w:t>yData</w:t>
       </w:r>
       <w:proofErr w:type="spellEnd"/>
       <w:r>
         <w:rPr>
-          <w:sz w:val="24"/>
-          <w:szCs w:val="24"/>
-          <w:lang w:val="en-US"/>
-        </w:rPr>
-        <w:br/>
-      </w:r>
-      <w:r>
-        <w:rPr>
-          <w:sz w:val="24"/>
-          <w:szCs w:val="24"/>
-          <w:lang w:val="en-US"/>
-        </w:rPr>
-        <w:tab/>
-        <w:t>&lt; 85 &amp; &gt;= 75</w:t>
-      </w:r>
-      <w:r>
-        <w:rPr>
-          <w:sz w:val="24"/>
-          <w:szCs w:val="24"/>
-          <w:lang w:val="en-US"/>
-        </w:rPr>
-        <w:tab/>
-      </w:r>
-      <w:r>
-        <w:rPr>
-          <w:sz w:val="24"/>
-          <w:szCs w:val="24"/>
-          <w:lang w:val="en-US"/>
-        </w:rPr>
-        <w:tab/>
-        <w:t>A</w:t>
-      </w:r>
-      <w:r>
-        <w:rPr>
-          <w:sz w:val="24"/>
-          <w:szCs w:val="24"/>
-          <w:lang w:val="en-US"/>
-        </w:rPr>
-        <w:br/>
-      </w:r>
-      <w:r>
-        <w:rPr>
-          <w:sz w:val="24"/>
-          <w:szCs w:val="24"/>
-          <w:lang w:val="en-US"/>
-        </w:rPr>
-        <w:tab/>
-        <w:t>&lt; 75 &amp; &gt;= 60</w:t>
-      </w:r>
-      <w:r>
-        <w:rPr>
-          <w:sz w:val="24"/>
-          <w:szCs w:val="24"/>
-          <w:lang w:val="en-US"/>
-        </w:rPr>
-        <w:tab/>
-      </w:r>
-      <w:r>
-        <w:rPr>
-          <w:sz w:val="24"/>
-          <w:szCs w:val="24"/>
-          <w:lang w:val="en-US"/>
-        </w:rPr>
-        <w:tab/>
-        <w:t>B</w:t>
-      </w:r>
-      <w:r>
-        <w:rPr>
-          <w:sz w:val="24"/>
-          <w:szCs w:val="24"/>
-          <w:lang w:val="en-US"/>
-        </w:rPr>
-        <w:br/>
-      </w:r>
-      <w:r>
-        <w:rPr>
-          <w:sz w:val="24"/>
-          <w:szCs w:val="24"/>
-          <w:lang w:val="en-US"/>
-        </w:rPr>
-        <w:tab/>
-        <w:t>&lt; 60 &amp; &gt;= 50</w:t>
-      </w:r>
-      <w:r>
-        <w:rPr>
-          <w:sz w:val="24"/>
-          <w:szCs w:val="24"/>
-          <w:lang w:val="en-US"/>
-        </w:rPr>
-        <w:tab/>
-      </w:r>
-      <w:r>
-        <w:rPr>
-          <w:sz w:val="24"/>
-          <w:szCs w:val="24"/>
-          <w:lang w:val="en-US"/>
-        </w:rPr>
-        <w:tab/>
-        <w:t>C</w:t>
-      </w:r>
-      <w:r>
-        <w:rPr>
-          <w:sz w:val="24"/>
-          <w:szCs w:val="24"/>
-          <w:lang w:val="en-US"/>
-        </w:rPr>
-        <w:br/>
-      </w:r>
-      <w:r>
-        <w:rPr>
-          <w:sz w:val="24"/>
-          <w:szCs w:val="24"/>
-          <w:lang w:val="en-US"/>
-        </w:rPr>
-        <w:tab/>
-        <w:t>&lt; 50 &amp; &gt;= 35</w:t>
-      </w:r>
-      <w:r>
-        <w:rPr>
-          <w:sz w:val="24"/>
-          <w:szCs w:val="24"/>
-          <w:lang w:val="en-US"/>
-        </w:rPr>
-        <w:tab/>
-      </w:r>
-      <w:r>
-        <w:rPr>
-          <w:sz w:val="24"/>
-          <w:szCs w:val="24"/>
-          <w:lang w:val="en-US"/>
-        </w:rPr>
-        <w:tab/>
-        <w:t>D</w:t>
-      </w:r>
-      <w:r>
-        <w:rPr>
-          <w:sz w:val="24"/>
-          <w:szCs w:val="24"/>
-          <w:lang w:val="en-US"/>
-        </w:rPr>
-        <w:br/>
-      </w:r>
-      <w:r>
-        <w:rPr>
-          <w:sz w:val="24"/>
-          <w:szCs w:val="24"/>
-          <w:lang w:val="en-US"/>
-        </w:rPr>
-        <w:tab/>
-        <w:t>&lt; 35</w:t>
-      </w:r>
-      <w:r>
-        <w:rPr>
-          <w:sz w:val="24"/>
-          <w:szCs w:val="24"/>
-          <w:lang w:val="en-US"/>
-        </w:rPr>
-        <w:tab/>
-      </w:r>
-      <w:r>
-        <w:rPr>
-          <w:sz w:val="24"/>
-          <w:szCs w:val="24"/>
-          <w:lang w:val="en-US"/>
-        </w:rPr>
-        <w:tab/>
-      </w:r>
-      <w:r>
-        <w:rPr>
-          <w:sz w:val="24"/>
-          <w:szCs w:val="24"/>
-          <w:lang w:val="en-US"/>
-        </w:rPr>
-        <w:tab/>
-        <w:t>Fail</w:t>
-      </w:r>
-    </w:p>
-    <w:p>
-      <w:pPr>
-        <w:pStyle w:val="ListParagraph"/>
-        <w:numPr>
-          <w:ilvl w:val="0"/>
-          <w:numId w:val="1"/>
-        </w:numPr>
-        <w:rPr>
-          <w:lang w:val="en-US"/>
-        </w:rPr>
-      </w:pPr>
+          <w:lang w:val="en-US"/>
+        </w:rPr>
+        <w:t>()</w:t>
+      </w:r>
     </w:p>
     <w:sectPr>
       <w:pgSz w:w="11906" w:h="16838"/>
@@ -809,7 +951,7 @@
         <w:ind w:left="1440" w:hanging="360"/>
       </w:pPr>
     </w:lvl>
-    <w:lvl w:ilvl="2" w:tplc="4009001B" w:tentative="1">
+    <w:lvl w:ilvl="2" w:tplc="4009001B">
       <w:start w:val="1"/>
       <w:numFmt w:val="lowerRoman"/>
       <w:lvlText w:val="%3."/>

</xml_diff>

<commit_message>
Date: 24 Sept 2025
</commit_message>
<xml_diff>
--- a/Assignments.docx
+++ b/Assignments.docx
@@ -98,19 +98,11 @@
           <w:lang w:val="en-US"/>
         </w:rPr>
       </w:pPr>
-      <w:proofErr w:type="spellStart"/>
-      <w:r>
-        <w:rPr>
-          <w:lang w:val="en-US"/>
-        </w:rPr>
-        <w:t>hra</w:t>
-      </w:r>
-      <w:proofErr w:type="spellEnd"/>
-      <w:r>
-        <w:rPr>
-          <w:lang w:val="en-US"/>
-        </w:rPr>
-        <w:t xml:space="preserve"> = 20% of basic salary</w:t>
+      <w:r>
+        <w:rPr>
+          <w:lang w:val="en-US"/>
+        </w:rPr>
+        <w:t>hra = 20% of basic salary</w:t>
       </w:r>
     </w:p>
     <w:p>
@@ -124,19 +116,11 @@
           <w:lang w:val="en-US"/>
         </w:rPr>
       </w:pPr>
-      <w:proofErr w:type="spellStart"/>
-      <w:r>
-        <w:rPr>
-          <w:lang w:val="en-US"/>
-        </w:rPr>
-        <w:t>pf</w:t>
-      </w:r>
-      <w:proofErr w:type="spellEnd"/>
-      <w:r>
-        <w:rPr>
-          <w:lang w:val="en-US"/>
-        </w:rPr>
-        <w:t xml:space="preserve"> = 5% of basic salary</w:t>
+      <w:r>
+        <w:rPr>
+          <w:lang w:val="en-US"/>
+        </w:rPr>
+        <w:t>pf = 5% of basic salary</w:t>
       </w:r>
     </w:p>
     <w:p>
@@ -154,21 +138,7 @@
         <w:rPr>
           <w:lang w:val="en-US"/>
         </w:rPr>
-        <w:t xml:space="preserve">gross salary = basic salary + da + </w:t>
-      </w:r>
-      <w:proofErr w:type="spellStart"/>
-      <w:r>
-        <w:rPr>
-          <w:lang w:val="en-US"/>
-        </w:rPr>
-        <w:t>hra</w:t>
-      </w:r>
-      <w:proofErr w:type="spellEnd"/>
-      <w:r>
-        <w:rPr>
-          <w:lang w:val="en-US"/>
-        </w:rPr>
-        <w:t>;</w:t>
+        <w:t>gross salary = basic salary + da + hra;</w:t>
       </w:r>
     </w:p>
     <w:p>
@@ -186,16 +156,8 @@
         <w:rPr>
           <w:lang w:val="en-US"/>
         </w:rPr>
-        <w:t xml:space="preserve">net salary = gross salary – </w:t>
-      </w:r>
-      <w:proofErr w:type="spellStart"/>
-      <w:r>
-        <w:rPr>
-          <w:lang w:val="en-US"/>
-        </w:rPr>
-        <w:t>pf</w:t>
-      </w:r>
-      <w:proofErr w:type="spellEnd"/>
+        <w:t>net salary = gross salary – pf</w:t>
+      </w:r>
     </w:p>
     <w:p>
       <w:pPr>
@@ -216,36 +178,8 @@
           <w:szCs w:val="24"/>
           <w:lang w:val="en-US"/>
         </w:rPr>
-        <w:t>Accept a number from user and check whether it is +</w:t>
-      </w:r>
-      <w:proofErr w:type="spellStart"/>
-      <w:r>
-        <w:rPr>
-          <w:sz w:val="24"/>
-          <w:szCs w:val="24"/>
-          <w:lang w:val="en-US"/>
-        </w:rPr>
-        <w:t>ve</w:t>
-      </w:r>
-      <w:proofErr w:type="spellEnd"/>
-      <w:r>
-        <w:rPr>
-          <w:sz w:val="24"/>
-          <w:szCs w:val="24"/>
-          <w:lang w:val="en-US"/>
-        </w:rPr>
-        <w:t xml:space="preserve"> or –</w:t>
-      </w:r>
-      <w:proofErr w:type="spellStart"/>
-      <w:r>
-        <w:rPr>
-          <w:sz w:val="24"/>
-          <w:szCs w:val="24"/>
-          <w:lang w:val="en-US"/>
-        </w:rPr>
-        <w:t>ve</w:t>
-      </w:r>
-      <w:proofErr w:type="spellEnd"/>
+        <w:t>Accept a number from user and check whether it is +ve or –ve</w:t>
+      </w:r>
     </w:p>
     <w:p>
       <w:pPr>
@@ -332,25 +266,7 @@
           <w:szCs w:val="24"/>
           <w:lang w:val="en-US"/>
         </w:rPr>
-        <w:t xml:space="preserve">Accept age from user and show the message as "You are valid for voting" if age is </w:t>
-      </w:r>
-      <w:proofErr w:type="spellStart"/>
-      <w:r>
-        <w:rPr>
-          <w:sz w:val="24"/>
-          <w:szCs w:val="24"/>
-          <w:lang w:val="en-US"/>
-        </w:rPr>
-        <w:t>grater</w:t>
-      </w:r>
-      <w:proofErr w:type="spellEnd"/>
-      <w:r>
-        <w:rPr>
-          <w:sz w:val="24"/>
-          <w:szCs w:val="24"/>
-          <w:lang w:val="en-US"/>
-        </w:rPr>
-        <w:t xml:space="preserve"> than or equal to 18 otherwise display the message as "You are not valid for voting"</w:t>
+        <w:t>Accept age from user and show the message as "You are valid for voting" if age is grater than or equal to 18 otherwise display the message as "You are not valid for voting"</w:t>
       </w:r>
     </w:p>
     <w:p>
@@ -471,17 +387,8 @@
           <w:lang w:val="en-US"/>
         </w:rPr>
         <w:tab/>
-      </w:r>
-      <w:proofErr w:type="spellStart"/>
-      <w:r>
-        <w:rPr>
-          <w:sz w:val="24"/>
-          <w:szCs w:val="24"/>
-          <w:lang w:val="en-US"/>
-        </w:rPr>
         <w:t>Dist</w:t>
       </w:r>
-      <w:proofErr w:type="spellEnd"/>
       <w:r>
         <w:rPr>
           <w:sz w:val="24"/>
@@ -708,14 +615,12 @@
           <w:lang w:val="en-US"/>
         </w:rPr>
       </w:pPr>
-      <w:proofErr w:type="spellStart"/>
       <w:r>
         <w:rPr>
           <w:lang w:val="en-US"/>
         </w:rPr>
         <w:t>AccountNo</w:t>
       </w:r>
-      <w:proofErr w:type="spellEnd"/>
     </w:p>
     <w:p>
       <w:pPr>
@@ -728,14 +633,12 @@
           <w:lang w:val="en-US"/>
         </w:rPr>
       </w:pPr>
-      <w:proofErr w:type="spellStart"/>
       <w:r>
         <w:rPr>
           <w:lang w:val="en-US"/>
         </w:rPr>
         <w:t>AccountHolderName</w:t>
       </w:r>
-      <w:proofErr w:type="spellEnd"/>
     </w:p>
     <w:p>
       <w:pPr>
@@ -802,28 +705,75 @@
           <w:lang w:val="en-US"/>
         </w:rPr>
       </w:pPr>
-      <w:proofErr w:type="spellStart"/>
-      <w:r>
-        <w:rPr>
-          <w:lang w:val="en-US"/>
-        </w:rPr>
-        <w:t>Displa</w:t>
-      </w:r>
+      <w:r>
+        <w:rPr>
+          <w:lang w:val="en-US"/>
+        </w:rPr>
+        <w:t>DisplayData()</w:t>
+      </w:r>
+    </w:p>
+    <w:p>
+      <w:pPr>
+        <w:rPr>
+          <w:lang w:val="en-US"/>
+        </w:rPr>
+      </w:pPr>
+      <w:r>
+        <w:rPr>
+          <w:lang w:val="en-US"/>
+        </w:rPr>
+        <w:br w:type="page"/>
+      </w:r>
+    </w:p>
+    <w:p>
+      <w:pPr>
+        <w:rPr>
+          <w:b/>
+          <w:bCs/>
+          <w:lang w:val="en-US"/>
+        </w:rPr>
+      </w:pPr>
+      <w:r>
+        <w:rPr>
+          <w:b/>
+          <w:bCs/>
+          <w:lang w:val="en-US"/>
+        </w:rPr>
+        <w:lastRenderedPageBreak/>
+        <w:t>Selenium WebDriver Assignments</w:t>
+      </w:r>
+    </w:p>
+    <w:p>
+      <w:pPr>
+        <w:pStyle w:val="ListParagraph"/>
+        <w:numPr>
+          <w:ilvl w:val="0"/>
+          <w:numId w:val="3"/>
+        </w:numPr>
+        <w:rPr>
+          <w:lang w:val="en-US"/>
+        </w:rPr>
+      </w:pPr>
+      <w:r>
+        <w:rPr>
+          <w:lang w:val="en-US"/>
+        </w:rPr>
+        <w:t>Try getPageSource() on any web site. What is the return type and use of this method?</w:t>
+      </w:r>
+    </w:p>
+    <w:p>
+      <w:pPr>
+        <w:pStyle w:val="ListParagraph"/>
+        <w:numPr>
+          <w:ilvl w:val="0"/>
+          <w:numId w:val="3"/>
+        </w:numPr>
+        <w:rPr>
+          <w:lang w:val="en-US"/>
+        </w:rPr>
+      </w:pPr>
       <w:bookmarkStart w:id="0" w:name="_GoBack"/>
       <w:bookmarkEnd w:id="0"/>
-      <w:r>
-        <w:rPr>
-          <w:lang w:val="en-US"/>
-        </w:rPr>
-        <w:t>yData</w:t>
-      </w:r>
-      <w:proofErr w:type="spellEnd"/>
-      <w:r>
-        <w:rPr>
-          <w:lang w:val="en-US"/>
-        </w:rPr>
-        <w:t>()</w:t>
-      </w:r>
     </w:p>
     <w:sectPr>
       <w:pgSz w:w="11906" w:h="16838"/>
@@ -838,6 +788,95 @@
 <file path=word/numbering.xml><?xml version="1.0" encoding="utf-8"?>
 <w:numbering xmlns:wpc="http://schemas.microsoft.com/office/word/2010/wordprocessingCanvas" xmlns:mc="http://schemas.openxmlformats.org/markup-compatibility/2006" xmlns:o="urn:schemas-microsoft-com:office:office" xmlns:r="http://schemas.openxmlformats.org/officeDocument/2006/relationships" xmlns:m="http://schemas.openxmlformats.org/officeDocument/2006/math" xmlns:v="urn:schemas-microsoft-com:vml" xmlns:wp14="http://schemas.microsoft.com/office/word/2010/wordprocessingDrawing" xmlns:wp="http://schemas.openxmlformats.org/drawingml/2006/wordprocessingDrawing" xmlns:w10="urn:schemas-microsoft-com:office:word" xmlns:w="http://schemas.openxmlformats.org/wordprocessingml/2006/main" xmlns:w14="http://schemas.microsoft.com/office/word/2010/wordml" xmlns:w15="http://schemas.microsoft.com/office/word/2012/wordml" xmlns:wpg="http://schemas.microsoft.com/office/word/2010/wordprocessingGroup" xmlns:wpi="http://schemas.microsoft.com/office/word/2010/wordprocessingInk" xmlns:wne="http://schemas.microsoft.com/office/word/2006/wordml" xmlns:wps="http://schemas.microsoft.com/office/word/2010/wordprocessingShape" mc:Ignorable="w14 w15 wp14">
   <w:abstractNum w:abstractNumId="0">
+    <w:nsid w:val="14414662"/>
+    <w:multiLevelType w:val="hybridMultilevel"/>
+    <w:tmpl w:val="5AD2905C"/>
+    <w:lvl w:ilvl="0" w:tplc="4009000F">
+      <w:start w:val="1"/>
+      <w:numFmt w:val="decimal"/>
+      <w:lvlText w:val="%1."/>
+      <w:lvlJc w:val="left"/>
+      <w:pPr>
+        <w:ind w:left="720" w:hanging="360"/>
+      </w:pPr>
+      <w:rPr>
+        <w:rFonts w:hint="default"/>
+      </w:rPr>
+    </w:lvl>
+    <w:lvl w:ilvl="1" w:tplc="40090019" w:tentative="1">
+      <w:start w:val="1"/>
+      <w:numFmt w:val="lowerLetter"/>
+      <w:lvlText w:val="%2."/>
+      <w:lvlJc w:val="left"/>
+      <w:pPr>
+        <w:ind w:left="1440" w:hanging="360"/>
+      </w:pPr>
+    </w:lvl>
+    <w:lvl w:ilvl="2" w:tplc="4009001B" w:tentative="1">
+      <w:start w:val="1"/>
+      <w:numFmt w:val="lowerRoman"/>
+      <w:lvlText w:val="%3."/>
+      <w:lvlJc w:val="right"/>
+      <w:pPr>
+        <w:ind w:left="2160" w:hanging="180"/>
+      </w:pPr>
+    </w:lvl>
+    <w:lvl w:ilvl="3" w:tplc="4009000F" w:tentative="1">
+      <w:start w:val="1"/>
+      <w:numFmt w:val="decimal"/>
+      <w:lvlText w:val="%4."/>
+      <w:lvlJc w:val="left"/>
+      <w:pPr>
+        <w:ind w:left="2880" w:hanging="360"/>
+      </w:pPr>
+    </w:lvl>
+    <w:lvl w:ilvl="4" w:tplc="40090019" w:tentative="1">
+      <w:start w:val="1"/>
+      <w:numFmt w:val="lowerLetter"/>
+      <w:lvlText w:val="%5."/>
+      <w:lvlJc w:val="left"/>
+      <w:pPr>
+        <w:ind w:left="3600" w:hanging="360"/>
+      </w:pPr>
+    </w:lvl>
+    <w:lvl w:ilvl="5" w:tplc="4009001B" w:tentative="1">
+      <w:start w:val="1"/>
+      <w:numFmt w:val="lowerRoman"/>
+      <w:lvlText w:val="%6."/>
+      <w:lvlJc w:val="right"/>
+      <w:pPr>
+        <w:ind w:left="4320" w:hanging="180"/>
+      </w:pPr>
+    </w:lvl>
+    <w:lvl w:ilvl="6" w:tplc="4009000F" w:tentative="1">
+      <w:start w:val="1"/>
+      <w:numFmt w:val="decimal"/>
+      <w:lvlText w:val="%7."/>
+      <w:lvlJc w:val="left"/>
+      <w:pPr>
+        <w:ind w:left="5040" w:hanging="360"/>
+      </w:pPr>
+    </w:lvl>
+    <w:lvl w:ilvl="7" w:tplc="40090019" w:tentative="1">
+      <w:start w:val="1"/>
+      <w:numFmt w:val="lowerLetter"/>
+      <w:lvlText w:val="%8."/>
+      <w:lvlJc w:val="left"/>
+      <w:pPr>
+        <w:ind w:left="5760" w:hanging="360"/>
+      </w:pPr>
+    </w:lvl>
+    <w:lvl w:ilvl="8" w:tplc="4009001B" w:tentative="1">
+      <w:start w:val="1"/>
+      <w:numFmt w:val="lowerRoman"/>
+      <w:lvlText w:val="%9."/>
+      <w:lvlJc w:val="right"/>
+      <w:pPr>
+        <w:ind w:left="6480" w:hanging="180"/>
+      </w:pPr>
+    </w:lvl>
+  </w:abstractNum>
+  <w:abstractNum w:abstractNumId="1">
     <w:nsid w:val="394131C0"/>
     <w:multiLevelType w:val="hybridMultilevel"/>
     <w:tmpl w:val="46D85910"/>
@@ -926,7 +965,7 @@
       </w:pPr>
     </w:lvl>
   </w:abstractNum>
-  <w:abstractNum w:abstractNumId="1">
+  <w:abstractNum w:abstractNumId="2">
     <w:nsid w:val="68A312EE"/>
     <w:multiLevelType w:val="hybridMultilevel"/>
     <w:tmpl w:val="DF86D600"/>
@@ -1016,9 +1055,12 @@
     </w:lvl>
   </w:abstractNum>
   <w:num w:numId="1">
+    <w:abstractNumId w:val="2"/>
+  </w:num>
+  <w:num w:numId="2">
     <w:abstractNumId w:val="1"/>
   </w:num>
-  <w:num w:numId="2">
+  <w:num w:numId="3">
     <w:abstractNumId w:val="0"/>
   </w:num>
 </w:numbering>

</xml_diff>

<commit_message>
Date: 26 Sept 2025
</commit_message>
<xml_diff>
--- a/Assignments.docx
+++ b/Assignments.docx
@@ -769,11 +769,309 @@
           <w:numId w:val="3"/>
         </w:numPr>
         <w:rPr>
-          <w:lang w:val="en-US"/>
-        </w:rPr>
-      </w:pPr>
+          <w:sz w:val="26"/>
+          <w:szCs w:val="24"/>
+          <w:lang w:val="en-US"/>
+        </w:rPr>
+      </w:pPr>
+      <w:r>
+        <w:rPr>
+          <w:sz w:val="26"/>
+          <w:szCs w:val="24"/>
+          <w:lang w:val="en-US"/>
+        </w:rPr>
+        <w:t xml:space="preserve">Launch </w:t>
+      </w:r>
+      <w:hyperlink r:id="rId5" w:history="1">
+        <w:r>
+          <w:rPr>
+            <w:rStyle w:val="Hyperlink"/>
+            <w:sz w:val="26"/>
+            <w:szCs w:val="24"/>
+            <w:lang w:val="en-US"/>
+          </w:rPr>
+          <w:t>https://www.echotrak.com/Login.aspx?ReturnUrl=%2f</w:t>
+        </w:r>
+      </w:hyperlink>
+    </w:p>
+    <w:p>
+      <w:pPr>
+        <w:pStyle w:val="ListParagraph"/>
+        <w:numPr>
+          <w:ilvl w:val="1"/>
+          <w:numId w:val="3"/>
+        </w:numPr>
+        <w:rPr>
+          <w:sz w:val="26"/>
+          <w:szCs w:val="24"/>
+          <w:lang w:val="en-US"/>
+        </w:rPr>
+      </w:pPr>
+      <w:r>
+        <w:rPr>
+          <w:sz w:val="26"/>
+          <w:szCs w:val="24"/>
+          <w:lang w:val="en-US"/>
+        </w:rPr>
+        <w:t>Enter username as your name (</w:t>
+      </w:r>
+      <w:r>
+        <w:rPr>
+          <w:sz w:val="26"/>
+          <w:szCs w:val="24"/>
+          <w:lang w:val="en-US"/>
+        </w:rPr>
+        <w:t>amita</w:t>
+      </w:r>
+      <w:r>
+        <w:rPr>
+          <w:sz w:val="26"/>
+          <w:szCs w:val="24"/>
+          <w:lang w:val="en-US"/>
+        </w:rPr>
+        <w:t>)</w:t>
+      </w:r>
+    </w:p>
+    <w:p>
+      <w:pPr>
+        <w:pStyle w:val="ListParagraph"/>
+        <w:numPr>
+          <w:ilvl w:val="1"/>
+          <w:numId w:val="3"/>
+        </w:numPr>
+        <w:rPr>
+          <w:sz w:val="26"/>
+          <w:szCs w:val="24"/>
+          <w:lang w:val="en-US"/>
+        </w:rPr>
+      </w:pPr>
+      <w:r>
+        <w:rPr>
+          <w:sz w:val="26"/>
+          <w:szCs w:val="24"/>
+          <w:lang w:val="en-US"/>
+        </w:rPr>
+        <w:t>Enter password as yourname123 (</w:t>
+      </w:r>
+      <w:r>
+        <w:rPr>
+          <w:sz w:val="26"/>
+          <w:szCs w:val="24"/>
+          <w:lang w:val="en-US"/>
+        </w:rPr>
+        <w:t>amita</w:t>
+      </w:r>
+      <w:r>
+        <w:rPr>
+          <w:sz w:val="26"/>
+          <w:szCs w:val="24"/>
+          <w:lang w:val="en-US"/>
+        </w:rPr>
+        <w:t>123)</w:t>
+      </w:r>
+    </w:p>
+    <w:p>
+      <w:pPr>
+        <w:pStyle w:val="ListParagraph"/>
+        <w:numPr>
+          <w:ilvl w:val="1"/>
+          <w:numId w:val="3"/>
+        </w:numPr>
+        <w:rPr>
+          <w:sz w:val="26"/>
+          <w:szCs w:val="24"/>
+          <w:lang w:val="en-US"/>
+        </w:rPr>
+      </w:pPr>
+      <w:r>
+        <w:rPr>
+          <w:sz w:val="26"/>
+          <w:szCs w:val="24"/>
+          <w:lang w:val="en-US"/>
+        </w:rPr>
+        <w:t>Click on Login button</w:t>
+      </w:r>
+      <w:r>
+        <w:rPr>
+          <w:sz w:val="26"/>
+          <w:szCs w:val="24"/>
+          <w:lang w:val="en-US"/>
+        </w:rPr>
+        <w:br/>
+      </w:r>
+      <w:r>
+        <w:rPr>
+          <w:b/>
+          <w:bCs/>
+          <w:sz w:val="26"/>
+          <w:szCs w:val="24"/>
+          <w:lang w:val="en-US"/>
+        </w:rPr>
+        <w:t>Use Name locator</w:t>
+      </w:r>
+    </w:p>
+    <w:p>
+      <w:pPr>
+        <w:pStyle w:val="ListParagraph"/>
+        <w:numPr>
+          <w:ilvl w:val="0"/>
+          <w:numId w:val="3"/>
+        </w:numPr>
+        <w:rPr>
+          <w:sz w:val="26"/>
+          <w:szCs w:val="24"/>
+          <w:lang w:val="en-US"/>
+        </w:rPr>
+      </w:pPr>
+      <w:r>
+        <w:rPr>
+          <w:sz w:val="26"/>
+          <w:szCs w:val="24"/>
+          <w:lang w:val="en-US"/>
+        </w:rPr>
+        <w:t xml:space="preserve">Launch </w:t>
+      </w:r>
+      <w:hyperlink r:id="rId6" w:history="1">
+        <w:r>
+          <w:rPr>
+            <w:rStyle w:val="Hyperlink"/>
+            <w:sz w:val="26"/>
+            <w:szCs w:val="24"/>
+            <w:lang w:val="en-US"/>
+          </w:rPr>
+          <w:t>https://www.echotrak.com/Login.aspx?ReturnUrl=%2f</w:t>
+        </w:r>
+      </w:hyperlink>
+    </w:p>
+    <w:p>
+      <w:pPr>
+        <w:pStyle w:val="ListParagraph"/>
+        <w:numPr>
+          <w:ilvl w:val="1"/>
+          <w:numId w:val="3"/>
+        </w:numPr>
+        <w:rPr>
+          <w:sz w:val="26"/>
+          <w:szCs w:val="24"/>
+          <w:lang w:val="en-US"/>
+        </w:rPr>
+      </w:pPr>
+      <w:r>
+        <w:rPr>
+          <w:sz w:val="26"/>
+          <w:szCs w:val="24"/>
+          <w:lang w:val="en-US"/>
+        </w:rPr>
+        <w:t>Enter username as your name (</w:t>
+      </w:r>
+      <w:r>
+        <w:rPr>
+          <w:sz w:val="26"/>
+          <w:szCs w:val="24"/>
+          <w:lang w:val="en-US"/>
+        </w:rPr>
+        <w:t>trupti</w:t>
+      </w:r>
+      <w:r>
+        <w:rPr>
+          <w:sz w:val="26"/>
+          <w:szCs w:val="24"/>
+          <w:lang w:val="en-US"/>
+        </w:rPr>
+        <w:t>)</w:t>
+      </w:r>
+    </w:p>
+    <w:p>
+      <w:pPr>
+        <w:pStyle w:val="ListParagraph"/>
+        <w:numPr>
+          <w:ilvl w:val="1"/>
+          <w:numId w:val="3"/>
+        </w:numPr>
+        <w:rPr>
+          <w:sz w:val="26"/>
+          <w:szCs w:val="24"/>
+          <w:lang w:val="en-US"/>
+        </w:rPr>
+      </w:pPr>
+      <w:r>
+        <w:rPr>
+          <w:sz w:val="26"/>
+          <w:szCs w:val="24"/>
+          <w:lang w:val="en-US"/>
+        </w:rPr>
+        <w:t>Enter password as yourname123 (</w:t>
+      </w:r>
+      <w:r>
+        <w:rPr>
+          <w:sz w:val="26"/>
+          <w:szCs w:val="24"/>
+          <w:lang w:val="en-US"/>
+        </w:rPr>
+        <w:t>trupti</w:t>
+      </w:r>
       <w:bookmarkStart w:id="0" w:name="_GoBack"/>
       <w:bookmarkEnd w:id="0"/>
+      <w:r>
+        <w:rPr>
+          <w:sz w:val="26"/>
+          <w:szCs w:val="24"/>
+          <w:lang w:val="en-US"/>
+        </w:rPr>
+        <w:t>123)</w:t>
+      </w:r>
+    </w:p>
+    <w:p>
+      <w:pPr>
+        <w:pStyle w:val="ListParagraph"/>
+        <w:numPr>
+          <w:ilvl w:val="1"/>
+          <w:numId w:val="3"/>
+        </w:numPr>
+        <w:rPr>
+          <w:sz w:val="26"/>
+          <w:szCs w:val="24"/>
+          <w:lang w:val="en-US"/>
+        </w:rPr>
+      </w:pPr>
+      <w:r>
+        <w:rPr>
+          <w:sz w:val="26"/>
+          <w:szCs w:val="24"/>
+          <w:lang w:val="en-US"/>
+        </w:rPr>
+        <w:t>Click on Login button</w:t>
+      </w:r>
+      <w:r>
+        <w:rPr>
+          <w:sz w:val="26"/>
+          <w:szCs w:val="24"/>
+          <w:lang w:val="en-US"/>
+        </w:rPr>
+        <w:br/>
+      </w:r>
+      <w:r>
+        <w:rPr>
+          <w:b/>
+          <w:bCs/>
+          <w:sz w:val="26"/>
+          <w:szCs w:val="24"/>
+          <w:lang w:val="en-US"/>
+        </w:rPr>
+        <w:t>Use Id locator</w:t>
+      </w:r>
+    </w:p>
+    <w:p>
+      <w:pPr>
+        <w:pStyle w:val="ListParagraph"/>
+        <w:numPr>
+          <w:ilvl w:val="0"/>
+          <w:numId w:val="3"/>
+        </w:numPr>
+        <w:rPr>
+          <w:lang w:val="en-US"/>
+        </w:rPr>
+      </w:pPr>
     </w:p>
     <w:sectPr>
       <w:pgSz w:w="11906" w:h="16838"/>
@@ -803,7 +1101,7 @@
         <w:rFonts w:hint="default"/>
       </w:rPr>
     </w:lvl>
-    <w:lvl w:ilvl="1" w:tplc="40090019" w:tentative="1">
+    <w:lvl w:ilvl="1" w:tplc="40090019">
       <w:start w:val="1"/>
       <w:numFmt w:val="lowerLetter"/>
       <w:lvlText w:val="%2."/>
@@ -877,6 +1175,95 @@
     </w:lvl>
   </w:abstractNum>
   <w:abstractNum w:abstractNumId="1">
+    <w:nsid w:val="18DF629C"/>
+    <w:multiLevelType w:val="hybridMultilevel"/>
+    <w:tmpl w:val="88B279A2"/>
+    <w:lvl w:ilvl="0" w:tplc="4009000F">
+      <w:start w:val="1"/>
+      <w:numFmt w:val="decimal"/>
+      <w:lvlText w:val="%1."/>
+      <w:lvlJc w:val="left"/>
+      <w:pPr>
+        <w:ind w:left="720" w:hanging="360"/>
+      </w:pPr>
+      <w:rPr>
+        <w:rFonts w:hint="default"/>
+      </w:rPr>
+    </w:lvl>
+    <w:lvl w:ilvl="1" w:tplc="40090019">
+      <w:start w:val="1"/>
+      <w:numFmt w:val="lowerLetter"/>
+      <w:lvlText w:val="%2."/>
+      <w:lvlJc w:val="left"/>
+      <w:pPr>
+        <w:ind w:left="1440" w:hanging="360"/>
+      </w:pPr>
+    </w:lvl>
+    <w:lvl w:ilvl="2" w:tplc="4009001B" w:tentative="1">
+      <w:start w:val="1"/>
+      <w:numFmt w:val="lowerRoman"/>
+      <w:lvlText w:val="%3."/>
+      <w:lvlJc w:val="right"/>
+      <w:pPr>
+        <w:ind w:left="2160" w:hanging="180"/>
+      </w:pPr>
+    </w:lvl>
+    <w:lvl w:ilvl="3" w:tplc="4009000F" w:tentative="1">
+      <w:start w:val="1"/>
+      <w:numFmt w:val="decimal"/>
+      <w:lvlText w:val="%4."/>
+      <w:lvlJc w:val="left"/>
+      <w:pPr>
+        <w:ind w:left="2880" w:hanging="360"/>
+      </w:pPr>
+    </w:lvl>
+    <w:lvl w:ilvl="4" w:tplc="40090019" w:tentative="1">
+      <w:start w:val="1"/>
+      <w:numFmt w:val="lowerLetter"/>
+      <w:lvlText w:val="%5."/>
+      <w:lvlJc w:val="left"/>
+      <w:pPr>
+        <w:ind w:left="3600" w:hanging="360"/>
+      </w:pPr>
+    </w:lvl>
+    <w:lvl w:ilvl="5" w:tplc="4009001B" w:tentative="1">
+      <w:start w:val="1"/>
+      <w:numFmt w:val="lowerRoman"/>
+      <w:lvlText w:val="%6."/>
+      <w:lvlJc w:val="right"/>
+      <w:pPr>
+        <w:ind w:left="4320" w:hanging="180"/>
+      </w:pPr>
+    </w:lvl>
+    <w:lvl w:ilvl="6" w:tplc="4009000F" w:tentative="1">
+      <w:start w:val="1"/>
+      <w:numFmt w:val="decimal"/>
+      <w:lvlText w:val="%7."/>
+      <w:lvlJc w:val="left"/>
+      <w:pPr>
+        <w:ind w:left="5040" w:hanging="360"/>
+      </w:pPr>
+    </w:lvl>
+    <w:lvl w:ilvl="7" w:tplc="40090019" w:tentative="1">
+      <w:start w:val="1"/>
+      <w:numFmt w:val="lowerLetter"/>
+      <w:lvlText w:val="%8."/>
+      <w:lvlJc w:val="left"/>
+      <w:pPr>
+        <w:ind w:left="5760" w:hanging="360"/>
+      </w:pPr>
+    </w:lvl>
+    <w:lvl w:ilvl="8" w:tplc="4009001B" w:tentative="1">
+      <w:start w:val="1"/>
+      <w:numFmt w:val="lowerRoman"/>
+      <w:lvlText w:val="%9."/>
+      <w:lvlJc w:val="right"/>
+      <w:pPr>
+        <w:ind w:left="6480" w:hanging="180"/>
+      </w:pPr>
+    </w:lvl>
+  </w:abstractNum>
+  <w:abstractNum w:abstractNumId="2">
     <w:nsid w:val="394131C0"/>
     <w:multiLevelType w:val="hybridMultilevel"/>
     <w:tmpl w:val="46D85910"/>
@@ -965,7 +1352,7 @@
       </w:pPr>
     </w:lvl>
   </w:abstractNum>
-  <w:abstractNum w:abstractNumId="2">
+  <w:abstractNum w:abstractNumId="3">
     <w:nsid w:val="68A312EE"/>
     <w:multiLevelType w:val="hybridMultilevel"/>
     <w:tmpl w:val="DF86D600"/>
@@ -1055,13 +1442,16 @@
     </w:lvl>
   </w:abstractNum>
   <w:num w:numId="1">
-    <w:abstractNumId w:val="2"/>
+    <w:abstractNumId w:val="3"/>
   </w:num>
   <w:num w:numId="2">
-    <w:abstractNumId w:val="1"/>
+    <w:abstractNumId w:val="2"/>
   </w:num>
   <w:num w:numId="3">
     <w:abstractNumId w:val="0"/>
+  </w:num>
+  <w:num w:numId="4">
+    <w:abstractNumId w:val="1"/>
   </w:num>
 </w:numbering>
 </file>
@@ -1500,6 +1890,17 @@
       <w:contextualSpacing/>
     </w:pPr>
   </w:style>
+  <w:style w:type="character" w:styleId="Hyperlink">
+    <w:name w:val="Hyperlink"/>
+    <w:basedOn w:val="DefaultParagraphFont"/>
+    <w:uiPriority w:val="99"/>
+    <w:unhideWhenUsed/>
+    <w:rsid w:val="00A2677B"/>
+    <w:rPr>
+      <w:color w:val="0563C1" w:themeColor="hyperlink"/>
+      <w:u w:val="single"/>
+    </w:rPr>
+  </w:style>
 </w:styles>
 </file>
 

</xml_diff>

<commit_message>
Date: 27 Sept 2025
</commit_message>
<xml_diff>
--- a/Assignments.docx
+++ b/Assignments.docx
@@ -5,11 +5,15 @@
     <w:p>
       <w:pPr>
         <w:rPr>
-          <w:lang w:val="en-US"/>
-        </w:rPr>
-      </w:pPr>
-      <w:r>
-        <w:rPr>
+          <w:sz w:val="24"/>
+          <w:szCs w:val="24"/>
+          <w:lang w:val="en-US"/>
+        </w:rPr>
+      </w:pPr>
+      <w:r>
+        <w:rPr>
+          <w:sz w:val="24"/>
+          <w:szCs w:val="24"/>
           <w:lang w:val="en-US"/>
         </w:rPr>
         <w:t>Java Assignments</w:t>
@@ -23,11 +27,15 @@
           <w:numId w:val="1"/>
         </w:numPr>
         <w:rPr>
-          <w:lang w:val="en-US"/>
-        </w:rPr>
-      </w:pPr>
-      <w:r>
-        <w:rPr>
+          <w:sz w:val="24"/>
+          <w:szCs w:val="24"/>
+          <w:lang w:val="en-US"/>
+        </w:rPr>
+      </w:pPr>
+      <w:r>
+        <w:rPr>
+          <w:sz w:val="24"/>
+          <w:szCs w:val="24"/>
           <w:lang w:val="en-US"/>
         </w:rPr>
         <w:t>Accept length and breadth of rectangle and calculate area of rectangle.</w:t>
@@ -41,11 +49,15 @@
           <w:numId w:val="1"/>
         </w:numPr>
         <w:rPr>
-          <w:lang w:val="en-US"/>
-        </w:rPr>
-      </w:pPr>
-      <w:r>
-        <w:rPr>
+          <w:sz w:val="24"/>
+          <w:szCs w:val="24"/>
+          <w:lang w:val="en-US"/>
+        </w:rPr>
+      </w:pPr>
+      <w:r>
+        <w:rPr>
+          <w:sz w:val="24"/>
+          <w:szCs w:val="24"/>
           <w:lang w:val="en-US"/>
         </w:rPr>
         <w:t>Accept base and height of triangle and calculate area of triangle</w:t>
@@ -59,11 +71,15 @@
           <w:numId w:val="1"/>
         </w:numPr>
         <w:rPr>
-          <w:lang w:val="en-US"/>
-        </w:rPr>
-      </w:pPr>
-      <w:r>
-        <w:rPr>
+          <w:sz w:val="24"/>
+          <w:szCs w:val="24"/>
+          <w:lang w:val="en-US"/>
+        </w:rPr>
+      </w:pPr>
+      <w:r>
+        <w:rPr>
+          <w:sz w:val="24"/>
+          <w:szCs w:val="24"/>
           <w:lang w:val="en-US"/>
         </w:rPr>
         <w:t>Accept employee id, name and basic salary of employee and calculate following</w:t>
@@ -77,11 +93,15 @@
           <w:numId w:val="1"/>
         </w:numPr>
         <w:rPr>
-          <w:lang w:val="en-US"/>
-        </w:rPr>
-      </w:pPr>
-      <w:r>
-        <w:rPr>
+          <w:sz w:val="24"/>
+          <w:szCs w:val="24"/>
+          <w:lang w:val="en-US"/>
+        </w:rPr>
+      </w:pPr>
+      <w:r>
+        <w:rPr>
+          <w:sz w:val="24"/>
+          <w:szCs w:val="24"/>
           <w:lang w:val="en-US"/>
         </w:rPr>
         <w:t>da = 50% of basic salary</w:t>
@@ -95,11 +115,15 @@
           <w:numId w:val="1"/>
         </w:numPr>
         <w:rPr>
-          <w:lang w:val="en-US"/>
-        </w:rPr>
-      </w:pPr>
-      <w:r>
-        <w:rPr>
+          <w:sz w:val="24"/>
+          <w:szCs w:val="24"/>
+          <w:lang w:val="en-US"/>
+        </w:rPr>
+      </w:pPr>
+      <w:r>
+        <w:rPr>
+          <w:sz w:val="24"/>
+          <w:szCs w:val="24"/>
           <w:lang w:val="en-US"/>
         </w:rPr>
         <w:t>hra = 20% of basic salary</w:t>
@@ -113,11 +137,15 @@
           <w:numId w:val="1"/>
         </w:numPr>
         <w:rPr>
-          <w:lang w:val="en-US"/>
-        </w:rPr>
-      </w:pPr>
-      <w:r>
-        <w:rPr>
+          <w:sz w:val="24"/>
+          <w:szCs w:val="24"/>
+          <w:lang w:val="en-US"/>
+        </w:rPr>
+      </w:pPr>
+      <w:r>
+        <w:rPr>
+          <w:sz w:val="24"/>
+          <w:szCs w:val="24"/>
           <w:lang w:val="en-US"/>
         </w:rPr>
         <w:t>pf = 5% of basic salary</w:t>
@@ -131,11 +159,15 @@
           <w:numId w:val="1"/>
         </w:numPr>
         <w:rPr>
-          <w:lang w:val="en-US"/>
-        </w:rPr>
-      </w:pPr>
-      <w:r>
-        <w:rPr>
+          <w:sz w:val="24"/>
+          <w:szCs w:val="24"/>
+          <w:lang w:val="en-US"/>
+        </w:rPr>
+      </w:pPr>
+      <w:r>
+        <w:rPr>
+          <w:sz w:val="24"/>
+          <w:szCs w:val="24"/>
           <w:lang w:val="en-US"/>
         </w:rPr>
         <w:t>gross salary = basic salary + da + hra;</w:t>
@@ -149,11 +181,15 @@
           <w:numId w:val="1"/>
         </w:numPr>
         <w:rPr>
-          <w:lang w:val="en-US"/>
-        </w:rPr>
-      </w:pPr>
-      <w:r>
-        <w:rPr>
+          <w:sz w:val="24"/>
+          <w:szCs w:val="24"/>
+          <w:lang w:val="en-US"/>
+        </w:rPr>
+      </w:pPr>
+      <w:r>
+        <w:rPr>
+          <w:sz w:val="24"/>
+          <w:szCs w:val="24"/>
           <w:lang w:val="en-US"/>
         </w:rPr>
         <w:t>net salary = gross salary – pf</w:t>
@@ -288,23 +324,7 @@
           <w:szCs w:val="24"/>
           <w:lang w:val="en-US"/>
         </w:rPr>
-        <w:t>Ac</w:t>
-      </w:r>
-      <w:r>
-        <w:rPr>
-          <w:sz w:val="24"/>
-          <w:szCs w:val="24"/>
-          <w:lang w:val="en-US"/>
-        </w:rPr>
-        <w:t>cept marks of 5 subjects and cal</w:t>
-      </w:r>
-      <w:r>
-        <w:rPr>
-          <w:sz w:val="24"/>
-          <w:szCs w:val="24"/>
-          <w:lang w:val="en-US"/>
-        </w:rPr>
-        <w:t>culate total and average marks also display the grade as follows</w:t>
+        <w:t>Accept marks of 5 subjects and calculate total and average marks also display the grade as follows</w:t>
       </w:r>
       <w:r>
         <w:rPr>
@@ -576,11 +596,15 @@
           <w:numId w:val="1"/>
         </w:numPr>
         <w:rPr>
-          <w:lang w:val="en-US"/>
-        </w:rPr>
-      </w:pPr>
-      <w:r>
-        <w:rPr>
+          <w:sz w:val="24"/>
+          <w:szCs w:val="24"/>
+          <w:lang w:val="en-US"/>
+        </w:rPr>
+      </w:pPr>
+      <w:r>
+        <w:rPr>
+          <w:sz w:val="24"/>
+          <w:szCs w:val="24"/>
           <w:lang w:val="en-US"/>
         </w:rPr>
         <w:t xml:space="preserve">Create a Class with name Bank having following </w:t>
@@ -594,11 +618,15 @@
           <w:numId w:val="1"/>
         </w:numPr>
         <w:rPr>
-          <w:lang w:val="en-US"/>
-        </w:rPr>
-      </w:pPr>
-      <w:r>
-        <w:rPr>
+          <w:sz w:val="24"/>
+          <w:szCs w:val="24"/>
+          <w:lang w:val="en-US"/>
+        </w:rPr>
+      </w:pPr>
+      <w:r>
+        <w:rPr>
+          <w:sz w:val="24"/>
+          <w:szCs w:val="24"/>
           <w:lang w:val="en-US"/>
         </w:rPr>
         <w:t>Data Members</w:t>
@@ -612,11 +640,15 @@
           <w:numId w:val="1"/>
         </w:numPr>
         <w:rPr>
-          <w:lang w:val="en-US"/>
-        </w:rPr>
-      </w:pPr>
-      <w:r>
-        <w:rPr>
+          <w:sz w:val="24"/>
+          <w:szCs w:val="24"/>
+          <w:lang w:val="en-US"/>
+        </w:rPr>
+      </w:pPr>
+      <w:r>
+        <w:rPr>
+          <w:sz w:val="24"/>
+          <w:szCs w:val="24"/>
           <w:lang w:val="en-US"/>
         </w:rPr>
         <w:t>AccountNo</w:t>
@@ -630,11 +662,15 @@
           <w:numId w:val="1"/>
         </w:numPr>
         <w:rPr>
-          <w:lang w:val="en-US"/>
-        </w:rPr>
-      </w:pPr>
-      <w:r>
-        <w:rPr>
+          <w:sz w:val="24"/>
+          <w:szCs w:val="24"/>
+          <w:lang w:val="en-US"/>
+        </w:rPr>
+      </w:pPr>
+      <w:r>
+        <w:rPr>
+          <w:sz w:val="24"/>
+          <w:szCs w:val="24"/>
           <w:lang w:val="en-US"/>
         </w:rPr>
         <w:t>AccountHolderName</w:t>
@@ -648,11 +684,15 @@
           <w:numId w:val="1"/>
         </w:numPr>
         <w:rPr>
-          <w:lang w:val="en-US"/>
-        </w:rPr>
-      </w:pPr>
-      <w:r>
-        <w:rPr>
+          <w:sz w:val="24"/>
+          <w:szCs w:val="24"/>
+          <w:lang w:val="en-US"/>
+        </w:rPr>
+      </w:pPr>
+      <w:r>
+        <w:rPr>
+          <w:sz w:val="24"/>
+          <w:szCs w:val="24"/>
           <w:lang w:val="en-US"/>
         </w:rPr>
         <w:t>Balance</w:t>
@@ -666,11 +706,15 @@
           <w:numId w:val="1"/>
         </w:numPr>
         <w:rPr>
-          <w:lang w:val="en-US"/>
-        </w:rPr>
-      </w:pPr>
-      <w:r>
-        <w:rPr>
+          <w:sz w:val="24"/>
+          <w:szCs w:val="24"/>
+          <w:lang w:val="en-US"/>
+        </w:rPr>
+      </w:pPr>
+      <w:r>
+        <w:rPr>
+          <w:sz w:val="24"/>
+          <w:szCs w:val="24"/>
           <w:lang w:val="en-US"/>
         </w:rPr>
         <w:t>Gender</w:t>
@@ -684,11 +728,15 @@
           <w:numId w:val="1"/>
         </w:numPr>
         <w:rPr>
-          <w:lang w:val="en-US"/>
-        </w:rPr>
-      </w:pPr>
-      <w:r>
-        <w:rPr>
+          <w:sz w:val="24"/>
+          <w:szCs w:val="24"/>
+          <w:lang w:val="en-US"/>
+        </w:rPr>
+      </w:pPr>
+      <w:r>
+        <w:rPr>
+          <w:sz w:val="24"/>
+          <w:szCs w:val="24"/>
           <w:lang w:val="en-US"/>
         </w:rPr>
         <w:t>Member function</w:t>
@@ -702,11 +750,15 @@
           <w:numId w:val="1"/>
         </w:numPr>
         <w:rPr>
-          <w:lang w:val="en-US"/>
-        </w:rPr>
-      </w:pPr>
-      <w:r>
-        <w:rPr>
+          <w:sz w:val="24"/>
+          <w:szCs w:val="24"/>
+          <w:lang w:val="en-US"/>
+        </w:rPr>
+      </w:pPr>
+      <w:r>
+        <w:rPr>
+          <w:sz w:val="24"/>
+          <w:szCs w:val="24"/>
           <w:lang w:val="en-US"/>
         </w:rPr>
         <w:t>DisplayData()</w:t>
@@ -715,11 +767,15 @@
     <w:p>
       <w:pPr>
         <w:rPr>
-          <w:lang w:val="en-US"/>
-        </w:rPr>
-      </w:pPr>
-      <w:r>
-        <w:rPr>
+          <w:sz w:val="24"/>
+          <w:szCs w:val="24"/>
+          <w:lang w:val="en-US"/>
+        </w:rPr>
+      </w:pPr>
+      <w:r>
+        <w:rPr>
+          <w:sz w:val="24"/>
+          <w:szCs w:val="24"/>
           <w:lang w:val="en-US"/>
         </w:rPr>
         <w:br w:type="page"/>
@@ -730,6 +786,8 @@
         <w:rPr>
           <w:b/>
           <w:bCs/>
+          <w:sz w:val="24"/>
+          <w:szCs w:val="24"/>
           <w:lang w:val="en-US"/>
         </w:rPr>
       </w:pPr>
@@ -737,6 +795,8 @@
         <w:rPr>
           <w:b/>
           <w:bCs/>
+          <w:sz w:val="24"/>
+          <w:szCs w:val="24"/>
           <w:lang w:val="en-US"/>
         </w:rPr>
         <w:lastRenderedPageBreak/>
@@ -751,11 +811,15 @@
           <w:numId w:val="3"/>
         </w:numPr>
         <w:rPr>
-          <w:lang w:val="en-US"/>
-        </w:rPr>
-      </w:pPr>
-      <w:r>
-        <w:rPr>
+          <w:sz w:val="24"/>
+          <w:szCs w:val="24"/>
+          <w:lang w:val="en-US"/>
+        </w:rPr>
+      </w:pPr>
+      <w:r>
+        <w:rPr>
+          <w:sz w:val="24"/>
+          <w:szCs w:val="24"/>
           <w:lang w:val="en-US"/>
         </w:rPr>
         <w:t>Try getPageSource() on any web site. What is the return type and use of this method?</w:t>
@@ -769,14 +833,14 @@
           <w:numId w:val="3"/>
         </w:numPr>
         <w:rPr>
-          <w:sz w:val="26"/>
-          <w:szCs w:val="24"/>
-          <w:lang w:val="en-US"/>
-        </w:rPr>
-      </w:pPr>
-      <w:r>
-        <w:rPr>
-          <w:sz w:val="26"/>
+          <w:sz w:val="24"/>
+          <w:szCs w:val="24"/>
+          <w:lang w:val="en-US"/>
+        </w:rPr>
+      </w:pPr>
+      <w:r>
+        <w:rPr>
+          <w:sz w:val="24"/>
           <w:szCs w:val="24"/>
           <w:lang w:val="en-US"/>
         </w:rPr>
@@ -786,7 +850,7 @@
         <w:r>
           <w:rPr>
             <w:rStyle w:val="Hyperlink"/>
-            <w:sz w:val="26"/>
+            <w:sz w:val="24"/>
             <w:szCs w:val="24"/>
             <w:lang w:val="en-US"/>
           </w:rPr>
@@ -802,34 +866,18 @@
           <w:numId w:val="3"/>
         </w:numPr>
         <w:rPr>
-          <w:sz w:val="26"/>
-          <w:szCs w:val="24"/>
-          <w:lang w:val="en-US"/>
-        </w:rPr>
-      </w:pPr>
-      <w:r>
-        <w:rPr>
-          <w:sz w:val="26"/>
-          <w:szCs w:val="24"/>
-          <w:lang w:val="en-US"/>
-        </w:rPr>
-        <w:t>Enter username as your name (</w:t>
-      </w:r>
-      <w:r>
-        <w:rPr>
-          <w:sz w:val="26"/>
-          <w:szCs w:val="24"/>
-          <w:lang w:val="en-US"/>
-        </w:rPr>
-        <w:t>amita</w:t>
-      </w:r>
-      <w:r>
-        <w:rPr>
-          <w:sz w:val="26"/>
-          <w:szCs w:val="24"/>
-          <w:lang w:val="en-US"/>
-        </w:rPr>
-        <w:t>)</w:t>
+          <w:sz w:val="24"/>
+          <w:szCs w:val="24"/>
+          <w:lang w:val="en-US"/>
+        </w:rPr>
+      </w:pPr>
+      <w:r>
+        <w:rPr>
+          <w:sz w:val="24"/>
+          <w:szCs w:val="24"/>
+          <w:lang w:val="en-US"/>
+        </w:rPr>
+        <w:t>Enter username as your name (amita)</w:t>
       </w:r>
     </w:p>
     <w:p>
@@ -840,34 +888,18 @@
           <w:numId w:val="3"/>
         </w:numPr>
         <w:rPr>
-          <w:sz w:val="26"/>
-          <w:szCs w:val="24"/>
-          <w:lang w:val="en-US"/>
-        </w:rPr>
-      </w:pPr>
-      <w:r>
-        <w:rPr>
-          <w:sz w:val="26"/>
-          <w:szCs w:val="24"/>
-          <w:lang w:val="en-US"/>
-        </w:rPr>
-        <w:t>Enter password as yourname123 (</w:t>
-      </w:r>
-      <w:r>
-        <w:rPr>
-          <w:sz w:val="26"/>
-          <w:szCs w:val="24"/>
-          <w:lang w:val="en-US"/>
-        </w:rPr>
-        <w:t>amita</w:t>
-      </w:r>
-      <w:r>
-        <w:rPr>
-          <w:sz w:val="26"/>
-          <w:szCs w:val="24"/>
-          <w:lang w:val="en-US"/>
-        </w:rPr>
-        <w:t>123)</w:t>
+          <w:sz w:val="24"/>
+          <w:szCs w:val="24"/>
+          <w:lang w:val="en-US"/>
+        </w:rPr>
+      </w:pPr>
+      <w:r>
+        <w:rPr>
+          <w:sz w:val="24"/>
+          <w:szCs w:val="24"/>
+          <w:lang w:val="en-US"/>
+        </w:rPr>
+        <w:t>Enter password as yourname123 (amita123)</w:t>
       </w:r>
     </w:p>
     <w:p>
@@ -878,14 +910,14 @@
           <w:numId w:val="3"/>
         </w:numPr>
         <w:rPr>
-          <w:sz w:val="26"/>
-          <w:szCs w:val="24"/>
-          <w:lang w:val="en-US"/>
-        </w:rPr>
-      </w:pPr>
-      <w:r>
-        <w:rPr>
-          <w:sz w:val="26"/>
+          <w:sz w:val="24"/>
+          <w:szCs w:val="24"/>
+          <w:lang w:val="en-US"/>
+        </w:rPr>
+      </w:pPr>
+      <w:r>
+        <w:rPr>
+          <w:sz w:val="24"/>
           <w:szCs w:val="24"/>
           <w:lang w:val="en-US"/>
         </w:rPr>
@@ -893,7 +925,7 @@
       </w:r>
       <w:r>
         <w:rPr>
-          <w:sz w:val="26"/>
+          <w:sz w:val="24"/>
           <w:szCs w:val="24"/>
           <w:lang w:val="en-US"/>
         </w:rPr>
@@ -903,7 +935,7 @@
         <w:rPr>
           <w:b/>
           <w:bCs/>
-          <w:sz w:val="26"/>
+          <w:sz w:val="24"/>
           <w:szCs w:val="24"/>
           <w:lang w:val="en-US"/>
         </w:rPr>
@@ -918,14 +950,14 @@
           <w:numId w:val="3"/>
         </w:numPr>
         <w:rPr>
-          <w:sz w:val="26"/>
-          <w:szCs w:val="24"/>
-          <w:lang w:val="en-US"/>
-        </w:rPr>
-      </w:pPr>
-      <w:r>
-        <w:rPr>
-          <w:sz w:val="26"/>
+          <w:sz w:val="24"/>
+          <w:szCs w:val="24"/>
+          <w:lang w:val="en-US"/>
+        </w:rPr>
+      </w:pPr>
+      <w:r>
+        <w:rPr>
+          <w:sz w:val="24"/>
           <w:szCs w:val="24"/>
           <w:lang w:val="en-US"/>
         </w:rPr>
@@ -935,7 +967,7 @@
         <w:r>
           <w:rPr>
             <w:rStyle w:val="Hyperlink"/>
-            <w:sz w:val="26"/>
+            <w:sz w:val="24"/>
             <w:szCs w:val="24"/>
             <w:lang w:val="en-US"/>
           </w:rPr>
@@ -951,14 +983,14 @@
           <w:numId w:val="3"/>
         </w:numPr>
         <w:rPr>
-          <w:sz w:val="26"/>
-          <w:szCs w:val="24"/>
-          <w:lang w:val="en-US"/>
-        </w:rPr>
-      </w:pPr>
-      <w:r>
-        <w:rPr>
-          <w:sz w:val="26"/>
+          <w:sz w:val="24"/>
+          <w:szCs w:val="24"/>
+          <w:lang w:val="en-US"/>
+        </w:rPr>
+      </w:pPr>
+      <w:r>
+        <w:rPr>
+          <w:sz w:val="24"/>
           <w:szCs w:val="24"/>
           <w:lang w:val="en-US"/>
         </w:rPr>
@@ -966,7 +998,7 @@
       </w:r>
       <w:r>
         <w:rPr>
-          <w:sz w:val="26"/>
+          <w:sz w:val="24"/>
           <w:szCs w:val="24"/>
           <w:lang w:val="en-US"/>
         </w:rPr>
@@ -974,7 +1006,7 @@
       </w:r>
       <w:r>
         <w:rPr>
-          <w:sz w:val="26"/>
+          <w:sz w:val="24"/>
           <w:szCs w:val="24"/>
           <w:lang w:val="en-US"/>
         </w:rPr>
@@ -989,14 +1021,14 @@
           <w:numId w:val="3"/>
         </w:numPr>
         <w:rPr>
-          <w:sz w:val="26"/>
-          <w:szCs w:val="24"/>
-          <w:lang w:val="en-US"/>
-        </w:rPr>
-      </w:pPr>
-      <w:r>
-        <w:rPr>
-          <w:sz w:val="26"/>
+          <w:sz w:val="24"/>
+          <w:szCs w:val="24"/>
+          <w:lang w:val="en-US"/>
+        </w:rPr>
+      </w:pPr>
+      <w:r>
+        <w:rPr>
+          <w:sz w:val="24"/>
           <w:szCs w:val="24"/>
           <w:lang w:val="en-US"/>
         </w:rPr>
@@ -1004,62 +1036,521 @@
       </w:r>
       <w:r>
         <w:rPr>
-          <w:sz w:val="26"/>
+          <w:sz w:val="24"/>
           <w:szCs w:val="24"/>
           <w:lang w:val="en-US"/>
         </w:rPr>
         <w:t>trupti</w:t>
+      </w:r>
+      <w:r>
+        <w:rPr>
+          <w:sz w:val="24"/>
+          <w:szCs w:val="24"/>
+          <w:lang w:val="en-US"/>
+        </w:rPr>
+        <w:t>123)</w:t>
+      </w:r>
+    </w:p>
+    <w:p>
+      <w:pPr>
+        <w:pStyle w:val="ListParagraph"/>
+        <w:numPr>
+          <w:ilvl w:val="1"/>
+          <w:numId w:val="3"/>
+        </w:numPr>
+        <w:rPr>
+          <w:sz w:val="24"/>
+          <w:szCs w:val="24"/>
+          <w:lang w:val="en-US"/>
+        </w:rPr>
+      </w:pPr>
+      <w:r>
+        <w:rPr>
+          <w:sz w:val="24"/>
+          <w:szCs w:val="24"/>
+          <w:lang w:val="en-US"/>
+        </w:rPr>
+        <w:t>Click on Login button</w:t>
+      </w:r>
+      <w:r>
+        <w:rPr>
+          <w:sz w:val="24"/>
+          <w:szCs w:val="24"/>
+          <w:lang w:val="en-US"/>
+        </w:rPr>
+        <w:br/>
+      </w:r>
+      <w:r>
+        <w:rPr>
+          <w:b/>
+          <w:bCs/>
+          <w:sz w:val="24"/>
+          <w:szCs w:val="24"/>
+          <w:lang w:val="en-US"/>
+        </w:rPr>
+        <w:t>Use Id locator</w:t>
+      </w:r>
+    </w:p>
+    <w:p>
+      <w:pPr>
+        <w:pStyle w:val="ListParagraph"/>
+        <w:numPr>
+          <w:ilvl w:val="0"/>
+          <w:numId w:val="3"/>
+        </w:numPr>
+        <w:rPr>
+          <w:sz w:val="24"/>
+          <w:szCs w:val="24"/>
+          <w:lang w:val="en-US"/>
+        </w:rPr>
+      </w:pPr>
+      <w:r>
+        <w:rPr>
+          <w:sz w:val="24"/>
+          <w:szCs w:val="24"/>
+          <w:lang w:val="en-US"/>
+        </w:rPr>
+        <w:t xml:space="preserve">Launch </w:t>
+      </w:r>
+      <w:hyperlink r:id="rId7" w:history="1">
+        <w:r>
+          <w:rPr>
+            <w:rStyle w:val="Hyperlink"/>
+            <w:sz w:val="24"/>
+            <w:szCs w:val="24"/>
+            <w:lang w:val="en-US"/>
+          </w:rPr>
+          <w:t>https://www.echotrak.com/Login.aspx?ReturnUrl=%2f</w:t>
+        </w:r>
+      </w:hyperlink>
+    </w:p>
+    <w:p>
+      <w:pPr>
+        <w:pStyle w:val="ListParagraph"/>
+        <w:numPr>
+          <w:ilvl w:val="1"/>
+          <w:numId w:val="3"/>
+        </w:numPr>
+        <w:rPr>
+          <w:sz w:val="24"/>
+          <w:szCs w:val="24"/>
+          <w:lang w:val="en-US"/>
+        </w:rPr>
+      </w:pPr>
+      <w:r>
+        <w:rPr>
+          <w:sz w:val="24"/>
+          <w:szCs w:val="24"/>
+          <w:lang w:val="en-US"/>
+        </w:rPr>
+        <w:t>Enter username as your name (trupti)</w:t>
+      </w:r>
+    </w:p>
+    <w:p>
+      <w:pPr>
+        <w:pStyle w:val="ListParagraph"/>
+        <w:numPr>
+          <w:ilvl w:val="1"/>
+          <w:numId w:val="3"/>
+        </w:numPr>
+        <w:rPr>
+          <w:sz w:val="24"/>
+          <w:szCs w:val="24"/>
+          <w:lang w:val="en-US"/>
+        </w:rPr>
+      </w:pPr>
+      <w:r>
+        <w:rPr>
+          <w:sz w:val="24"/>
+          <w:szCs w:val="24"/>
+          <w:lang w:val="en-US"/>
+        </w:rPr>
+        <w:t>Enter password as yourname123 (trupti123)</w:t>
+      </w:r>
+    </w:p>
+    <w:p>
+      <w:pPr>
+        <w:pStyle w:val="ListParagraph"/>
+        <w:numPr>
+          <w:ilvl w:val="1"/>
+          <w:numId w:val="3"/>
+        </w:numPr>
+        <w:rPr>
+          <w:sz w:val="24"/>
+          <w:szCs w:val="24"/>
+          <w:lang w:val="en-US"/>
+        </w:rPr>
+      </w:pPr>
+      <w:r>
+        <w:rPr>
+          <w:sz w:val="24"/>
+          <w:szCs w:val="24"/>
+          <w:lang w:val="en-US"/>
+        </w:rPr>
+        <w:t>Click on Login button</w:t>
+      </w:r>
+      <w:r>
+        <w:rPr>
+          <w:sz w:val="24"/>
+          <w:szCs w:val="24"/>
+          <w:lang w:val="en-US"/>
+        </w:rPr>
+        <w:br/>
+      </w:r>
+      <w:r>
+        <w:rPr>
+          <w:b/>
+          <w:bCs/>
+          <w:sz w:val="24"/>
+          <w:szCs w:val="24"/>
+          <w:lang w:val="en-US"/>
+        </w:rPr>
+        <w:t>Use ClassName</w:t>
+      </w:r>
+    </w:p>
+    <w:p>
+      <w:pPr>
+        <w:pStyle w:val="ListParagraph"/>
+        <w:numPr>
+          <w:ilvl w:val="0"/>
+          <w:numId w:val="3"/>
+        </w:numPr>
+        <w:rPr>
+          <w:sz w:val="24"/>
+          <w:szCs w:val="24"/>
+          <w:lang w:val="en-US"/>
+        </w:rPr>
+      </w:pPr>
+      <w:r>
+        <w:rPr>
+          <w:sz w:val="24"/>
+          <w:szCs w:val="24"/>
+          <w:lang w:val="en-US"/>
+        </w:rPr>
+        <w:t xml:space="preserve">Launch </w:t>
+      </w:r>
+      <w:hyperlink r:id="rId8" w:history="1">
+        <w:r>
+          <w:rPr>
+            <w:rStyle w:val="Hyperlink"/>
+            <w:sz w:val="24"/>
+            <w:szCs w:val="24"/>
+            <w:lang w:val="en-US"/>
+          </w:rPr>
+          <w:t>https://www.facebook.com</w:t>
+        </w:r>
+      </w:hyperlink>
+    </w:p>
+    <w:p>
+      <w:pPr>
+        <w:pStyle w:val="ListParagraph"/>
+        <w:numPr>
+          <w:ilvl w:val="1"/>
+          <w:numId w:val="3"/>
+        </w:numPr>
+        <w:rPr>
+          <w:sz w:val="24"/>
+          <w:szCs w:val="24"/>
+          <w:lang w:val="en-US"/>
+        </w:rPr>
+      </w:pPr>
+      <w:r>
+        <w:rPr>
+          <w:sz w:val="24"/>
+          <w:szCs w:val="24"/>
+          <w:lang w:val="en-US"/>
+        </w:rPr>
+        <w:t xml:space="preserve">Enter email id as </w:t>
+      </w:r>
+      <w:hyperlink r:id="rId9" w:history="1">
+        <w:r>
+          <w:rPr>
+            <w:rStyle w:val="Hyperlink"/>
+            <w:sz w:val="24"/>
+            <w:szCs w:val="24"/>
+            <w:lang w:val="en-US"/>
+          </w:rPr>
+          <w:t>test@gmail.com</w:t>
+        </w:r>
+      </w:hyperlink>
+    </w:p>
+    <w:p>
+      <w:pPr>
+        <w:pStyle w:val="ListParagraph"/>
+        <w:numPr>
+          <w:ilvl w:val="1"/>
+          <w:numId w:val="3"/>
+        </w:numPr>
+        <w:rPr>
+          <w:sz w:val="24"/>
+          <w:szCs w:val="24"/>
+          <w:lang w:val="en-US"/>
+        </w:rPr>
+      </w:pPr>
+      <w:r>
+        <w:rPr>
+          <w:sz w:val="24"/>
+          <w:szCs w:val="24"/>
+          <w:lang w:val="en-US"/>
+        </w:rPr>
+        <w:t>Enter password as Test@123</w:t>
+      </w:r>
+    </w:p>
+    <w:p>
+      <w:pPr>
+        <w:pStyle w:val="ListParagraph"/>
+        <w:numPr>
+          <w:ilvl w:val="1"/>
+          <w:numId w:val="3"/>
+        </w:numPr>
+        <w:rPr>
+          <w:sz w:val="24"/>
+          <w:szCs w:val="24"/>
+          <w:lang w:val="en-US"/>
+        </w:rPr>
+      </w:pPr>
+      <w:r>
+        <w:rPr>
+          <w:sz w:val="24"/>
+          <w:szCs w:val="24"/>
+          <w:lang w:val="en-US"/>
+        </w:rPr>
+        <w:t>Click on Login Button</w:t>
+      </w:r>
+      <w:r>
+        <w:rPr>
+          <w:sz w:val="24"/>
+          <w:szCs w:val="24"/>
+          <w:lang w:val="en-US"/>
+        </w:rPr>
+        <w:br/>
+      </w:r>
+      <w:r>
+        <w:rPr>
+          <w:b/>
+          <w:bCs/>
+          <w:sz w:val="24"/>
+          <w:szCs w:val="24"/>
+          <w:lang w:val="en-US"/>
+        </w:rPr>
+        <w:t>Use Class name</w:t>
+      </w:r>
+    </w:p>
+    <w:p>
+      <w:pPr>
+        <w:pStyle w:val="ListParagraph"/>
+        <w:numPr>
+          <w:ilvl w:val="0"/>
+          <w:numId w:val="3"/>
+        </w:numPr>
+        <w:rPr>
+          <w:sz w:val="24"/>
+          <w:szCs w:val="24"/>
+          <w:lang w:val="en-US"/>
+        </w:rPr>
+      </w:pPr>
+      <w:r>
+        <w:rPr>
+          <w:sz w:val="24"/>
+          <w:szCs w:val="24"/>
+          <w:lang w:val="en-US"/>
+        </w:rPr>
+        <w:t xml:space="preserve">Launch </w:t>
+      </w:r>
+      <w:hyperlink r:id="rId10" w:history="1">
+        <w:r>
+          <w:rPr>
+            <w:rStyle w:val="Hyperlink"/>
+            <w:sz w:val="24"/>
+            <w:szCs w:val="24"/>
+            <w:lang w:val="en-US"/>
+          </w:rPr>
+          <w:t>https://www.google.com/</w:t>
+        </w:r>
+      </w:hyperlink>
+    </w:p>
+    <w:p>
+      <w:pPr>
+        <w:pStyle w:val="ListParagraph"/>
+        <w:numPr>
+          <w:ilvl w:val="1"/>
+          <w:numId w:val="3"/>
+        </w:numPr>
+        <w:rPr>
+          <w:sz w:val="24"/>
+          <w:szCs w:val="24"/>
+          <w:lang w:val="en-US"/>
+        </w:rPr>
+      </w:pPr>
+      <w:r>
+        <w:rPr>
+          <w:sz w:val="24"/>
+          <w:szCs w:val="24"/>
+          <w:lang w:val="en-US"/>
+        </w:rPr>
+        <w:t>Enter Pattankodoli Yatra in search box</w:t>
+      </w:r>
+    </w:p>
+    <w:p>
+      <w:pPr>
+        <w:pStyle w:val="ListParagraph"/>
+        <w:numPr>
+          <w:ilvl w:val="1"/>
+          <w:numId w:val="3"/>
+        </w:numPr>
+        <w:rPr>
+          <w:sz w:val="24"/>
+          <w:szCs w:val="24"/>
+          <w:lang w:val="en-US"/>
+        </w:rPr>
+      </w:pPr>
+      <w:r>
+        <w:rPr>
+          <w:sz w:val="24"/>
+          <w:szCs w:val="24"/>
+          <w:lang w:val="en-US"/>
+        </w:rPr>
+        <w:t>Hit Enter</w:t>
+      </w:r>
+    </w:p>
+    <w:p>
+      <w:pPr>
+        <w:pStyle w:val="ListParagraph"/>
+        <w:numPr>
+          <w:ilvl w:val="0"/>
+          <w:numId w:val="3"/>
+        </w:numPr>
+        <w:rPr>
+          <w:sz w:val="24"/>
+          <w:szCs w:val="24"/>
+          <w:lang w:val="en-US"/>
+        </w:rPr>
+      </w:pPr>
+      <w:r>
+        <w:rPr>
+          <w:sz w:val="24"/>
+          <w:szCs w:val="24"/>
+          <w:lang w:val="en-US"/>
+        </w:rPr>
+        <w:t xml:space="preserve">Launch </w:t>
+      </w:r>
+      <w:hyperlink r:id="rId11" w:history="1">
+        <w:r>
+          <w:rPr>
+            <w:rStyle w:val="Hyperlink"/>
+            <w:sz w:val="24"/>
+            <w:szCs w:val="24"/>
+            <w:lang w:val="en-US"/>
+          </w:rPr>
+          <w:t>https://www.echotrak.com/Login.aspx?ReturnUrl=%2f</w:t>
+        </w:r>
+      </w:hyperlink>
+    </w:p>
+    <w:p>
+      <w:pPr>
+        <w:pStyle w:val="ListParagraph"/>
+        <w:numPr>
+          <w:ilvl w:val="1"/>
+          <w:numId w:val="3"/>
+        </w:numPr>
+        <w:rPr>
+          <w:sz w:val="24"/>
+          <w:szCs w:val="24"/>
+          <w:lang w:val="en-US"/>
+        </w:rPr>
+      </w:pPr>
+      <w:r>
+        <w:rPr>
+          <w:sz w:val="24"/>
+          <w:szCs w:val="24"/>
+          <w:lang w:val="en-US"/>
+        </w:rPr>
+        <w:t>Enter username as your name (trupti)</w:t>
+      </w:r>
+    </w:p>
+    <w:p>
+      <w:pPr>
+        <w:pStyle w:val="ListParagraph"/>
+        <w:numPr>
+          <w:ilvl w:val="1"/>
+          <w:numId w:val="3"/>
+        </w:numPr>
+        <w:rPr>
+          <w:sz w:val="24"/>
+          <w:szCs w:val="24"/>
+          <w:lang w:val="en-US"/>
+        </w:rPr>
+      </w:pPr>
+      <w:r>
+        <w:rPr>
+          <w:sz w:val="24"/>
+          <w:szCs w:val="24"/>
+          <w:lang w:val="en-US"/>
+        </w:rPr>
+        <w:t>Enter password as yourname123 (trupti123)</w:t>
+      </w:r>
+    </w:p>
+    <w:p>
+      <w:pPr>
+        <w:pStyle w:val="ListParagraph"/>
+        <w:numPr>
+          <w:ilvl w:val="1"/>
+          <w:numId w:val="3"/>
+        </w:numPr>
+        <w:rPr>
+          <w:sz w:val="24"/>
+          <w:szCs w:val="24"/>
+          <w:lang w:val="en-US"/>
+        </w:rPr>
+      </w:pPr>
+      <w:r>
+        <w:rPr>
+          <w:sz w:val="24"/>
+          <w:szCs w:val="24"/>
+          <w:lang w:val="en-US"/>
+        </w:rPr>
+        <w:t>Click on Login button</w:t>
+      </w:r>
+      <w:r>
+        <w:rPr>
+          <w:sz w:val="24"/>
+          <w:szCs w:val="24"/>
+          <w:lang w:val="en-US"/>
+        </w:rPr>
+        <w:br/>
+      </w:r>
+      <w:r>
+        <w:rPr>
+          <w:b/>
+          <w:bCs/>
+          <w:sz w:val="24"/>
+          <w:szCs w:val="24"/>
+          <w:lang w:val="en-US"/>
+        </w:rPr>
+        <w:t>Use C</w:t>
+      </w:r>
+      <w:r>
+        <w:rPr>
+          <w:b/>
+          <w:bCs/>
+          <w:sz w:val="24"/>
+          <w:szCs w:val="24"/>
+          <w:lang w:val="en-US"/>
+        </w:rPr>
+        <w:t>ssSelector</w:t>
+      </w:r>
+      <w:r>
+        <w:rPr>
+          <w:b/>
+          <w:bCs/>
+          <w:sz w:val="24"/>
+          <w:szCs w:val="24"/>
+          <w:lang w:val="en-US"/>
+        </w:rPr>
+        <w:t xml:space="preserve"> </w:t>
       </w:r>
       <w:bookmarkStart w:id="0" w:name="_GoBack"/>
       <w:bookmarkEnd w:id="0"/>
-      <w:r>
-        <w:rPr>
-          <w:sz w:val="26"/>
-          <w:szCs w:val="24"/>
-          <w:lang w:val="en-US"/>
-        </w:rPr>
-        <w:t>123)</w:t>
-      </w:r>
-    </w:p>
-    <w:p>
-      <w:pPr>
-        <w:pStyle w:val="ListParagraph"/>
-        <w:numPr>
-          <w:ilvl w:val="1"/>
-          <w:numId w:val="3"/>
-        </w:numPr>
-        <w:rPr>
-          <w:sz w:val="26"/>
-          <w:szCs w:val="24"/>
-          <w:lang w:val="en-US"/>
-        </w:rPr>
-      </w:pPr>
-      <w:r>
-        <w:rPr>
-          <w:sz w:val="26"/>
-          <w:szCs w:val="24"/>
-          <w:lang w:val="en-US"/>
-        </w:rPr>
-        <w:t>Click on Login button</w:t>
-      </w:r>
-      <w:r>
-        <w:rPr>
-          <w:sz w:val="26"/>
-          <w:szCs w:val="24"/>
-          <w:lang w:val="en-US"/>
-        </w:rPr>
-        <w:br/>
-      </w:r>
-      <w:r>
-        <w:rPr>
-          <w:b/>
-          <w:bCs/>
-          <w:sz w:val="26"/>
-          <w:szCs w:val="24"/>
-          <w:lang w:val="en-US"/>
-        </w:rPr>
-        <w:t>Use Id locator</w:t>
-      </w:r>
     </w:p>
     <w:p>
       <w:pPr>
@@ -1069,6 +1560,8 @@
           <w:numId w:val="3"/>
         </w:numPr>
         <w:rPr>
+          <w:sz w:val="24"/>
+          <w:szCs w:val="24"/>
           <w:lang w:val="en-US"/>
         </w:rPr>
       </w:pPr>

</xml_diff>

<commit_message>
Date: 01 Oct 2025
</commit_message>
<xml_diff>
--- a/Assignments.docx
+++ b/Assignments.docx
@@ -120,13 +120,23 @@
           <w:lang w:val="en-US"/>
         </w:rPr>
       </w:pPr>
-      <w:r>
-        <w:rPr>
-          <w:sz w:val="24"/>
-          <w:szCs w:val="24"/>
-          <w:lang w:val="en-US"/>
-        </w:rPr>
-        <w:t>hra = 20% of basic salary</w:t>
+      <w:proofErr w:type="spellStart"/>
+      <w:r>
+        <w:rPr>
+          <w:sz w:val="24"/>
+          <w:szCs w:val="24"/>
+          <w:lang w:val="en-US"/>
+        </w:rPr>
+        <w:t>hra</w:t>
+      </w:r>
+      <w:proofErr w:type="spellEnd"/>
+      <w:r>
+        <w:rPr>
+          <w:sz w:val="24"/>
+          <w:szCs w:val="24"/>
+          <w:lang w:val="en-US"/>
+        </w:rPr>
+        <w:t xml:space="preserve"> = 20% of basic salary</w:t>
       </w:r>
     </w:p>
     <w:p>
@@ -142,13 +152,23 @@
           <w:lang w:val="en-US"/>
         </w:rPr>
       </w:pPr>
-      <w:r>
-        <w:rPr>
-          <w:sz w:val="24"/>
-          <w:szCs w:val="24"/>
-          <w:lang w:val="en-US"/>
-        </w:rPr>
-        <w:t>pf = 5% of basic salary</w:t>
+      <w:proofErr w:type="spellStart"/>
+      <w:r>
+        <w:rPr>
+          <w:sz w:val="24"/>
+          <w:szCs w:val="24"/>
+          <w:lang w:val="en-US"/>
+        </w:rPr>
+        <w:t>pf</w:t>
+      </w:r>
+      <w:proofErr w:type="spellEnd"/>
+      <w:r>
+        <w:rPr>
+          <w:sz w:val="24"/>
+          <w:szCs w:val="24"/>
+          <w:lang w:val="en-US"/>
+        </w:rPr>
+        <w:t xml:space="preserve"> = 5% of basic salary</w:t>
       </w:r>
     </w:p>
     <w:p>
@@ -170,7 +190,25 @@
           <w:szCs w:val="24"/>
           <w:lang w:val="en-US"/>
         </w:rPr>
-        <w:t>gross salary = basic salary + da + hra;</w:t>
+        <w:t xml:space="preserve">gross salary = basic salary + da + </w:t>
+      </w:r>
+      <w:proofErr w:type="spellStart"/>
+      <w:r>
+        <w:rPr>
+          <w:sz w:val="24"/>
+          <w:szCs w:val="24"/>
+          <w:lang w:val="en-US"/>
+        </w:rPr>
+        <w:t>hra</w:t>
+      </w:r>
+      <w:proofErr w:type="spellEnd"/>
+      <w:r>
+        <w:rPr>
+          <w:sz w:val="24"/>
+          <w:szCs w:val="24"/>
+          <w:lang w:val="en-US"/>
+        </w:rPr>
+        <w:t>;</w:t>
       </w:r>
     </w:p>
     <w:p>
@@ -192,8 +230,18 @@
           <w:szCs w:val="24"/>
           <w:lang w:val="en-US"/>
         </w:rPr>
-        <w:t>net salary = gross salary – pf</w:t>
-      </w:r>
+        <w:t xml:space="preserve">net salary = gross salary – </w:t>
+      </w:r>
+      <w:proofErr w:type="spellStart"/>
+      <w:r>
+        <w:rPr>
+          <w:sz w:val="24"/>
+          <w:szCs w:val="24"/>
+          <w:lang w:val="en-US"/>
+        </w:rPr>
+        <w:t>pf</w:t>
+      </w:r>
+      <w:proofErr w:type="spellEnd"/>
     </w:p>
     <w:p>
       <w:pPr>
@@ -214,8 +262,36 @@
           <w:szCs w:val="24"/>
           <w:lang w:val="en-US"/>
         </w:rPr>
-        <w:t>Accept a number from user and check whether it is +ve or –ve</w:t>
-      </w:r>
+        <w:t>Accept a number from user and check whether it is +</w:t>
+      </w:r>
+      <w:proofErr w:type="spellStart"/>
+      <w:r>
+        <w:rPr>
+          <w:sz w:val="24"/>
+          <w:szCs w:val="24"/>
+          <w:lang w:val="en-US"/>
+        </w:rPr>
+        <w:t>ve</w:t>
+      </w:r>
+      <w:proofErr w:type="spellEnd"/>
+      <w:r>
+        <w:rPr>
+          <w:sz w:val="24"/>
+          <w:szCs w:val="24"/>
+          <w:lang w:val="en-US"/>
+        </w:rPr>
+        <w:t xml:space="preserve"> or –</w:t>
+      </w:r>
+      <w:proofErr w:type="spellStart"/>
+      <w:r>
+        <w:rPr>
+          <w:sz w:val="24"/>
+          <w:szCs w:val="24"/>
+          <w:lang w:val="en-US"/>
+        </w:rPr>
+        <w:t>ve</w:t>
+      </w:r>
+      <w:proofErr w:type="spellEnd"/>
     </w:p>
     <w:p>
       <w:pPr>
@@ -302,7 +378,25 @@
           <w:szCs w:val="24"/>
           <w:lang w:val="en-US"/>
         </w:rPr>
-        <w:t>Accept age from user and show the message as "You are valid for voting" if age is grater than or equal to 18 otherwise display the message as "You are not valid for voting"</w:t>
+        <w:t xml:space="preserve">Accept age from user and show the message as "You are valid for voting" if age is </w:t>
+      </w:r>
+      <w:proofErr w:type="spellStart"/>
+      <w:r>
+        <w:rPr>
+          <w:sz w:val="24"/>
+          <w:szCs w:val="24"/>
+          <w:lang w:val="en-US"/>
+        </w:rPr>
+        <w:t>grater</w:t>
+      </w:r>
+      <w:proofErr w:type="spellEnd"/>
+      <w:r>
+        <w:rPr>
+          <w:sz w:val="24"/>
+          <w:szCs w:val="24"/>
+          <w:lang w:val="en-US"/>
+        </w:rPr>
+        <w:t xml:space="preserve"> than or equal to 18 otherwise display the message as "You are not valid for voting"</w:t>
       </w:r>
     </w:p>
     <w:p>
@@ -407,8 +501,17 @@
           <w:lang w:val="en-US"/>
         </w:rPr>
         <w:tab/>
+      </w:r>
+      <w:proofErr w:type="spellStart"/>
+      <w:r>
+        <w:rPr>
+          <w:sz w:val="24"/>
+          <w:szCs w:val="24"/>
+          <w:lang w:val="en-US"/>
+        </w:rPr>
         <w:t>Dist</w:t>
       </w:r>
+      <w:proofErr w:type="spellEnd"/>
       <w:r>
         <w:rPr>
           <w:sz w:val="24"/>
@@ -645,6 +748,7 @@
           <w:lang w:val="en-US"/>
         </w:rPr>
       </w:pPr>
+      <w:proofErr w:type="spellStart"/>
       <w:r>
         <w:rPr>
           <w:sz w:val="24"/>
@@ -653,6 +757,7 @@
         </w:rPr>
         <w:t>AccountNo</w:t>
       </w:r>
+      <w:proofErr w:type="spellEnd"/>
     </w:p>
     <w:p>
       <w:pPr>
@@ -667,6 +772,7 @@
           <w:lang w:val="en-US"/>
         </w:rPr>
       </w:pPr>
+      <w:proofErr w:type="spellStart"/>
       <w:r>
         <w:rPr>
           <w:sz w:val="24"/>
@@ -675,6 +781,7 @@
         </w:rPr>
         <w:t>AccountHolderName</w:t>
       </w:r>
+      <w:proofErr w:type="spellEnd"/>
     </w:p>
     <w:p>
       <w:pPr>
@@ -755,13 +862,23 @@
           <w:lang w:val="en-US"/>
         </w:rPr>
       </w:pPr>
-      <w:r>
-        <w:rPr>
-          <w:sz w:val="24"/>
-          <w:szCs w:val="24"/>
-          <w:lang w:val="en-US"/>
-        </w:rPr>
-        <w:t>DisplayData()</w:t>
+      <w:proofErr w:type="spellStart"/>
+      <w:r>
+        <w:rPr>
+          <w:sz w:val="24"/>
+          <w:szCs w:val="24"/>
+          <w:lang w:val="en-US"/>
+        </w:rPr>
+        <w:t>DisplayData</w:t>
+      </w:r>
+      <w:proofErr w:type="spellEnd"/>
+      <w:r>
+        <w:rPr>
+          <w:sz w:val="24"/>
+          <w:szCs w:val="24"/>
+          <w:lang w:val="en-US"/>
+        </w:rPr>
+        <w:t>()</w:t>
       </w:r>
     </w:p>
     <w:p>
@@ -822,7 +939,25 @@
           <w:szCs w:val="24"/>
           <w:lang w:val="en-US"/>
         </w:rPr>
-        <w:t>Try getPageSource() on any web site. What is the return type and use of this method?</w:t>
+        <w:t xml:space="preserve">Try </w:t>
+      </w:r>
+      <w:proofErr w:type="gramStart"/>
+      <w:r>
+        <w:rPr>
+          <w:sz w:val="24"/>
+          <w:szCs w:val="24"/>
+          <w:lang w:val="en-US"/>
+        </w:rPr>
+        <w:t>getPageSource(</w:t>
+      </w:r>
+      <w:proofErr w:type="gramEnd"/>
+      <w:r>
+        <w:rPr>
+          <w:sz w:val="24"/>
+          <w:szCs w:val="24"/>
+          <w:lang w:val="en-US"/>
+        </w:rPr>
+        <w:t>) on any web site. What is the return type and use of this method?</w:t>
       </w:r>
     </w:p>
     <w:p>
@@ -877,7 +1012,25 @@
           <w:szCs w:val="24"/>
           <w:lang w:val="en-US"/>
         </w:rPr>
-        <w:t>Enter username as your name (amita)</w:t>
+        <w:t>Enter username as your name (</w:t>
+      </w:r>
+      <w:proofErr w:type="spellStart"/>
+      <w:r>
+        <w:rPr>
+          <w:sz w:val="24"/>
+          <w:szCs w:val="24"/>
+          <w:lang w:val="en-US"/>
+        </w:rPr>
+        <w:t>amita</w:t>
+      </w:r>
+      <w:proofErr w:type="spellEnd"/>
+      <w:r>
+        <w:rPr>
+          <w:sz w:val="24"/>
+          <w:szCs w:val="24"/>
+          <w:lang w:val="en-US"/>
+        </w:rPr>
+        <w:t>)</w:t>
       </w:r>
     </w:p>
     <w:p>
@@ -996,6 +1149,7 @@
         </w:rPr>
         <w:t>Enter username as your name (</w:t>
       </w:r>
+      <w:proofErr w:type="spellStart"/>
       <w:r>
         <w:rPr>
           <w:sz w:val="24"/>
@@ -1004,6 +1158,7 @@
         </w:rPr>
         <w:t>trupti</w:t>
       </w:r>
+      <w:proofErr w:type="spellEnd"/>
       <w:r>
         <w:rPr>
           <w:sz w:val="24"/>
@@ -1143,7 +1298,25 @@
           <w:szCs w:val="24"/>
           <w:lang w:val="en-US"/>
         </w:rPr>
-        <w:t>Enter username as your name (trupti)</w:t>
+        <w:t>Enter username as your name (</w:t>
+      </w:r>
+      <w:proofErr w:type="spellStart"/>
+      <w:r>
+        <w:rPr>
+          <w:sz w:val="24"/>
+          <w:szCs w:val="24"/>
+          <w:lang w:val="en-US"/>
+        </w:rPr>
+        <w:t>trupti</w:t>
+      </w:r>
+      <w:proofErr w:type="spellEnd"/>
+      <w:r>
+        <w:rPr>
+          <w:sz w:val="24"/>
+          <w:szCs w:val="24"/>
+          <w:lang w:val="en-US"/>
+        </w:rPr>
+        <w:t>)</w:t>
       </w:r>
     </w:p>
     <w:p>
@@ -1465,7 +1638,25 @@
           <w:szCs w:val="24"/>
           <w:lang w:val="en-US"/>
         </w:rPr>
-        <w:t>Enter username as your name (trupti)</w:t>
+        <w:t>Enter username as your name (</w:t>
+      </w:r>
+      <w:proofErr w:type="spellStart"/>
+      <w:r>
+        <w:rPr>
+          <w:sz w:val="24"/>
+          <w:szCs w:val="24"/>
+          <w:lang w:val="en-US"/>
+        </w:rPr>
+        <w:t>trupti</w:t>
+      </w:r>
+      <w:proofErr w:type="spellEnd"/>
+      <w:r>
+        <w:rPr>
+          <w:sz w:val="24"/>
+          <w:szCs w:val="24"/>
+          <w:lang w:val="en-US"/>
+        </w:rPr>
+        <w:t>)</w:t>
       </w:r>
     </w:p>
     <w:p>
@@ -1549,22 +1740,317 @@
         </w:rPr>
         <w:t xml:space="preserve"> </w:t>
       </w:r>
+    </w:p>
+    <w:p>
+      <w:pPr>
+        <w:pStyle w:val="ListParagraph"/>
+        <w:numPr>
+          <w:ilvl w:val="0"/>
+          <w:numId w:val="3"/>
+        </w:numPr>
+        <w:rPr>
+          <w:sz w:val="24"/>
+          <w:szCs w:val="24"/>
+          <w:lang w:val="en-US"/>
+        </w:rPr>
+      </w:pPr>
+      <w:r>
+        <w:rPr>
+          <w:sz w:val="24"/>
+          <w:szCs w:val="24"/>
+          <w:lang w:val="en-US"/>
+        </w:rPr>
+        <w:t xml:space="preserve">Launch </w:t>
+      </w:r>
+      <w:hyperlink r:id="rId12" w:history="1">
+        <w:r>
+          <w:rPr>
+            <w:rStyle w:val="Hyperlink"/>
+            <w:sz w:val="24"/>
+            <w:szCs w:val="24"/>
+            <w:lang w:val="en-US"/>
+          </w:rPr>
+          <w:t>https://www.echotrak.com/Login.aspx?ReturnUrl=%2f</w:t>
+        </w:r>
+      </w:hyperlink>
+    </w:p>
+    <w:p>
+      <w:pPr>
+        <w:pStyle w:val="ListParagraph"/>
+        <w:numPr>
+          <w:ilvl w:val="1"/>
+          <w:numId w:val="3"/>
+        </w:numPr>
+        <w:rPr>
+          <w:sz w:val="24"/>
+          <w:szCs w:val="24"/>
+          <w:lang w:val="en-US"/>
+        </w:rPr>
+      </w:pPr>
+      <w:r>
+        <w:rPr>
+          <w:sz w:val="24"/>
+          <w:szCs w:val="24"/>
+          <w:lang w:val="en-US"/>
+        </w:rPr>
+        <w:t>Enter username as your name (</w:t>
+      </w:r>
+      <w:proofErr w:type="spellStart"/>
+      <w:r>
+        <w:rPr>
+          <w:sz w:val="24"/>
+          <w:szCs w:val="24"/>
+          <w:lang w:val="en-US"/>
+        </w:rPr>
+        <w:t>trupti</w:t>
+      </w:r>
+      <w:proofErr w:type="spellEnd"/>
+      <w:r>
+        <w:rPr>
+          <w:sz w:val="24"/>
+          <w:szCs w:val="24"/>
+          <w:lang w:val="en-US"/>
+        </w:rPr>
+        <w:t>)</w:t>
+      </w:r>
+    </w:p>
+    <w:p>
+      <w:pPr>
+        <w:pStyle w:val="ListParagraph"/>
+        <w:numPr>
+          <w:ilvl w:val="1"/>
+          <w:numId w:val="3"/>
+        </w:numPr>
+        <w:rPr>
+          <w:sz w:val="24"/>
+          <w:szCs w:val="24"/>
+          <w:lang w:val="en-US"/>
+        </w:rPr>
+      </w:pPr>
+      <w:r>
+        <w:rPr>
+          <w:sz w:val="24"/>
+          <w:szCs w:val="24"/>
+          <w:lang w:val="en-US"/>
+        </w:rPr>
+        <w:t>Enter password as yourname123 (trupti123)</w:t>
+      </w:r>
+    </w:p>
+    <w:p>
+      <w:pPr>
+        <w:pStyle w:val="ListParagraph"/>
+        <w:numPr>
+          <w:ilvl w:val="1"/>
+          <w:numId w:val="3"/>
+        </w:numPr>
+        <w:rPr>
+          <w:sz w:val="24"/>
+          <w:szCs w:val="24"/>
+          <w:lang w:val="en-US"/>
+        </w:rPr>
+      </w:pPr>
+      <w:r>
+        <w:rPr>
+          <w:sz w:val="24"/>
+          <w:szCs w:val="24"/>
+          <w:lang w:val="en-US"/>
+        </w:rPr>
+        <w:t>Click on Login button</w:t>
+      </w:r>
+      <w:r>
+        <w:rPr>
+          <w:sz w:val="24"/>
+          <w:szCs w:val="24"/>
+          <w:lang w:val="en-US"/>
+        </w:rPr>
+        <w:br/>
+      </w:r>
+      <w:r>
+        <w:rPr>
+          <w:b/>
+          <w:bCs/>
+          <w:sz w:val="24"/>
+          <w:szCs w:val="24"/>
+          <w:lang w:val="en-US"/>
+        </w:rPr>
+        <w:t xml:space="preserve">Use </w:t>
+      </w:r>
+      <w:r>
+        <w:rPr>
+          <w:b/>
+          <w:bCs/>
+          <w:sz w:val="24"/>
+          <w:szCs w:val="24"/>
+          <w:lang w:val="en-US"/>
+        </w:rPr>
+        <w:t xml:space="preserve">Absolute XPath </w:t>
+      </w:r>
+    </w:p>
+    <w:p>
+      <w:pPr>
+        <w:pStyle w:val="ListParagraph"/>
+        <w:numPr>
+          <w:ilvl w:val="0"/>
+          <w:numId w:val="3"/>
+        </w:numPr>
+        <w:rPr>
+          <w:sz w:val="24"/>
+          <w:szCs w:val="24"/>
+          <w:lang w:val="en-US"/>
+        </w:rPr>
+      </w:pPr>
+      <w:r>
+        <w:rPr>
+          <w:sz w:val="24"/>
+          <w:szCs w:val="24"/>
+          <w:lang w:val="en-US"/>
+        </w:rPr>
+        <w:t xml:space="preserve">Launch </w:t>
+      </w:r>
+      <w:hyperlink r:id="rId13" w:history="1">
+        <w:r>
+          <w:rPr>
+            <w:rStyle w:val="Hyperlink"/>
+            <w:sz w:val="24"/>
+            <w:szCs w:val="24"/>
+            <w:lang w:val="en-US"/>
+          </w:rPr>
+          <w:t>https://www.facebook.com</w:t>
+        </w:r>
+      </w:hyperlink>
+    </w:p>
+    <w:p>
+      <w:pPr>
+        <w:pStyle w:val="ListParagraph"/>
+        <w:numPr>
+          <w:ilvl w:val="1"/>
+          <w:numId w:val="3"/>
+        </w:numPr>
+        <w:rPr>
+          <w:sz w:val="24"/>
+          <w:szCs w:val="24"/>
+          <w:lang w:val="en-US"/>
+        </w:rPr>
+      </w:pPr>
+      <w:r>
+        <w:rPr>
+          <w:sz w:val="24"/>
+          <w:szCs w:val="24"/>
+          <w:lang w:val="en-US"/>
+        </w:rPr>
+        <w:t xml:space="preserve">Enter email id as </w:t>
+      </w:r>
+      <w:hyperlink r:id="rId14" w:history="1">
+        <w:r>
+          <w:rPr>
+            <w:rStyle w:val="Hyperlink"/>
+            <w:sz w:val="24"/>
+            <w:szCs w:val="24"/>
+            <w:lang w:val="en-US"/>
+          </w:rPr>
+          <w:t>test@gmail.com</w:t>
+        </w:r>
+      </w:hyperlink>
+    </w:p>
+    <w:p>
+      <w:pPr>
+        <w:pStyle w:val="ListParagraph"/>
+        <w:numPr>
+          <w:ilvl w:val="1"/>
+          <w:numId w:val="3"/>
+        </w:numPr>
+        <w:rPr>
+          <w:sz w:val="24"/>
+          <w:szCs w:val="24"/>
+          <w:lang w:val="en-US"/>
+        </w:rPr>
+      </w:pPr>
+      <w:r>
+        <w:rPr>
+          <w:sz w:val="24"/>
+          <w:szCs w:val="24"/>
+          <w:lang w:val="en-US"/>
+        </w:rPr>
+        <w:t>Enter password as Test@123</w:t>
+      </w:r>
+    </w:p>
+    <w:p>
+      <w:pPr>
+        <w:pStyle w:val="ListParagraph"/>
+        <w:numPr>
+          <w:ilvl w:val="1"/>
+          <w:numId w:val="3"/>
+        </w:numPr>
+        <w:rPr>
+          <w:sz w:val="24"/>
+          <w:szCs w:val="24"/>
+          <w:lang w:val="en-US"/>
+        </w:rPr>
+      </w:pPr>
+      <w:r>
+        <w:rPr>
+          <w:sz w:val="24"/>
+          <w:szCs w:val="24"/>
+          <w:lang w:val="en-US"/>
+        </w:rPr>
+        <w:t>Click on Login Button</w:t>
+      </w:r>
+    </w:p>
+    <w:p>
+      <w:pPr>
+        <w:pStyle w:val="ListParagraph"/>
+        <w:numPr>
+          <w:ilvl w:val="1"/>
+          <w:numId w:val="3"/>
+        </w:numPr>
+        <w:rPr>
+          <w:sz w:val="24"/>
+          <w:szCs w:val="24"/>
+          <w:lang w:val="en-US"/>
+        </w:rPr>
+      </w:pPr>
+      <w:r>
+        <w:rPr>
+          <w:sz w:val="24"/>
+          <w:szCs w:val="24"/>
+          <w:lang w:val="en-US"/>
+        </w:rPr>
+        <w:t>Display the error message.</w:t>
+      </w:r>
+      <w:r>
+        <w:rPr>
+          <w:sz w:val="24"/>
+          <w:szCs w:val="24"/>
+          <w:lang w:val="en-US"/>
+        </w:rPr>
+        <w:br/>
+      </w:r>
+      <w:r>
+        <w:rPr>
+          <w:b/>
+          <w:bCs/>
+          <w:sz w:val="24"/>
+          <w:szCs w:val="24"/>
+          <w:lang w:val="en-US"/>
+        </w:rPr>
+        <w:t>Use Absolute XPath</w:t>
+      </w:r>
+    </w:p>
+    <w:p>
+      <w:pPr>
+        <w:pStyle w:val="ListParagraph"/>
+        <w:numPr>
+          <w:ilvl w:val="0"/>
+          <w:numId w:val="3"/>
+        </w:numPr>
+        <w:rPr>
+          <w:sz w:val="24"/>
+          <w:szCs w:val="24"/>
+          <w:lang w:val="en-US"/>
+        </w:rPr>
+      </w:pPr>
       <w:bookmarkStart w:id="0" w:name="_GoBack"/>
       <w:bookmarkEnd w:id="0"/>
-    </w:p>
-    <w:p>
-      <w:pPr>
-        <w:pStyle w:val="ListParagraph"/>
-        <w:numPr>
-          <w:ilvl w:val="0"/>
-          <w:numId w:val="3"/>
-        </w:numPr>
-        <w:rPr>
-          <w:sz w:val="24"/>
-          <w:szCs w:val="24"/>
-          <w:lang w:val="en-US"/>
-        </w:rPr>
-      </w:pPr>
     </w:p>
     <w:sectPr>
       <w:pgSz w:w="11906" w:h="16838"/>

</xml_diff>

<commit_message>
Date: 03 Oct 2025
</commit_message>
<xml_diff>
--- a/Assignments.docx
+++ b/Assignments.docx
@@ -120,23 +120,13 @@
           <w:lang w:val="en-US"/>
         </w:rPr>
       </w:pPr>
-      <w:proofErr w:type="spellStart"/>
-      <w:r>
-        <w:rPr>
-          <w:sz w:val="24"/>
-          <w:szCs w:val="24"/>
-          <w:lang w:val="en-US"/>
-        </w:rPr>
-        <w:t>hra</w:t>
-      </w:r>
-      <w:proofErr w:type="spellEnd"/>
-      <w:r>
-        <w:rPr>
-          <w:sz w:val="24"/>
-          <w:szCs w:val="24"/>
-          <w:lang w:val="en-US"/>
-        </w:rPr>
-        <w:t xml:space="preserve"> = 20% of basic salary</w:t>
+      <w:r>
+        <w:rPr>
+          <w:sz w:val="24"/>
+          <w:szCs w:val="24"/>
+          <w:lang w:val="en-US"/>
+        </w:rPr>
+        <w:t>hra = 20% of basic salary</w:t>
       </w:r>
     </w:p>
     <w:p>
@@ -152,23 +142,13 @@
           <w:lang w:val="en-US"/>
         </w:rPr>
       </w:pPr>
-      <w:proofErr w:type="spellStart"/>
-      <w:r>
-        <w:rPr>
-          <w:sz w:val="24"/>
-          <w:szCs w:val="24"/>
-          <w:lang w:val="en-US"/>
-        </w:rPr>
-        <w:t>pf</w:t>
-      </w:r>
-      <w:proofErr w:type="spellEnd"/>
-      <w:r>
-        <w:rPr>
-          <w:sz w:val="24"/>
-          <w:szCs w:val="24"/>
-          <w:lang w:val="en-US"/>
-        </w:rPr>
-        <w:t xml:space="preserve"> = 5% of basic salary</w:t>
+      <w:r>
+        <w:rPr>
+          <w:sz w:val="24"/>
+          <w:szCs w:val="24"/>
+          <w:lang w:val="en-US"/>
+        </w:rPr>
+        <w:t>pf = 5% of basic salary</w:t>
       </w:r>
     </w:p>
     <w:p>
@@ -190,25 +170,7 @@
           <w:szCs w:val="24"/>
           <w:lang w:val="en-US"/>
         </w:rPr>
-        <w:t xml:space="preserve">gross salary = basic salary + da + </w:t>
-      </w:r>
-      <w:proofErr w:type="spellStart"/>
-      <w:r>
-        <w:rPr>
-          <w:sz w:val="24"/>
-          <w:szCs w:val="24"/>
-          <w:lang w:val="en-US"/>
-        </w:rPr>
-        <w:t>hra</w:t>
-      </w:r>
-      <w:proofErr w:type="spellEnd"/>
-      <w:r>
-        <w:rPr>
-          <w:sz w:val="24"/>
-          <w:szCs w:val="24"/>
-          <w:lang w:val="en-US"/>
-        </w:rPr>
-        <w:t>;</w:t>
+        <w:t>gross salary = basic salary + da + hra;</w:t>
       </w:r>
     </w:p>
     <w:p>
@@ -230,18 +192,8 @@
           <w:szCs w:val="24"/>
           <w:lang w:val="en-US"/>
         </w:rPr>
-        <w:t xml:space="preserve">net salary = gross salary – </w:t>
-      </w:r>
-      <w:proofErr w:type="spellStart"/>
-      <w:r>
-        <w:rPr>
-          <w:sz w:val="24"/>
-          <w:szCs w:val="24"/>
-          <w:lang w:val="en-US"/>
-        </w:rPr>
-        <w:t>pf</w:t>
-      </w:r>
-      <w:proofErr w:type="spellEnd"/>
+        <w:t>net salary = gross salary – pf</w:t>
+      </w:r>
     </w:p>
     <w:p>
       <w:pPr>
@@ -262,36 +214,8 @@
           <w:szCs w:val="24"/>
           <w:lang w:val="en-US"/>
         </w:rPr>
-        <w:t>Accept a number from user and check whether it is +</w:t>
-      </w:r>
-      <w:proofErr w:type="spellStart"/>
-      <w:r>
-        <w:rPr>
-          <w:sz w:val="24"/>
-          <w:szCs w:val="24"/>
-          <w:lang w:val="en-US"/>
-        </w:rPr>
-        <w:t>ve</w:t>
-      </w:r>
-      <w:proofErr w:type="spellEnd"/>
-      <w:r>
-        <w:rPr>
-          <w:sz w:val="24"/>
-          <w:szCs w:val="24"/>
-          <w:lang w:val="en-US"/>
-        </w:rPr>
-        <w:t xml:space="preserve"> or –</w:t>
-      </w:r>
-      <w:proofErr w:type="spellStart"/>
-      <w:r>
-        <w:rPr>
-          <w:sz w:val="24"/>
-          <w:szCs w:val="24"/>
-          <w:lang w:val="en-US"/>
-        </w:rPr>
-        <w:t>ve</w:t>
-      </w:r>
-      <w:proofErr w:type="spellEnd"/>
+        <w:t>Accept a number from user and check whether it is +ve or –ve</w:t>
+      </w:r>
     </w:p>
     <w:p>
       <w:pPr>
@@ -378,25 +302,7 @@
           <w:szCs w:val="24"/>
           <w:lang w:val="en-US"/>
         </w:rPr>
-        <w:t xml:space="preserve">Accept age from user and show the message as "You are valid for voting" if age is </w:t>
-      </w:r>
-      <w:proofErr w:type="spellStart"/>
-      <w:r>
-        <w:rPr>
-          <w:sz w:val="24"/>
-          <w:szCs w:val="24"/>
-          <w:lang w:val="en-US"/>
-        </w:rPr>
-        <w:t>grater</w:t>
-      </w:r>
-      <w:proofErr w:type="spellEnd"/>
-      <w:r>
-        <w:rPr>
-          <w:sz w:val="24"/>
-          <w:szCs w:val="24"/>
-          <w:lang w:val="en-US"/>
-        </w:rPr>
-        <w:t xml:space="preserve"> than or equal to 18 otherwise display the message as "You are not valid for voting"</w:t>
+        <w:t>Accept age from user and show the message as "You are valid for voting" if age is grater than or equal to 18 otherwise display the message as "You are not valid for voting"</w:t>
       </w:r>
     </w:p>
     <w:p>
@@ -501,17 +407,8 @@
           <w:lang w:val="en-US"/>
         </w:rPr>
         <w:tab/>
-      </w:r>
-      <w:proofErr w:type="spellStart"/>
-      <w:r>
-        <w:rPr>
-          <w:sz w:val="24"/>
-          <w:szCs w:val="24"/>
-          <w:lang w:val="en-US"/>
-        </w:rPr>
         <w:t>Dist</w:t>
       </w:r>
-      <w:proofErr w:type="spellEnd"/>
       <w:r>
         <w:rPr>
           <w:sz w:val="24"/>
@@ -748,7 +645,6 @@
           <w:lang w:val="en-US"/>
         </w:rPr>
       </w:pPr>
-      <w:proofErr w:type="spellStart"/>
       <w:r>
         <w:rPr>
           <w:sz w:val="24"/>
@@ -757,7 +653,6 @@
         </w:rPr>
         <w:t>AccountNo</w:t>
       </w:r>
-      <w:proofErr w:type="spellEnd"/>
     </w:p>
     <w:p>
       <w:pPr>
@@ -772,7 +667,6 @@
           <w:lang w:val="en-US"/>
         </w:rPr>
       </w:pPr>
-      <w:proofErr w:type="spellStart"/>
       <w:r>
         <w:rPr>
           <w:sz w:val="24"/>
@@ -781,7 +675,6 @@
         </w:rPr>
         <w:t>AccountHolderName</w:t>
       </w:r>
-      <w:proofErr w:type="spellEnd"/>
     </w:p>
     <w:p>
       <w:pPr>
@@ -862,23 +755,13 @@
           <w:lang w:val="en-US"/>
         </w:rPr>
       </w:pPr>
-      <w:proofErr w:type="spellStart"/>
-      <w:r>
-        <w:rPr>
-          <w:sz w:val="24"/>
-          <w:szCs w:val="24"/>
-          <w:lang w:val="en-US"/>
-        </w:rPr>
-        <w:t>DisplayData</w:t>
-      </w:r>
-      <w:proofErr w:type="spellEnd"/>
-      <w:r>
-        <w:rPr>
-          <w:sz w:val="24"/>
-          <w:szCs w:val="24"/>
-          <w:lang w:val="en-US"/>
-        </w:rPr>
-        <w:t>()</w:t>
+      <w:r>
+        <w:rPr>
+          <w:sz w:val="24"/>
+          <w:szCs w:val="24"/>
+          <w:lang w:val="en-US"/>
+        </w:rPr>
+        <w:t>DisplayData()</w:t>
       </w:r>
     </w:p>
     <w:p>
@@ -939,25 +822,7 @@
           <w:szCs w:val="24"/>
           <w:lang w:val="en-US"/>
         </w:rPr>
-        <w:t xml:space="preserve">Try </w:t>
-      </w:r>
-      <w:proofErr w:type="gramStart"/>
-      <w:r>
-        <w:rPr>
-          <w:sz w:val="24"/>
-          <w:szCs w:val="24"/>
-          <w:lang w:val="en-US"/>
-        </w:rPr>
-        <w:t>getPageSource(</w:t>
-      </w:r>
-      <w:proofErr w:type="gramEnd"/>
-      <w:r>
-        <w:rPr>
-          <w:sz w:val="24"/>
-          <w:szCs w:val="24"/>
-          <w:lang w:val="en-US"/>
-        </w:rPr>
-        <w:t>) on any web site. What is the return type and use of this method?</w:t>
+        <w:t>Try getPageSource() on any web site. What is the return type and use of this method?</w:t>
       </w:r>
     </w:p>
     <w:p>
@@ -1012,25 +877,7 @@
           <w:szCs w:val="24"/>
           <w:lang w:val="en-US"/>
         </w:rPr>
-        <w:t>Enter username as your name (</w:t>
-      </w:r>
-      <w:proofErr w:type="spellStart"/>
-      <w:r>
-        <w:rPr>
-          <w:sz w:val="24"/>
-          <w:szCs w:val="24"/>
-          <w:lang w:val="en-US"/>
-        </w:rPr>
-        <w:t>amita</w:t>
-      </w:r>
-      <w:proofErr w:type="spellEnd"/>
-      <w:r>
-        <w:rPr>
-          <w:sz w:val="24"/>
-          <w:szCs w:val="24"/>
-          <w:lang w:val="en-US"/>
-        </w:rPr>
-        <w:t>)</w:t>
+        <w:t>Enter username as your name (amita)</w:t>
       </w:r>
     </w:p>
     <w:p>
@@ -1149,7 +996,6 @@
         </w:rPr>
         <w:t>Enter username as your name (</w:t>
       </w:r>
-      <w:proofErr w:type="spellStart"/>
       <w:r>
         <w:rPr>
           <w:sz w:val="24"/>
@@ -1158,7 +1004,6 @@
         </w:rPr>
         <w:t>trupti</w:t>
       </w:r>
-      <w:proofErr w:type="spellEnd"/>
       <w:r>
         <w:rPr>
           <w:sz w:val="24"/>
@@ -1298,25 +1143,7 @@
           <w:szCs w:val="24"/>
           <w:lang w:val="en-US"/>
         </w:rPr>
-        <w:t>Enter username as your name (</w:t>
-      </w:r>
-      <w:proofErr w:type="spellStart"/>
-      <w:r>
-        <w:rPr>
-          <w:sz w:val="24"/>
-          <w:szCs w:val="24"/>
-          <w:lang w:val="en-US"/>
-        </w:rPr>
-        <w:t>trupti</w:t>
-      </w:r>
-      <w:proofErr w:type="spellEnd"/>
-      <w:r>
-        <w:rPr>
-          <w:sz w:val="24"/>
-          <w:szCs w:val="24"/>
-          <w:lang w:val="en-US"/>
-        </w:rPr>
-        <w:t>)</w:t>
+        <w:t>Enter username as your name (trupti)</w:t>
       </w:r>
     </w:p>
     <w:p>
@@ -1638,25 +1465,7 @@
           <w:szCs w:val="24"/>
           <w:lang w:val="en-US"/>
         </w:rPr>
-        <w:t>Enter username as your name (</w:t>
-      </w:r>
-      <w:proofErr w:type="spellStart"/>
-      <w:r>
-        <w:rPr>
-          <w:sz w:val="24"/>
-          <w:szCs w:val="24"/>
-          <w:lang w:val="en-US"/>
-        </w:rPr>
-        <w:t>trupti</w:t>
-      </w:r>
-      <w:proofErr w:type="spellEnd"/>
-      <w:r>
-        <w:rPr>
-          <w:sz w:val="24"/>
-          <w:szCs w:val="24"/>
-          <w:lang w:val="en-US"/>
-        </w:rPr>
-        <w:t>)</w:t>
+        <w:t>Enter username as your name (trupti)</w:t>
       </w:r>
     </w:p>
     <w:p>
@@ -1793,25 +1602,7 @@
           <w:szCs w:val="24"/>
           <w:lang w:val="en-US"/>
         </w:rPr>
-        <w:t>Enter username as your name (</w:t>
-      </w:r>
-      <w:proofErr w:type="spellStart"/>
-      <w:r>
-        <w:rPr>
-          <w:sz w:val="24"/>
-          <w:szCs w:val="24"/>
-          <w:lang w:val="en-US"/>
-        </w:rPr>
-        <w:t>trupti</w:t>
-      </w:r>
-      <w:proofErr w:type="spellEnd"/>
-      <w:r>
-        <w:rPr>
-          <w:sz w:val="24"/>
-          <w:szCs w:val="24"/>
-          <w:lang w:val="en-US"/>
-        </w:rPr>
-        <w:t>)</w:t>
+        <w:t>Enter username as your name (trupti)</w:t>
       </w:r>
     </w:p>
     <w:p>
@@ -1857,6 +1648,30 @@
         </w:rPr>
         <w:t>Click on Login button</w:t>
       </w:r>
+    </w:p>
+    <w:p>
+      <w:pPr>
+        <w:pStyle w:val="ListParagraph"/>
+        <w:numPr>
+          <w:ilvl w:val="1"/>
+          <w:numId w:val="3"/>
+        </w:numPr>
+        <w:rPr>
+          <w:sz w:val="24"/>
+          <w:szCs w:val="24"/>
+          <w:lang w:val="en-US"/>
+        </w:rPr>
+      </w:pPr>
+      <w:r>
+        <w:rPr>
+          <w:sz w:val="24"/>
+          <w:szCs w:val="24"/>
+          <w:lang w:val="en-US"/>
+        </w:rPr>
+        <w:t>Display error message</w:t>
+      </w:r>
+      <w:bookmarkStart w:id="0" w:name="_GoBack"/>
+      <w:bookmarkEnd w:id="0"/>
       <w:r>
         <w:rPr>
           <w:sz w:val="24"/>
@@ -2049,8 +1864,190 @@
           <w:lang w:val="en-US"/>
         </w:rPr>
       </w:pPr>
-      <w:bookmarkStart w:id="0" w:name="_GoBack"/>
-      <w:bookmarkEnd w:id="0"/>
+      <w:r>
+        <w:rPr>
+          <w:sz w:val="24"/>
+          <w:szCs w:val="24"/>
+          <w:lang w:val="en-US"/>
+        </w:rPr>
+        <w:lastRenderedPageBreak/>
+        <w:t xml:space="preserve">Launch </w:t>
+      </w:r>
+      <w:hyperlink r:id="rId15" w:history="1">
+        <w:r>
+          <w:rPr>
+            <w:rStyle w:val="Hyperlink"/>
+            <w:sz w:val="24"/>
+            <w:szCs w:val="24"/>
+            <w:lang w:val="en-US"/>
+          </w:rPr>
+          <w:t>https://register.rediff.com/register/register.php?FormName=user_details</w:t>
+        </w:r>
+      </w:hyperlink>
+    </w:p>
+    <w:p>
+      <w:pPr>
+        <w:pStyle w:val="ListParagraph"/>
+        <w:numPr>
+          <w:ilvl w:val="1"/>
+          <w:numId w:val="3"/>
+        </w:numPr>
+        <w:rPr>
+          <w:sz w:val="24"/>
+          <w:szCs w:val="24"/>
+          <w:lang w:val="en-US"/>
+        </w:rPr>
+      </w:pPr>
+      <w:r>
+        <w:rPr>
+          <w:sz w:val="24"/>
+          <w:szCs w:val="24"/>
+          <w:lang w:val="en-US"/>
+        </w:rPr>
+        <w:t>Enter Full Name</w:t>
+      </w:r>
+    </w:p>
+    <w:p>
+      <w:pPr>
+        <w:pStyle w:val="ListParagraph"/>
+        <w:numPr>
+          <w:ilvl w:val="1"/>
+          <w:numId w:val="3"/>
+        </w:numPr>
+        <w:rPr>
+          <w:sz w:val="24"/>
+          <w:szCs w:val="24"/>
+          <w:lang w:val="en-US"/>
+        </w:rPr>
+      </w:pPr>
+      <w:r>
+        <w:rPr>
+          <w:sz w:val="24"/>
+          <w:szCs w:val="24"/>
+          <w:lang w:val="en-US"/>
+        </w:rPr>
+        <w:t>Enter Rediff Id</w:t>
+      </w:r>
+    </w:p>
+    <w:p>
+      <w:pPr>
+        <w:pStyle w:val="ListParagraph"/>
+        <w:numPr>
+          <w:ilvl w:val="1"/>
+          <w:numId w:val="3"/>
+        </w:numPr>
+        <w:rPr>
+          <w:sz w:val="24"/>
+          <w:szCs w:val="24"/>
+          <w:lang w:val="en-US"/>
+        </w:rPr>
+      </w:pPr>
+      <w:r>
+        <w:rPr>
+          <w:sz w:val="24"/>
+          <w:szCs w:val="24"/>
+          <w:lang w:val="en-US"/>
+        </w:rPr>
+        <w:t>Enter Password</w:t>
+      </w:r>
+    </w:p>
+    <w:p>
+      <w:pPr>
+        <w:pStyle w:val="ListParagraph"/>
+        <w:numPr>
+          <w:ilvl w:val="1"/>
+          <w:numId w:val="3"/>
+        </w:numPr>
+        <w:rPr>
+          <w:sz w:val="24"/>
+          <w:szCs w:val="24"/>
+          <w:lang w:val="en-US"/>
+        </w:rPr>
+      </w:pPr>
+      <w:r>
+        <w:rPr>
+          <w:sz w:val="24"/>
+          <w:szCs w:val="24"/>
+          <w:lang w:val="en-US"/>
+        </w:rPr>
+        <w:t>Enter Confirm Password</w:t>
+      </w:r>
+    </w:p>
+    <w:p>
+      <w:pPr>
+        <w:pStyle w:val="ListParagraph"/>
+        <w:numPr>
+          <w:ilvl w:val="1"/>
+          <w:numId w:val="3"/>
+        </w:numPr>
+        <w:rPr>
+          <w:sz w:val="24"/>
+          <w:szCs w:val="24"/>
+          <w:lang w:val="en-US"/>
+        </w:rPr>
+      </w:pPr>
+      <w:r>
+        <w:rPr>
+          <w:sz w:val="24"/>
+          <w:szCs w:val="24"/>
+          <w:lang w:val="en-US"/>
+        </w:rPr>
+        <w:t>Enter Recovery Email Id</w:t>
+      </w:r>
+    </w:p>
+    <w:p>
+      <w:pPr>
+        <w:pStyle w:val="ListParagraph"/>
+        <w:numPr>
+          <w:ilvl w:val="1"/>
+          <w:numId w:val="3"/>
+        </w:numPr>
+        <w:rPr>
+          <w:sz w:val="24"/>
+          <w:szCs w:val="24"/>
+          <w:lang w:val="en-US"/>
+        </w:rPr>
+      </w:pPr>
+      <w:r>
+        <w:rPr>
+          <w:sz w:val="24"/>
+          <w:szCs w:val="24"/>
+          <w:lang w:val="en-US"/>
+        </w:rPr>
+        <w:t>Enter Mobile No</w:t>
+      </w:r>
+      <w:r>
+        <w:rPr>
+          <w:sz w:val="24"/>
+          <w:szCs w:val="24"/>
+          <w:lang w:val="en-US"/>
+        </w:rPr>
+        <w:br/>
+      </w:r>
+      <w:r>
+        <w:rPr>
+          <w:b/>
+          <w:bCs/>
+          <w:sz w:val="24"/>
+          <w:szCs w:val="24"/>
+          <w:lang w:val="en-US"/>
+        </w:rPr>
+        <w:t>Use Absolute XPath</w:t>
+      </w:r>
+    </w:p>
+    <w:p>
+      <w:pPr>
+        <w:pStyle w:val="ListParagraph"/>
+        <w:numPr>
+          <w:ilvl w:val="0"/>
+          <w:numId w:val="3"/>
+        </w:numPr>
+        <w:rPr>
+          <w:sz w:val="24"/>
+          <w:szCs w:val="24"/>
+          <w:lang w:val="en-US"/>
+        </w:rPr>
+      </w:pPr>
     </w:p>
     <w:sectPr>
       <w:pgSz w:w="11906" w:h="16838"/>

</xml_diff>

<commit_message>
Date: 10 Oct 2025
</commit_message>
<xml_diff>
--- a/Assignments.docx
+++ b/Assignments.docx
@@ -120,13 +120,23 @@
           <w:lang w:val="en-US"/>
         </w:rPr>
       </w:pPr>
-      <w:r>
-        <w:rPr>
-          <w:sz w:val="24"/>
-          <w:szCs w:val="24"/>
-          <w:lang w:val="en-US"/>
-        </w:rPr>
-        <w:t>hra = 20% of basic salary</w:t>
+      <w:proofErr w:type="spellStart"/>
+      <w:r>
+        <w:rPr>
+          <w:sz w:val="24"/>
+          <w:szCs w:val="24"/>
+          <w:lang w:val="en-US"/>
+        </w:rPr>
+        <w:t>hra</w:t>
+      </w:r>
+      <w:proofErr w:type="spellEnd"/>
+      <w:r>
+        <w:rPr>
+          <w:sz w:val="24"/>
+          <w:szCs w:val="24"/>
+          <w:lang w:val="en-US"/>
+        </w:rPr>
+        <w:t xml:space="preserve"> = 20% of basic salary</w:t>
       </w:r>
     </w:p>
     <w:p>
@@ -142,13 +152,23 @@
           <w:lang w:val="en-US"/>
         </w:rPr>
       </w:pPr>
-      <w:r>
-        <w:rPr>
-          <w:sz w:val="24"/>
-          <w:szCs w:val="24"/>
-          <w:lang w:val="en-US"/>
-        </w:rPr>
-        <w:t>pf = 5% of basic salary</w:t>
+      <w:proofErr w:type="spellStart"/>
+      <w:r>
+        <w:rPr>
+          <w:sz w:val="24"/>
+          <w:szCs w:val="24"/>
+          <w:lang w:val="en-US"/>
+        </w:rPr>
+        <w:t>pf</w:t>
+      </w:r>
+      <w:proofErr w:type="spellEnd"/>
+      <w:r>
+        <w:rPr>
+          <w:sz w:val="24"/>
+          <w:szCs w:val="24"/>
+          <w:lang w:val="en-US"/>
+        </w:rPr>
+        <w:t xml:space="preserve"> = 5% of basic salary</w:t>
       </w:r>
     </w:p>
     <w:p>
@@ -170,7 +190,25 @@
           <w:szCs w:val="24"/>
           <w:lang w:val="en-US"/>
         </w:rPr>
-        <w:t>gross salary = basic salary + da + hra;</w:t>
+        <w:t xml:space="preserve">gross salary = basic salary + da + </w:t>
+      </w:r>
+      <w:proofErr w:type="spellStart"/>
+      <w:r>
+        <w:rPr>
+          <w:sz w:val="24"/>
+          <w:szCs w:val="24"/>
+          <w:lang w:val="en-US"/>
+        </w:rPr>
+        <w:t>hra</w:t>
+      </w:r>
+      <w:proofErr w:type="spellEnd"/>
+      <w:r>
+        <w:rPr>
+          <w:sz w:val="24"/>
+          <w:szCs w:val="24"/>
+          <w:lang w:val="en-US"/>
+        </w:rPr>
+        <w:t>;</w:t>
       </w:r>
     </w:p>
     <w:p>
@@ -192,8 +230,18 @@
           <w:szCs w:val="24"/>
           <w:lang w:val="en-US"/>
         </w:rPr>
-        <w:t>net salary = gross salary – pf</w:t>
-      </w:r>
+        <w:t xml:space="preserve">net salary = gross salary – </w:t>
+      </w:r>
+      <w:proofErr w:type="spellStart"/>
+      <w:r>
+        <w:rPr>
+          <w:sz w:val="24"/>
+          <w:szCs w:val="24"/>
+          <w:lang w:val="en-US"/>
+        </w:rPr>
+        <w:t>pf</w:t>
+      </w:r>
+      <w:proofErr w:type="spellEnd"/>
     </w:p>
     <w:p>
       <w:pPr>
@@ -214,8 +262,36 @@
           <w:szCs w:val="24"/>
           <w:lang w:val="en-US"/>
         </w:rPr>
-        <w:t>Accept a number from user and check whether it is +ve or –ve</w:t>
-      </w:r>
+        <w:t>Accept a number from user and check whether it is +</w:t>
+      </w:r>
+      <w:proofErr w:type="spellStart"/>
+      <w:r>
+        <w:rPr>
+          <w:sz w:val="24"/>
+          <w:szCs w:val="24"/>
+          <w:lang w:val="en-US"/>
+        </w:rPr>
+        <w:t>ve</w:t>
+      </w:r>
+      <w:proofErr w:type="spellEnd"/>
+      <w:r>
+        <w:rPr>
+          <w:sz w:val="24"/>
+          <w:szCs w:val="24"/>
+          <w:lang w:val="en-US"/>
+        </w:rPr>
+        <w:t xml:space="preserve"> or –</w:t>
+      </w:r>
+      <w:proofErr w:type="spellStart"/>
+      <w:r>
+        <w:rPr>
+          <w:sz w:val="24"/>
+          <w:szCs w:val="24"/>
+          <w:lang w:val="en-US"/>
+        </w:rPr>
+        <w:t>ve</w:t>
+      </w:r>
+      <w:proofErr w:type="spellEnd"/>
     </w:p>
     <w:p>
       <w:pPr>
@@ -302,7 +378,25 @@
           <w:szCs w:val="24"/>
           <w:lang w:val="en-US"/>
         </w:rPr>
-        <w:t>Accept age from user and show the message as "You are valid for voting" if age is grater than or equal to 18 otherwise display the message as "You are not valid for voting"</w:t>
+        <w:t xml:space="preserve">Accept age from user and show the message as "You are valid for voting" if age is </w:t>
+      </w:r>
+      <w:proofErr w:type="spellStart"/>
+      <w:r>
+        <w:rPr>
+          <w:sz w:val="24"/>
+          <w:szCs w:val="24"/>
+          <w:lang w:val="en-US"/>
+        </w:rPr>
+        <w:t>grater</w:t>
+      </w:r>
+      <w:proofErr w:type="spellEnd"/>
+      <w:r>
+        <w:rPr>
+          <w:sz w:val="24"/>
+          <w:szCs w:val="24"/>
+          <w:lang w:val="en-US"/>
+        </w:rPr>
+        <w:t xml:space="preserve"> than or equal to 18 otherwise display the message as "You are not valid for voting"</w:t>
       </w:r>
     </w:p>
     <w:p>
@@ -407,8 +501,17 @@
           <w:lang w:val="en-US"/>
         </w:rPr>
         <w:tab/>
+      </w:r>
+      <w:proofErr w:type="spellStart"/>
+      <w:r>
+        <w:rPr>
+          <w:sz w:val="24"/>
+          <w:szCs w:val="24"/>
+          <w:lang w:val="en-US"/>
+        </w:rPr>
         <w:t>Dist</w:t>
       </w:r>
+      <w:proofErr w:type="spellEnd"/>
       <w:r>
         <w:rPr>
           <w:sz w:val="24"/>
@@ -645,6 +748,7 @@
           <w:lang w:val="en-US"/>
         </w:rPr>
       </w:pPr>
+      <w:proofErr w:type="spellStart"/>
       <w:r>
         <w:rPr>
           <w:sz w:val="24"/>
@@ -653,6 +757,7 @@
         </w:rPr>
         <w:t>AccountNo</w:t>
       </w:r>
+      <w:proofErr w:type="spellEnd"/>
     </w:p>
     <w:p>
       <w:pPr>
@@ -667,6 +772,7 @@
           <w:lang w:val="en-US"/>
         </w:rPr>
       </w:pPr>
+      <w:proofErr w:type="spellStart"/>
       <w:r>
         <w:rPr>
           <w:sz w:val="24"/>
@@ -675,6 +781,7 @@
         </w:rPr>
         <w:t>AccountHolderName</w:t>
       </w:r>
+      <w:proofErr w:type="spellEnd"/>
     </w:p>
     <w:p>
       <w:pPr>
@@ -755,13 +862,23 @@
           <w:lang w:val="en-US"/>
         </w:rPr>
       </w:pPr>
-      <w:r>
-        <w:rPr>
-          <w:sz w:val="24"/>
-          <w:szCs w:val="24"/>
-          <w:lang w:val="en-US"/>
-        </w:rPr>
-        <w:t>DisplayData()</w:t>
+      <w:proofErr w:type="spellStart"/>
+      <w:r>
+        <w:rPr>
+          <w:sz w:val="24"/>
+          <w:szCs w:val="24"/>
+          <w:lang w:val="en-US"/>
+        </w:rPr>
+        <w:t>DisplayData</w:t>
+      </w:r>
+      <w:proofErr w:type="spellEnd"/>
+      <w:r>
+        <w:rPr>
+          <w:sz w:val="24"/>
+          <w:szCs w:val="24"/>
+          <w:lang w:val="en-US"/>
+        </w:rPr>
+        <w:t>()</w:t>
       </w:r>
     </w:p>
     <w:p>
@@ -822,7 +939,25 @@
           <w:szCs w:val="24"/>
           <w:lang w:val="en-US"/>
         </w:rPr>
-        <w:t>Try getPageSource() on any web site. What is the return type and use of this method?</w:t>
+        <w:t xml:space="preserve">Try </w:t>
+      </w:r>
+      <w:proofErr w:type="gramStart"/>
+      <w:r>
+        <w:rPr>
+          <w:sz w:val="24"/>
+          <w:szCs w:val="24"/>
+          <w:lang w:val="en-US"/>
+        </w:rPr>
+        <w:t>getPageSource(</w:t>
+      </w:r>
+      <w:proofErr w:type="gramEnd"/>
+      <w:r>
+        <w:rPr>
+          <w:sz w:val="24"/>
+          <w:szCs w:val="24"/>
+          <w:lang w:val="en-US"/>
+        </w:rPr>
+        <w:t>) on any web site. What is the return type and use of this method?</w:t>
       </w:r>
     </w:p>
     <w:p>
@@ -877,7 +1012,25 @@
           <w:szCs w:val="24"/>
           <w:lang w:val="en-US"/>
         </w:rPr>
-        <w:t>Enter username as your name (amita)</w:t>
+        <w:t>Enter username as your name (</w:t>
+      </w:r>
+      <w:proofErr w:type="spellStart"/>
+      <w:r>
+        <w:rPr>
+          <w:sz w:val="24"/>
+          <w:szCs w:val="24"/>
+          <w:lang w:val="en-US"/>
+        </w:rPr>
+        <w:t>amita</w:t>
+      </w:r>
+      <w:proofErr w:type="spellEnd"/>
+      <w:r>
+        <w:rPr>
+          <w:sz w:val="24"/>
+          <w:szCs w:val="24"/>
+          <w:lang w:val="en-US"/>
+        </w:rPr>
+        <w:t>)</w:t>
       </w:r>
     </w:p>
     <w:p>
@@ -996,6 +1149,7 @@
         </w:rPr>
         <w:t>Enter username as your name (</w:t>
       </w:r>
+      <w:proofErr w:type="spellStart"/>
       <w:r>
         <w:rPr>
           <w:sz w:val="24"/>
@@ -1004,6 +1158,7 @@
         </w:rPr>
         <w:t>trupti</w:t>
       </w:r>
+      <w:proofErr w:type="spellEnd"/>
       <w:r>
         <w:rPr>
           <w:sz w:val="24"/>
@@ -1143,7 +1298,25 @@
           <w:szCs w:val="24"/>
           <w:lang w:val="en-US"/>
         </w:rPr>
-        <w:t>Enter username as your name (trupti)</w:t>
+        <w:t>Enter username as your name (</w:t>
+      </w:r>
+      <w:proofErr w:type="spellStart"/>
+      <w:r>
+        <w:rPr>
+          <w:sz w:val="24"/>
+          <w:szCs w:val="24"/>
+          <w:lang w:val="en-US"/>
+        </w:rPr>
+        <w:t>trupti</w:t>
+      </w:r>
+      <w:proofErr w:type="spellEnd"/>
+      <w:r>
+        <w:rPr>
+          <w:sz w:val="24"/>
+          <w:szCs w:val="24"/>
+          <w:lang w:val="en-US"/>
+        </w:rPr>
+        <w:t>)</w:t>
       </w:r>
     </w:p>
     <w:p>
@@ -1465,7 +1638,25 @@
           <w:szCs w:val="24"/>
           <w:lang w:val="en-US"/>
         </w:rPr>
-        <w:t>Enter username as your name (trupti)</w:t>
+        <w:t>Enter username as your name (</w:t>
+      </w:r>
+      <w:proofErr w:type="spellStart"/>
+      <w:r>
+        <w:rPr>
+          <w:sz w:val="24"/>
+          <w:szCs w:val="24"/>
+          <w:lang w:val="en-US"/>
+        </w:rPr>
+        <w:t>trupti</w:t>
+      </w:r>
+      <w:proofErr w:type="spellEnd"/>
+      <w:r>
+        <w:rPr>
+          <w:sz w:val="24"/>
+          <w:szCs w:val="24"/>
+          <w:lang w:val="en-US"/>
+        </w:rPr>
+        <w:t>)</w:t>
       </w:r>
     </w:p>
     <w:p>
@@ -1602,7 +1793,25 @@
           <w:szCs w:val="24"/>
           <w:lang w:val="en-US"/>
         </w:rPr>
-        <w:t>Enter username as your name (trupti)</w:t>
+        <w:t>Enter username as your name (</w:t>
+      </w:r>
+      <w:proofErr w:type="spellStart"/>
+      <w:r>
+        <w:rPr>
+          <w:sz w:val="24"/>
+          <w:szCs w:val="24"/>
+          <w:lang w:val="en-US"/>
+        </w:rPr>
+        <w:t>trupti</w:t>
+      </w:r>
+      <w:proofErr w:type="spellEnd"/>
+      <w:r>
+        <w:rPr>
+          <w:sz w:val="24"/>
+          <w:szCs w:val="24"/>
+          <w:lang w:val="en-US"/>
+        </w:rPr>
+        <w:t>)</w:t>
       </w:r>
     </w:p>
     <w:p>
@@ -1670,8 +1879,6 @@
         </w:rPr>
         <w:t>Display error message</w:t>
       </w:r>
-      <w:bookmarkStart w:id="0" w:name="_GoBack"/>
-      <w:bookmarkEnd w:id="0"/>
       <w:r>
         <w:rPr>
           <w:sz w:val="24"/>
@@ -2048,6 +2255,774 @@
           <w:lang w:val="en-US"/>
         </w:rPr>
       </w:pPr>
+      <w:r>
+        <w:rPr>
+          <w:sz w:val="24"/>
+          <w:szCs w:val="24"/>
+          <w:lang w:val="en-US"/>
+        </w:rPr>
+        <w:t xml:space="preserve">Launch </w:t>
+      </w:r>
+      <w:hyperlink r:id="rId16" w:history="1">
+        <w:r>
+          <w:rPr>
+            <w:rStyle w:val="Hyperlink"/>
+            <w:sz w:val="24"/>
+            <w:szCs w:val="24"/>
+            <w:lang w:val="en-US"/>
+          </w:rPr>
+          <w:t>https://www.echotrak.com/Login.aspx?ReturnUrl=%2f</w:t>
+        </w:r>
+      </w:hyperlink>
+    </w:p>
+    <w:p>
+      <w:pPr>
+        <w:pStyle w:val="ListParagraph"/>
+        <w:numPr>
+          <w:ilvl w:val="1"/>
+          <w:numId w:val="3"/>
+        </w:numPr>
+        <w:rPr>
+          <w:sz w:val="24"/>
+          <w:szCs w:val="24"/>
+          <w:lang w:val="en-US"/>
+        </w:rPr>
+      </w:pPr>
+      <w:r>
+        <w:rPr>
+          <w:sz w:val="24"/>
+          <w:szCs w:val="24"/>
+          <w:lang w:val="en-US"/>
+        </w:rPr>
+        <w:t>Enter username as your name (</w:t>
+      </w:r>
+      <w:proofErr w:type="spellStart"/>
+      <w:r>
+        <w:rPr>
+          <w:sz w:val="24"/>
+          <w:szCs w:val="24"/>
+          <w:lang w:val="en-US"/>
+        </w:rPr>
+        <w:t>trupti</w:t>
+      </w:r>
+      <w:proofErr w:type="spellEnd"/>
+      <w:r>
+        <w:rPr>
+          <w:sz w:val="24"/>
+          <w:szCs w:val="24"/>
+          <w:lang w:val="en-US"/>
+        </w:rPr>
+        <w:t>)</w:t>
+      </w:r>
+    </w:p>
+    <w:p>
+      <w:pPr>
+        <w:pStyle w:val="ListParagraph"/>
+        <w:numPr>
+          <w:ilvl w:val="1"/>
+          <w:numId w:val="3"/>
+        </w:numPr>
+        <w:rPr>
+          <w:sz w:val="24"/>
+          <w:szCs w:val="24"/>
+          <w:lang w:val="en-US"/>
+        </w:rPr>
+      </w:pPr>
+      <w:r>
+        <w:rPr>
+          <w:sz w:val="24"/>
+          <w:szCs w:val="24"/>
+          <w:lang w:val="en-US"/>
+        </w:rPr>
+        <w:t>Enter password as yourname123 (trupti123)</w:t>
+      </w:r>
+    </w:p>
+    <w:p>
+      <w:pPr>
+        <w:pStyle w:val="ListParagraph"/>
+        <w:numPr>
+          <w:ilvl w:val="1"/>
+          <w:numId w:val="3"/>
+        </w:numPr>
+        <w:rPr>
+          <w:sz w:val="24"/>
+          <w:szCs w:val="24"/>
+          <w:lang w:val="en-US"/>
+        </w:rPr>
+      </w:pPr>
+      <w:r>
+        <w:rPr>
+          <w:sz w:val="24"/>
+          <w:szCs w:val="24"/>
+          <w:lang w:val="en-US"/>
+        </w:rPr>
+        <w:t>Click on Login button</w:t>
+      </w:r>
+    </w:p>
+    <w:p>
+      <w:pPr>
+        <w:pStyle w:val="ListParagraph"/>
+        <w:numPr>
+          <w:ilvl w:val="1"/>
+          <w:numId w:val="3"/>
+        </w:numPr>
+        <w:rPr>
+          <w:sz w:val="24"/>
+          <w:szCs w:val="24"/>
+          <w:lang w:val="en-US"/>
+        </w:rPr>
+      </w:pPr>
+      <w:r>
+        <w:rPr>
+          <w:sz w:val="24"/>
+          <w:szCs w:val="24"/>
+          <w:lang w:val="en-US"/>
+        </w:rPr>
+        <w:t>Display error message</w:t>
+      </w:r>
+      <w:r>
+        <w:rPr>
+          <w:sz w:val="24"/>
+          <w:szCs w:val="24"/>
+          <w:lang w:val="en-US"/>
+        </w:rPr>
+        <w:br/>
+      </w:r>
+      <w:r>
+        <w:rPr>
+          <w:b/>
+          <w:bCs/>
+          <w:sz w:val="24"/>
+          <w:szCs w:val="24"/>
+          <w:lang w:val="en-US"/>
+        </w:rPr>
+        <w:t xml:space="preserve">Use </w:t>
+      </w:r>
+      <w:r>
+        <w:rPr>
+          <w:b/>
+          <w:bCs/>
+          <w:sz w:val="24"/>
+          <w:szCs w:val="24"/>
+          <w:lang w:val="en-US"/>
+        </w:rPr>
+        <w:t>Relative</w:t>
+      </w:r>
+      <w:r>
+        <w:rPr>
+          <w:b/>
+          <w:bCs/>
+          <w:sz w:val="24"/>
+          <w:szCs w:val="24"/>
+          <w:lang w:val="en-US"/>
+        </w:rPr>
+        <w:t xml:space="preserve"> XPath </w:t>
+      </w:r>
+    </w:p>
+    <w:p>
+      <w:pPr>
+        <w:pStyle w:val="ListParagraph"/>
+        <w:numPr>
+          <w:ilvl w:val="0"/>
+          <w:numId w:val="3"/>
+        </w:numPr>
+        <w:rPr>
+          <w:sz w:val="24"/>
+          <w:szCs w:val="24"/>
+          <w:lang w:val="en-US"/>
+        </w:rPr>
+      </w:pPr>
+      <w:r>
+        <w:rPr>
+          <w:sz w:val="24"/>
+          <w:szCs w:val="24"/>
+          <w:lang w:val="en-US"/>
+        </w:rPr>
+        <w:t xml:space="preserve">Launch </w:t>
+      </w:r>
+      <w:hyperlink r:id="rId17" w:history="1">
+        <w:r>
+          <w:rPr>
+            <w:rStyle w:val="Hyperlink"/>
+            <w:sz w:val="24"/>
+            <w:szCs w:val="24"/>
+            <w:lang w:val="en-US"/>
+          </w:rPr>
+          <w:t>https://www.facebook.com</w:t>
+        </w:r>
+      </w:hyperlink>
+    </w:p>
+    <w:p>
+      <w:pPr>
+        <w:pStyle w:val="ListParagraph"/>
+        <w:numPr>
+          <w:ilvl w:val="1"/>
+          <w:numId w:val="3"/>
+        </w:numPr>
+        <w:rPr>
+          <w:sz w:val="24"/>
+          <w:szCs w:val="24"/>
+          <w:lang w:val="en-US"/>
+        </w:rPr>
+      </w:pPr>
+      <w:r>
+        <w:rPr>
+          <w:sz w:val="24"/>
+          <w:szCs w:val="24"/>
+          <w:lang w:val="en-US"/>
+        </w:rPr>
+        <w:t xml:space="preserve">Enter email id as </w:t>
+      </w:r>
+      <w:hyperlink r:id="rId18" w:history="1">
+        <w:r>
+          <w:rPr>
+            <w:rStyle w:val="Hyperlink"/>
+            <w:sz w:val="24"/>
+            <w:szCs w:val="24"/>
+            <w:lang w:val="en-US"/>
+          </w:rPr>
+          <w:t>test@gmail.com</w:t>
+        </w:r>
+      </w:hyperlink>
+    </w:p>
+    <w:p>
+      <w:pPr>
+        <w:pStyle w:val="ListParagraph"/>
+        <w:numPr>
+          <w:ilvl w:val="1"/>
+          <w:numId w:val="3"/>
+        </w:numPr>
+        <w:rPr>
+          <w:sz w:val="24"/>
+          <w:szCs w:val="24"/>
+          <w:lang w:val="en-US"/>
+        </w:rPr>
+      </w:pPr>
+      <w:r>
+        <w:rPr>
+          <w:sz w:val="24"/>
+          <w:szCs w:val="24"/>
+          <w:lang w:val="en-US"/>
+        </w:rPr>
+        <w:t>Enter password as Test@123</w:t>
+      </w:r>
+    </w:p>
+    <w:p>
+      <w:pPr>
+        <w:pStyle w:val="ListParagraph"/>
+        <w:numPr>
+          <w:ilvl w:val="1"/>
+          <w:numId w:val="3"/>
+        </w:numPr>
+        <w:rPr>
+          <w:sz w:val="24"/>
+          <w:szCs w:val="24"/>
+          <w:lang w:val="en-US"/>
+        </w:rPr>
+      </w:pPr>
+      <w:r>
+        <w:rPr>
+          <w:sz w:val="24"/>
+          <w:szCs w:val="24"/>
+          <w:lang w:val="en-US"/>
+        </w:rPr>
+        <w:t>Click on Login Button</w:t>
+      </w:r>
+    </w:p>
+    <w:p>
+      <w:pPr>
+        <w:pStyle w:val="ListParagraph"/>
+        <w:numPr>
+          <w:ilvl w:val="1"/>
+          <w:numId w:val="3"/>
+        </w:numPr>
+        <w:rPr>
+          <w:sz w:val="24"/>
+          <w:szCs w:val="24"/>
+          <w:lang w:val="en-US"/>
+        </w:rPr>
+      </w:pPr>
+      <w:r>
+        <w:rPr>
+          <w:sz w:val="24"/>
+          <w:szCs w:val="24"/>
+          <w:lang w:val="en-US"/>
+        </w:rPr>
+        <w:t>Display the error message.</w:t>
+      </w:r>
+      <w:r>
+        <w:rPr>
+          <w:sz w:val="24"/>
+          <w:szCs w:val="24"/>
+          <w:lang w:val="en-US"/>
+        </w:rPr>
+        <w:br/>
+      </w:r>
+      <w:r>
+        <w:rPr>
+          <w:b/>
+          <w:bCs/>
+          <w:sz w:val="24"/>
+          <w:szCs w:val="24"/>
+          <w:lang w:val="en-US"/>
+        </w:rPr>
+        <w:t xml:space="preserve">Use </w:t>
+      </w:r>
+      <w:r>
+        <w:rPr>
+          <w:b/>
+          <w:bCs/>
+          <w:sz w:val="24"/>
+          <w:szCs w:val="24"/>
+          <w:lang w:val="en-US"/>
+        </w:rPr>
+        <w:t>Relative</w:t>
+      </w:r>
+      <w:r>
+        <w:rPr>
+          <w:b/>
+          <w:bCs/>
+          <w:sz w:val="24"/>
+          <w:szCs w:val="24"/>
+          <w:lang w:val="en-US"/>
+        </w:rPr>
+        <w:t xml:space="preserve"> XPath</w:t>
+      </w:r>
+    </w:p>
+    <w:p>
+      <w:pPr>
+        <w:pStyle w:val="ListParagraph"/>
+        <w:numPr>
+          <w:ilvl w:val="0"/>
+          <w:numId w:val="3"/>
+        </w:numPr>
+        <w:rPr>
+          <w:sz w:val="24"/>
+          <w:szCs w:val="24"/>
+          <w:lang w:val="en-US"/>
+        </w:rPr>
+      </w:pPr>
+      <w:r>
+        <w:rPr>
+          <w:sz w:val="24"/>
+          <w:szCs w:val="24"/>
+          <w:lang w:val="en-US"/>
+        </w:rPr>
+        <w:t xml:space="preserve">Launch </w:t>
+      </w:r>
+      <w:hyperlink r:id="rId19" w:history="1">
+        <w:r>
+          <w:rPr>
+            <w:rStyle w:val="Hyperlink"/>
+            <w:sz w:val="24"/>
+            <w:szCs w:val="24"/>
+            <w:lang w:val="en-US"/>
+          </w:rPr>
+          <w:t>https://register.rediff.com/register/register.php?FormName=user_details</w:t>
+        </w:r>
+      </w:hyperlink>
+    </w:p>
+    <w:p>
+      <w:pPr>
+        <w:pStyle w:val="ListParagraph"/>
+        <w:numPr>
+          <w:ilvl w:val="1"/>
+          <w:numId w:val="3"/>
+        </w:numPr>
+        <w:rPr>
+          <w:sz w:val="24"/>
+          <w:szCs w:val="24"/>
+          <w:lang w:val="en-US"/>
+        </w:rPr>
+      </w:pPr>
+      <w:r>
+        <w:rPr>
+          <w:sz w:val="24"/>
+          <w:szCs w:val="24"/>
+          <w:lang w:val="en-US"/>
+        </w:rPr>
+        <w:t>Enter Full Name</w:t>
+      </w:r>
+    </w:p>
+    <w:p>
+      <w:pPr>
+        <w:pStyle w:val="ListParagraph"/>
+        <w:numPr>
+          <w:ilvl w:val="1"/>
+          <w:numId w:val="3"/>
+        </w:numPr>
+        <w:rPr>
+          <w:sz w:val="24"/>
+          <w:szCs w:val="24"/>
+          <w:lang w:val="en-US"/>
+        </w:rPr>
+      </w:pPr>
+      <w:r>
+        <w:rPr>
+          <w:sz w:val="24"/>
+          <w:szCs w:val="24"/>
+          <w:lang w:val="en-US"/>
+        </w:rPr>
+        <w:t>Enter Rediff Id</w:t>
+      </w:r>
+    </w:p>
+    <w:p>
+      <w:pPr>
+        <w:pStyle w:val="ListParagraph"/>
+        <w:numPr>
+          <w:ilvl w:val="1"/>
+          <w:numId w:val="3"/>
+        </w:numPr>
+        <w:rPr>
+          <w:sz w:val="24"/>
+          <w:szCs w:val="24"/>
+          <w:lang w:val="en-US"/>
+        </w:rPr>
+      </w:pPr>
+      <w:r>
+        <w:rPr>
+          <w:sz w:val="24"/>
+          <w:szCs w:val="24"/>
+          <w:lang w:val="en-US"/>
+        </w:rPr>
+        <w:t>Enter Password</w:t>
+      </w:r>
+    </w:p>
+    <w:p>
+      <w:pPr>
+        <w:pStyle w:val="ListParagraph"/>
+        <w:numPr>
+          <w:ilvl w:val="1"/>
+          <w:numId w:val="3"/>
+        </w:numPr>
+        <w:rPr>
+          <w:sz w:val="24"/>
+          <w:szCs w:val="24"/>
+          <w:lang w:val="en-US"/>
+        </w:rPr>
+      </w:pPr>
+      <w:r>
+        <w:rPr>
+          <w:sz w:val="24"/>
+          <w:szCs w:val="24"/>
+          <w:lang w:val="en-US"/>
+        </w:rPr>
+        <w:t>Enter Confirm Password</w:t>
+      </w:r>
+    </w:p>
+    <w:p>
+      <w:pPr>
+        <w:pStyle w:val="ListParagraph"/>
+        <w:numPr>
+          <w:ilvl w:val="1"/>
+          <w:numId w:val="3"/>
+        </w:numPr>
+        <w:rPr>
+          <w:sz w:val="24"/>
+          <w:szCs w:val="24"/>
+          <w:lang w:val="en-US"/>
+        </w:rPr>
+      </w:pPr>
+      <w:r>
+        <w:rPr>
+          <w:sz w:val="24"/>
+          <w:szCs w:val="24"/>
+          <w:lang w:val="en-US"/>
+        </w:rPr>
+        <w:t>Enter Recovery Email Id</w:t>
+      </w:r>
+    </w:p>
+    <w:p>
+      <w:pPr>
+        <w:pStyle w:val="ListParagraph"/>
+        <w:numPr>
+          <w:ilvl w:val="1"/>
+          <w:numId w:val="3"/>
+        </w:numPr>
+        <w:rPr>
+          <w:sz w:val="24"/>
+          <w:szCs w:val="24"/>
+          <w:lang w:val="en-US"/>
+        </w:rPr>
+      </w:pPr>
+      <w:r>
+        <w:rPr>
+          <w:sz w:val="24"/>
+          <w:szCs w:val="24"/>
+          <w:lang w:val="en-US"/>
+        </w:rPr>
+        <w:t>Enter Mobile No</w:t>
+      </w:r>
+      <w:r>
+        <w:rPr>
+          <w:sz w:val="24"/>
+          <w:szCs w:val="24"/>
+          <w:lang w:val="en-US"/>
+        </w:rPr>
+        <w:br/>
+      </w:r>
+      <w:r>
+        <w:rPr>
+          <w:b/>
+          <w:bCs/>
+          <w:sz w:val="24"/>
+          <w:szCs w:val="24"/>
+          <w:lang w:val="en-US"/>
+        </w:rPr>
+        <w:t xml:space="preserve">Use </w:t>
+      </w:r>
+      <w:r>
+        <w:rPr>
+          <w:b/>
+          <w:bCs/>
+          <w:sz w:val="24"/>
+          <w:szCs w:val="24"/>
+          <w:lang w:val="en-US"/>
+        </w:rPr>
+        <w:t>Relative</w:t>
+      </w:r>
+      <w:r>
+        <w:rPr>
+          <w:b/>
+          <w:bCs/>
+          <w:sz w:val="24"/>
+          <w:szCs w:val="24"/>
+          <w:lang w:val="en-US"/>
+        </w:rPr>
+        <w:t xml:space="preserve"> XPath</w:t>
+      </w:r>
+    </w:p>
+    <w:p>
+      <w:pPr>
+        <w:pStyle w:val="ListParagraph"/>
+        <w:numPr>
+          <w:ilvl w:val="0"/>
+          <w:numId w:val="3"/>
+        </w:numPr>
+        <w:rPr>
+          <w:sz w:val="24"/>
+          <w:szCs w:val="24"/>
+          <w:lang w:val="en-US"/>
+        </w:rPr>
+      </w:pPr>
+      <w:r>
+        <w:rPr>
+          <w:sz w:val="24"/>
+          <w:szCs w:val="24"/>
+          <w:lang w:val="en-US"/>
+        </w:rPr>
+        <w:t xml:space="preserve">Open </w:t>
+      </w:r>
+      <w:hyperlink r:id="rId20" w:history="1">
+        <w:r>
+          <w:rPr>
+            <w:rStyle w:val="Hyperlink"/>
+            <w:sz w:val="24"/>
+            <w:szCs w:val="24"/>
+            <w:lang w:val="en-US"/>
+          </w:rPr>
+          <w:t>https://echoecho.com/htmlforms09.htm</w:t>
+        </w:r>
+      </w:hyperlink>
+    </w:p>
+    <w:p>
+      <w:pPr>
+        <w:pStyle w:val="ListParagraph"/>
+        <w:numPr>
+          <w:ilvl w:val="1"/>
+          <w:numId w:val="3"/>
+        </w:numPr>
+        <w:rPr>
+          <w:sz w:val="24"/>
+          <w:szCs w:val="24"/>
+          <w:lang w:val="en-US"/>
+        </w:rPr>
+      </w:pPr>
+      <w:r>
+        <w:rPr>
+          <w:sz w:val="24"/>
+          <w:szCs w:val="24"/>
+          <w:lang w:val="en-US"/>
+        </w:rPr>
+        <w:t>Display the status of all 3 checkboxes (Milk, butter and Cheese)</w:t>
+      </w:r>
+    </w:p>
+    <w:p>
+      <w:pPr>
+        <w:pStyle w:val="ListParagraph"/>
+        <w:numPr>
+          <w:ilvl w:val="1"/>
+          <w:numId w:val="3"/>
+        </w:numPr>
+        <w:rPr>
+          <w:sz w:val="24"/>
+          <w:szCs w:val="24"/>
+          <w:lang w:val="en-US"/>
+        </w:rPr>
+      </w:pPr>
+      <w:r>
+        <w:rPr>
+          <w:sz w:val="24"/>
+          <w:szCs w:val="24"/>
+          <w:lang w:val="en-US"/>
+        </w:rPr>
+        <w:t>Only select those checkboxes those are not selected</w:t>
+      </w:r>
+    </w:p>
+    <w:p>
+      <w:pPr>
+        <w:pStyle w:val="ListParagraph"/>
+        <w:numPr>
+          <w:ilvl w:val="1"/>
+          <w:numId w:val="3"/>
+        </w:numPr>
+        <w:rPr>
+          <w:sz w:val="24"/>
+          <w:szCs w:val="24"/>
+          <w:lang w:val="en-US"/>
+        </w:rPr>
+      </w:pPr>
+      <w:r>
+        <w:rPr>
+          <w:sz w:val="24"/>
+          <w:szCs w:val="24"/>
+          <w:lang w:val="en-US"/>
+        </w:rPr>
+        <w:t>Display the status.</w:t>
+      </w:r>
+    </w:p>
+    <w:p>
+      <w:pPr>
+        <w:pStyle w:val="ListParagraph"/>
+        <w:numPr>
+          <w:ilvl w:val="0"/>
+          <w:numId w:val="3"/>
+        </w:numPr>
+        <w:rPr>
+          <w:sz w:val="24"/>
+          <w:szCs w:val="24"/>
+          <w:lang w:val="en-US"/>
+        </w:rPr>
+      </w:pPr>
+      <w:r>
+        <w:rPr>
+          <w:sz w:val="24"/>
+          <w:szCs w:val="24"/>
+          <w:lang w:val="en-US"/>
+        </w:rPr>
+        <w:t xml:space="preserve">Open </w:t>
+      </w:r>
+      <w:hyperlink r:id="rId21" w:history="1">
+        <w:r>
+          <w:rPr>
+            <w:rStyle w:val="Hyperlink"/>
+            <w:sz w:val="24"/>
+            <w:szCs w:val="24"/>
+            <w:lang w:val="en-US"/>
+          </w:rPr>
+          <w:t>https://echoecho.com/ht</w:t>
+        </w:r>
+        <w:r>
+          <w:rPr>
+            <w:rStyle w:val="Hyperlink"/>
+            <w:sz w:val="24"/>
+            <w:szCs w:val="24"/>
+            <w:lang w:val="en-US"/>
+          </w:rPr>
+          <w:t>m</w:t>
+        </w:r>
+        <w:r>
+          <w:rPr>
+            <w:rStyle w:val="Hyperlink"/>
+            <w:sz w:val="24"/>
+            <w:szCs w:val="24"/>
+            <w:lang w:val="en-US"/>
+          </w:rPr>
+          <w:t>lforms10.htm</w:t>
+        </w:r>
+      </w:hyperlink>
+    </w:p>
+    <w:p>
+      <w:pPr>
+        <w:pStyle w:val="ListParagraph"/>
+        <w:numPr>
+          <w:ilvl w:val="1"/>
+          <w:numId w:val="3"/>
+        </w:numPr>
+        <w:rPr>
+          <w:sz w:val="24"/>
+          <w:szCs w:val="24"/>
+          <w:lang w:val="en-US"/>
+        </w:rPr>
+      </w:pPr>
+      <w:r>
+        <w:rPr>
+          <w:sz w:val="24"/>
+          <w:szCs w:val="24"/>
+          <w:lang w:val="en-US"/>
+        </w:rPr>
+        <w:t>Display the status of each radio button</w:t>
+      </w:r>
+    </w:p>
+    <w:p>
+      <w:pPr>
+        <w:pStyle w:val="ListParagraph"/>
+        <w:numPr>
+          <w:ilvl w:val="1"/>
+          <w:numId w:val="3"/>
+        </w:numPr>
+        <w:rPr>
+          <w:sz w:val="24"/>
+          <w:szCs w:val="24"/>
+          <w:lang w:val="en-US"/>
+        </w:rPr>
+      </w:pPr>
+      <w:r>
+        <w:rPr>
+          <w:sz w:val="24"/>
+          <w:szCs w:val="24"/>
+          <w:lang w:val="en-US"/>
+        </w:rPr>
+        <w:t>Click on each radio button</w:t>
+      </w:r>
+    </w:p>
+    <w:p>
+      <w:pPr>
+        <w:pStyle w:val="ListParagraph"/>
+        <w:numPr>
+          <w:ilvl w:val="1"/>
+          <w:numId w:val="3"/>
+        </w:numPr>
+        <w:rPr>
+          <w:sz w:val="24"/>
+          <w:szCs w:val="24"/>
+          <w:lang w:val="en-US"/>
+        </w:rPr>
+      </w:pPr>
+      <w:r>
+        <w:rPr>
+          <w:sz w:val="24"/>
+          <w:szCs w:val="24"/>
+          <w:lang w:val="en-US"/>
+        </w:rPr>
+        <w:t>Display the status of each radio button.</w:t>
+      </w:r>
+    </w:p>
+    <w:p>
+      <w:pPr>
+        <w:pStyle w:val="ListParagraph"/>
+        <w:numPr>
+          <w:ilvl w:val="0"/>
+          <w:numId w:val="3"/>
+        </w:numPr>
+        <w:rPr>
+          <w:sz w:val="24"/>
+          <w:szCs w:val="24"/>
+          <w:lang w:val="en-US"/>
+        </w:rPr>
+      </w:pPr>
+      <w:bookmarkStart w:id="0" w:name="_GoBack"/>
+      <w:bookmarkEnd w:id="0"/>
     </w:p>
     <w:sectPr>
       <w:pgSz w:w="11906" w:h="16838"/>
@@ -2877,6 +3852,18 @@
       <w:u w:val="single"/>
     </w:rPr>
   </w:style>
+  <w:style w:type="character" w:styleId="FollowedHyperlink">
+    <w:name w:val="FollowedHyperlink"/>
+    <w:basedOn w:val="DefaultParagraphFont"/>
+    <w:uiPriority w:val="99"/>
+    <w:semiHidden/>
+    <w:unhideWhenUsed/>
+    <w:rsid w:val="00170668"/>
+    <w:rPr>
+      <w:color w:val="954F72" w:themeColor="followedHyperlink"/>
+      <w:u w:val="single"/>
+    </w:rPr>
+  </w:style>
 </w:styles>
 </file>
 

</xml_diff>

<commit_message>
Date: 16 Oct 2025
</commit_message>
<xml_diff>
--- a/Assignments.docx
+++ b/Assignments.docx
@@ -2406,17 +2406,7 @@
           <w:szCs w:val="24"/>
           <w:lang w:val="en-US"/>
         </w:rPr>
-        <w:t>Relative</w:t>
-      </w:r>
-      <w:r>
-        <w:rPr>
-          <w:b/>
-          <w:bCs/>
-          <w:sz w:val="24"/>
-          <w:szCs w:val="24"/>
-          <w:lang w:val="en-US"/>
-        </w:rPr>
-        <w:t xml:space="preserve"> XPath </w:t>
+        <w:t xml:space="preserve">Relative XPath </w:t>
       </w:r>
     </w:p>
     <w:p>
@@ -2566,27 +2556,7 @@
           <w:szCs w:val="24"/>
           <w:lang w:val="en-US"/>
         </w:rPr>
-        <w:t xml:space="preserve">Use </w:t>
-      </w:r>
-      <w:r>
-        <w:rPr>
-          <w:b/>
-          <w:bCs/>
-          <w:sz w:val="24"/>
-          <w:szCs w:val="24"/>
-          <w:lang w:val="en-US"/>
-        </w:rPr>
-        <w:t>Relative</w:t>
-      </w:r>
-      <w:r>
-        <w:rPr>
-          <w:b/>
-          <w:bCs/>
-          <w:sz w:val="24"/>
-          <w:szCs w:val="24"/>
-          <w:lang w:val="en-US"/>
-        </w:rPr>
-        <w:t xml:space="preserve"> XPath</w:t>
+        <w:t>Use Relative XPath</w:t>
       </w:r>
     </w:p>
     <w:p>
@@ -2769,27 +2739,7 @@
           <w:szCs w:val="24"/>
           <w:lang w:val="en-US"/>
         </w:rPr>
-        <w:t xml:space="preserve">Use </w:t>
-      </w:r>
-      <w:r>
-        <w:rPr>
-          <w:b/>
-          <w:bCs/>
-          <w:sz w:val="24"/>
-          <w:szCs w:val="24"/>
-          <w:lang w:val="en-US"/>
-        </w:rPr>
-        <w:t>Relative</w:t>
-      </w:r>
-      <w:r>
-        <w:rPr>
-          <w:b/>
-          <w:bCs/>
-          <w:sz w:val="24"/>
-          <w:szCs w:val="24"/>
-          <w:lang w:val="en-US"/>
-        </w:rPr>
-        <w:t xml:space="preserve"> XPath</w:t>
+        <w:t>Use Relative XPath</w:t>
       </w:r>
     </w:p>
     <w:p>
@@ -2920,8 +2870,98 @@
             <w:szCs w:val="24"/>
             <w:lang w:val="en-US"/>
           </w:rPr>
-          <w:t>https://echoecho.com/ht</w:t>
+          <w:t>https://echoecho.com/htmlforms10.htm</w:t>
         </w:r>
+      </w:hyperlink>
+    </w:p>
+    <w:p>
+      <w:pPr>
+        <w:pStyle w:val="ListParagraph"/>
+        <w:numPr>
+          <w:ilvl w:val="1"/>
+          <w:numId w:val="3"/>
+        </w:numPr>
+        <w:rPr>
+          <w:sz w:val="24"/>
+          <w:szCs w:val="24"/>
+          <w:lang w:val="en-US"/>
+        </w:rPr>
+      </w:pPr>
+      <w:r>
+        <w:rPr>
+          <w:sz w:val="24"/>
+          <w:szCs w:val="24"/>
+          <w:lang w:val="en-US"/>
+        </w:rPr>
+        <w:t>Display the status of each radio button</w:t>
+      </w:r>
+    </w:p>
+    <w:p>
+      <w:pPr>
+        <w:pStyle w:val="ListParagraph"/>
+        <w:numPr>
+          <w:ilvl w:val="1"/>
+          <w:numId w:val="3"/>
+        </w:numPr>
+        <w:rPr>
+          <w:sz w:val="24"/>
+          <w:szCs w:val="24"/>
+          <w:lang w:val="en-US"/>
+        </w:rPr>
+      </w:pPr>
+      <w:r>
+        <w:rPr>
+          <w:sz w:val="24"/>
+          <w:szCs w:val="24"/>
+          <w:lang w:val="en-US"/>
+        </w:rPr>
+        <w:t>Click on each radio button</w:t>
+      </w:r>
+    </w:p>
+    <w:p>
+      <w:pPr>
+        <w:pStyle w:val="ListParagraph"/>
+        <w:numPr>
+          <w:ilvl w:val="1"/>
+          <w:numId w:val="3"/>
+        </w:numPr>
+        <w:rPr>
+          <w:sz w:val="24"/>
+          <w:szCs w:val="24"/>
+          <w:lang w:val="en-US"/>
+        </w:rPr>
+      </w:pPr>
+      <w:r>
+        <w:rPr>
+          <w:sz w:val="24"/>
+          <w:szCs w:val="24"/>
+          <w:lang w:val="en-US"/>
+        </w:rPr>
+        <w:t>Display the status of each radio button.</w:t>
+      </w:r>
+    </w:p>
+    <w:p>
+      <w:pPr>
+        <w:pStyle w:val="ListParagraph"/>
+        <w:numPr>
+          <w:ilvl w:val="0"/>
+          <w:numId w:val="3"/>
+        </w:numPr>
+        <w:rPr>
+          <w:sz w:val="24"/>
+          <w:szCs w:val="24"/>
+          <w:lang w:val="en-US"/>
+        </w:rPr>
+      </w:pPr>
+      <w:r>
+        <w:rPr>
+          <w:sz w:val="24"/>
+          <w:szCs w:val="24"/>
+          <w:lang w:val="en-US"/>
+        </w:rPr>
+        <w:t xml:space="preserve">Open </w:t>
+      </w:r>
+      <w:hyperlink r:id="rId22" w:history="1">
         <w:r>
           <w:rPr>
             <w:rStyle w:val="Hyperlink"/>
@@ -2929,8 +2969,85 @@
             <w:szCs w:val="24"/>
             <w:lang w:val="en-US"/>
           </w:rPr>
-          <w:t>m</w:t>
+          <w:t>https://register.rediff.com/register/register.php?FormName=user_details</w:t>
         </w:r>
+      </w:hyperlink>
+    </w:p>
+    <w:p>
+      <w:pPr>
+        <w:pStyle w:val="ListParagraph"/>
+        <w:numPr>
+          <w:ilvl w:val="1"/>
+          <w:numId w:val="3"/>
+        </w:numPr>
+        <w:rPr>
+          <w:sz w:val="24"/>
+          <w:szCs w:val="24"/>
+          <w:lang w:val="en-US"/>
+        </w:rPr>
+      </w:pPr>
+      <w:r>
+        <w:rPr>
+          <w:sz w:val="24"/>
+          <w:szCs w:val="24"/>
+          <w:lang w:val="en-US"/>
+        </w:rPr>
+        <w:t>Select your birth date</w:t>
+      </w:r>
+    </w:p>
+    <w:p>
+      <w:pPr>
+        <w:pStyle w:val="ListParagraph"/>
+        <w:numPr>
+          <w:ilvl w:val="1"/>
+          <w:numId w:val="3"/>
+        </w:numPr>
+        <w:rPr>
+          <w:sz w:val="24"/>
+          <w:szCs w:val="24"/>
+          <w:lang w:val="en-US"/>
+        </w:rPr>
+      </w:pPr>
+      <w:r>
+        <w:rPr>
+          <w:sz w:val="24"/>
+          <w:szCs w:val="24"/>
+          <w:lang w:val="en-US"/>
+        </w:rPr>
+        <w:t>Display your birth date in following format</w:t>
+      </w:r>
+      <w:r>
+        <w:rPr>
+          <w:sz w:val="24"/>
+          <w:szCs w:val="24"/>
+          <w:lang w:val="en-US"/>
+        </w:rPr>
+        <w:br/>
+        <w:t>My Birth Date is: 29 JAN 1979</w:t>
+      </w:r>
+    </w:p>
+    <w:p>
+      <w:pPr>
+        <w:pStyle w:val="ListParagraph"/>
+        <w:numPr>
+          <w:ilvl w:val="0"/>
+          <w:numId w:val="3"/>
+        </w:numPr>
+        <w:rPr>
+          <w:sz w:val="24"/>
+          <w:szCs w:val="24"/>
+          <w:lang w:val="en-US"/>
+        </w:rPr>
+      </w:pPr>
+      <w:r>
+        <w:rPr>
+          <w:sz w:val="24"/>
+          <w:szCs w:val="24"/>
+          <w:lang w:val="en-US"/>
+        </w:rPr>
+        <w:t xml:space="preserve">Launch </w:t>
+      </w:r>
+      <w:hyperlink r:id="rId23" w:history="1">
         <w:r>
           <w:rPr>
             <w:rStyle w:val="Hyperlink"/>
@@ -2938,7 +3055,7 @@
             <w:szCs w:val="24"/>
             <w:lang w:val="en-US"/>
           </w:rPr>
-          <w:t>lforms10.htm</w:t>
+          <w:t>https://omayo.blogspot.com/</w:t>
         </w:r>
       </w:hyperlink>
     </w:p>
@@ -2961,51 +3078,566 @@
           <w:szCs w:val="24"/>
           <w:lang w:val="en-US"/>
         </w:rPr>
-        <w:t>Display the status of each radio button</w:t>
-      </w:r>
-    </w:p>
-    <w:p>
-      <w:pPr>
-        <w:pStyle w:val="ListParagraph"/>
-        <w:numPr>
-          <w:ilvl w:val="1"/>
-          <w:numId w:val="3"/>
-        </w:numPr>
-        <w:rPr>
-          <w:sz w:val="24"/>
-          <w:szCs w:val="24"/>
-          <w:lang w:val="en-US"/>
-        </w:rPr>
-      </w:pPr>
-      <w:r>
-        <w:rPr>
-          <w:sz w:val="24"/>
-          <w:szCs w:val="24"/>
-          <w:lang w:val="en-US"/>
-        </w:rPr>
-        <w:t>Click on each radio button</w:t>
-      </w:r>
-    </w:p>
-    <w:p>
-      <w:pPr>
-        <w:pStyle w:val="ListParagraph"/>
-        <w:numPr>
-          <w:ilvl w:val="1"/>
-          <w:numId w:val="3"/>
-        </w:numPr>
-        <w:rPr>
-          <w:sz w:val="24"/>
-          <w:szCs w:val="24"/>
-          <w:lang w:val="en-US"/>
-        </w:rPr>
-      </w:pPr>
-      <w:r>
-        <w:rPr>
-          <w:sz w:val="24"/>
-          <w:szCs w:val="24"/>
-          <w:lang w:val="en-US"/>
-        </w:rPr>
-        <w:t>Display the status of each radio button.</w:t>
+        <w:t>Select doc2 from Older newsletter dropdown list</w:t>
+      </w:r>
+    </w:p>
+    <w:p>
+      <w:pPr>
+        <w:pStyle w:val="ListParagraph"/>
+        <w:numPr>
+          <w:ilvl w:val="1"/>
+          <w:numId w:val="3"/>
+        </w:numPr>
+        <w:rPr>
+          <w:sz w:val="24"/>
+          <w:szCs w:val="24"/>
+          <w:lang w:val="en-US"/>
+        </w:rPr>
+      </w:pPr>
+      <w:r>
+        <w:rPr>
+          <w:sz w:val="24"/>
+          <w:szCs w:val="24"/>
+          <w:lang w:val="en-US"/>
+        </w:rPr>
+        <w:t>Display the selected option</w:t>
+      </w:r>
+    </w:p>
+    <w:p>
+      <w:pPr>
+        <w:pStyle w:val="ListParagraph"/>
+        <w:numPr>
+          <w:ilvl w:val="0"/>
+          <w:numId w:val="3"/>
+        </w:numPr>
+        <w:rPr>
+          <w:sz w:val="24"/>
+          <w:szCs w:val="24"/>
+          <w:lang w:val="en-US"/>
+        </w:rPr>
+      </w:pPr>
+      <w:r>
+        <w:rPr>
+          <w:sz w:val="24"/>
+          <w:szCs w:val="24"/>
+          <w:lang w:val="en-US"/>
+        </w:rPr>
+        <w:t xml:space="preserve">Launch </w:t>
+      </w:r>
+      <w:hyperlink r:id="rId24" w:history="1">
+        <w:r>
+          <w:rPr>
+            <w:rStyle w:val="Hyperlink"/>
+            <w:sz w:val="24"/>
+            <w:szCs w:val="24"/>
+            <w:lang w:val="en-US"/>
+          </w:rPr>
+          <w:t>https://testautomationpractice.blogspot.com/?m=1</w:t>
+        </w:r>
+      </w:hyperlink>
+    </w:p>
+    <w:p>
+      <w:pPr>
+        <w:pStyle w:val="ListParagraph"/>
+        <w:numPr>
+          <w:ilvl w:val="1"/>
+          <w:numId w:val="3"/>
+        </w:numPr>
+        <w:rPr>
+          <w:sz w:val="24"/>
+          <w:szCs w:val="24"/>
+          <w:lang w:val="en-US"/>
+        </w:rPr>
+      </w:pPr>
+      <w:r>
+        <w:rPr>
+          <w:sz w:val="24"/>
+          <w:szCs w:val="24"/>
+          <w:lang w:val="en-US"/>
+        </w:rPr>
+        <w:lastRenderedPageBreak/>
+        <w:t>Enter Name</w:t>
+      </w:r>
+    </w:p>
+    <w:p>
+      <w:pPr>
+        <w:pStyle w:val="ListParagraph"/>
+        <w:numPr>
+          <w:ilvl w:val="1"/>
+          <w:numId w:val="3"/>
+        </w:numPr>
+        <w:rPr>
+          <w:sz w:val="24"/>
+          <w:szCs w:val="24"/>
+          <w:lang w:val="en-US"/>
+        </w:rPr>
+      </w:pPr>
+      <w:r>
+        <w:rPr>
+          <w:sz w:val="24"/>
+          <w:szCs w:val="24"/>
+          <w:lang w:val="en-US"/>
+        </w:rPr>
+        <w:t>Enter Email</w:t>
+      </w:r>
+    </w:p>
+    <w:p>
+      <w:pPr>
+        <w:pStyle w:val="ListParagraph"/>
+        <w:numPr>
+          <w:ilvl w:val="1"/>
+          <w:numId w:val="3"/>
+        </w:numPr>
+        <w:rPr>
+          <w:sz w:val="24"/>
+          <w:szCs w:val="24"/>
+          <w:lang w:val="en-US"/>
+        </w:rPr>
+      </w:pPr>
+      <w:r>
+        <w:rPr>
+          <w:sz w:val="24"/>
+          <w:szCs w:val="24"/>
+          <w:lang w:val="en-US"/>
+        </w:rPr>
+        <w:t>Enter Phone no</w:t>
+      </w:r>
+    </w:p>
+    <w:p>
+      <w:pPr>
+        <w:pStyle w:val="ListParagraph"/>
+        <w:numPr>
+          <w:ilvl w:val="1"/>
+          <w:numId w:val="3"/>
+        </w:numPr>
+        <w:rPr>
+          <w:sz w:val="24"/>
+          <w:szCs w:val="24"/>
+          <w:lang w:val="en-US"/>
+        </w:rPr>
+      </w:pPr>
+      <w:r>
+        <w:rPr>
+          <w:sz w:val="24"/>
+          <w:szCs w:val="24"/>
+          <w:lang w:val="en-US"/>
+        </w:rPr>
+        <w:t>Enter Address</w:t>
+      </w:r>
+    </w:p>
+    <w:p>
+      <w:pPr>
+        <w:pStyle w:val="ListParagraph"/>
+        <w:numPr>
+          <w:ilvl w:val="1"/>
+          <w:numId w:val="3"/>
+        </w:numPr>
+        <w:rPr>
+          <w:sz w:val="24"/>
+          <w:szCs w:val="24"/>
+          <w:lang w:val="en-US"/>
+        </w:rPr>
+      </w:pPr>
+      <w:r>
+        <w:rPr>
+          <w:sz w:val="24"/>
+          <w:szCs w:val="24"/>
+          <w:lang w:val="en-US"/>
+        </w:rPr>
+        <w:t>Select Gender</w:t>
+      </w:r>
+    </w:p>
+    <w:p>
+      <w:pPr>
+        <w:pStyle w:val="ListParagraph"/>
+        <w:numPr>
+          <w:ilvl w:val="1"/>
+          <w:numId w:val="3"/>
+        </w:numPr>
+        <w:rPr>
+          <w:sz w:val="24"/>
+          <w:szCs w:val="24"/>
+          <w:lang w:val="en-US"/>
+        </w:rPr>
+      </w:pPr>
+      <w:r>
+        <w:rPr>
+          <w:sz w:val="24"/>
+          <w:szCs w:val="24"/>
+          <w:lang w:val="en-US"/>
+        </w:rPr>
+        <w:t>Select the day on your birthdate</w:t>
+      </w:r>
+    </w:p>
+    <w:p>
+      <w:pPr>
+        <w:pStyle w:val="ListParagraph"/>
+        <w:numPr>
+          <w:ilvl w:val="1"/>
+          <w:numId w:val="3"/>
+        </w:numPr>
+        <w:rPr>
+          <w:sz w:val="24"/>
+          <w:szCs w:val="24"/>
+          <w:lang w:val="en-US"/>
+        </w:rPr>
+      </w:pPr>
+      <w:r>
+        <w:rPr>
+          <w:sz w:val="24"/>
+          <w:szCs w:val="24"/>
+          <w:lang w:val="en-US"/>
+        </w:rPr>
+        <w:t>Select your desired country</w:t>
+      </w:r>
+    </w:p>
+    <w:p>
+      <w:pPr>
+        <w:pStyle w:val="ListParagraph"/>
+        <w:numPr>
+          <w:ilvl w:val="1"/>
+          <w:numId w:val="3"/>
+        </w:numPr>
+        <w:rPr>
+          <w:sz w:val="24"/>
+          <w:szCs w:val="24"/>
+          <w:lang w:val="en-US"/>
+        </w:rPr>
+      </w:pPr>
+      <w:r>
+        <w:rPr>
+          <w:sz w:val="24"/>
+          <w:szCs w:val="24"/>
+          <w:lang w:val="en-US"/>
+        </w:rPr>
+        <w:t>Select any two / three color with your choice</w:t>
+      </w:r>
+    </w:p>
+    <w:p>
+      <w:pPr>
+        <w:pStyle w:val="ListParagraph"/>
+        <w:numPr>
+          <w:ilvl w:val="1"/>
+          <w:numId w:val="3"/>
+        </w:numPr>
+        <w:rPr>
+          <w:sz w:val="24"/>
+          <w:szCs w:val="24"/>
+          <w:lang w:val="en-US"/>
+        </w:rPr>
+      </w:pPr>
+      <w:r>
+        <w:rPr>
+          <w:sz w:val="24"/>
+          <w:szCs w:val="24"/>
+          <w:lang w:val="en-US"/>
+        </w:rPr>
+        <w:t>Select any two / three animals</w:t>
+      </w:r>
+    </w:p>
+    <w:p>
+      <w:pPr>
+        <w:pStyle w:val="ListParagraph"/>
+        <w:numPr>
+          <w:ilvl w:val="0"/>
+          <w:numId w:val="3"/>
+        </w:numPr>
+        <w:rPr>
+          <w:sz w:val="24"/>
+          <w:szCs w:val="24"/>
+          <w:lang w:val="en-US"/>
+        </w:rPr>
+      </w:pPr>
+      <w:r>
+        <w:rPr>
+          <w:sz w:val="24"/>
+          <w:szCs w:val="24"/>
+          <w:lang w:val="en-US"/>
+        </w:rPr>
+        <w:t xml:space="preserve">Open </w:t>
+      </w:r>
+      <w:hyperlink r:id="rId25" w:history="1">
+        <w:r>
+          <w:rPr>
+            <w:rStyle w:val="Hyperlink"/>
+            <w:sz w:val="24"/>
+            <w:szCs w:val="24"/>
+            <w:lang w:val="en-US"/>
+          </w:rPr>
+          <w:t>https://www.redbus.in/</w:t>
+        </w:r>
+      </w:hyperlink>
+    </w:p>
+    <w:p>
+      <w:pPr>
+        <w:pStyle w:val="ListParagraph"/>
+        <w:numPr>
+          <w:ilvl w:val="1"/>
+          <w:numId w:val="3"/>
+        </w:numPr>
+        <w:rPr>
+          <w:sz w:val="24"/>
+          <w:szCs w:val="24"/>
+          <w:lang w:val="en-US"/>
+        </w:rPr>
+      </w:pPr>
+      <w:r>
+        <w:rPr>
+          <w:sz w:val="24"/>
+          <w:szCs w:val="24"/>
+          <w:lang w:val="en-US"/>
+        </w:rPr>
+        <w:t xml:space="preserve">Click on From </w:t>
+      </w:r>
+    </w:p>
+    <w:p>
+      <w:pPr>
+        <w:pStyle w:val="ListParagraph"/>
+        <w:numPr>
+          <w:ilvl w:val="1"/>
+          <w:numId w:val="3"/>
+        </w:numPr>
+        <w:rPr>
+          <w:sz w:val="24"/>
+          <w:szCs w:val="24"/>
+          <w:lang w:val="en-US"/>
+        </w:rPr>
+      </w:pPr>
+      <w:r>
+        <w:rPr>
+          <w:sz w:val="24"/>
+          <w:szCs w:val="24"/>
+          <w:lang w:val="en-US"/>
+        </w:rPr>
+        <w:t xml:space="preserve">Enter first 4 characters from your city (Kolhapur – </w:t>
+      </w:r>
+      <w:proofErr w:type="spellStart"/>
+      <w:r>
+        <w:rPr>
+          <w:sz w:val="24"/>
+          <w:szCs w:val="24"/>
+          <w:lang w:val="en-US"/>
+        </w:rPr>
+        <w:t>kolh</w:t>
+      </w:r>
+      <w:proofErr w:type="spellEnd"/>
+      <w:r>
+        <w:rPr>
+          <w:sz w:val="24"/>
+          <w:szCs w:val="24"/>
+          <w:lang w:val="en-US"/>
+        </w:rPr>
+        <w:t>)</w:t>
+      </w:r>
+    </w:p>
+    <w:p>
+      <w:pPr>
+        <w:pStyle w:val="ListParagraph"/>
+        <w:numPr>
+          <w:ilvl w:val="1"/>
+          <w:numId w:val="3"/>
+        </w:numPr>
+        <w:rPr>
+          <w:sz w:val="24"/>
+          <w:szCs w:val="24"/>
+          <w:lang w:val="en-US"/>
+        </w:rPr>
+      </w:pPr>
+      <w:r>
+        <w:rPr>
+          <w:sz w:val="24"/>
+          <w:szCs w:val="24"/>
+          <w:lang w:val="en-US"/>
+        </w:rPr>
+        <w:t>Click on the 1</w:t>
+      </w:r>
+      <w:r>
+        <w:rPr>
+          <w:sz w:val="24"/>
+          <w:szCs w:val="24"/>
+          <w:vertAlign w:val="superscript"/>
+          <w:lang w:val="en-US"/>
+        </w:rPr>
+        <w:t>st</w:t>
+      </w:r>
+      <w:r>
+        <w:rPr>
+          <w:sz w:val="24"/>
+          <w:szCs w:val="24"/>
+          <w:lang w:val="en-US"/>
+        </w:rPr>
+        <w:t xml:space="preserve"> option (City)</w:t>
+      </w:r>
+    </w:p>
+    <w:p>
+      <w:pPr>
+        <w:pStyle w:val="ListParagraph"/>
+        <w:numPr>
+          <w:ilvl w:val="1"/>
+          <w:numId w:val="3"/>
+        </w:numPr>
+        <w:rPr>
+          <w:sz w:val="24"/>
+          <w:szCs w:val="24"/>
+          <w:lang w:val="en-US"/>
+        </w:rPr>
+      </w:pPr>
+      <w:r>
+        <w:rPr>
+          <w:sz w:val="24"/>
+          <w:szCs w:val="24"/>
+          <w:lang w:val="en-US"/>
+        </w:rPr>
+        <w:t>Click on To</w:t>
+      </w:r>
+    </w:p>
+    <w:p>
+      <w:pPr>
+        <w:pStyle w:val="ListParagraph"/>
+        <w:numPr>
+          <w:ilvl w:val="1"/>
+          <w:numId w:val="3"/>
+        </w:numPr>
+        <w:rPr>
+          <w:sz w:val="24"/>
+          <w:szCs w:val="24"/>
+          <w:lang w:val="en-US"/>
+        </w:rPr>
+      </w:pPr>
+      <w:r>
+        <w:rPr>
+          <w:sz w:val="24"/>
+          <w:szCs w:val="24"/>
+          <w:lang w:val="en-US"/>
+        </w:rPr>
+        <w:t>Enter Bang (Bangalore)</w:t>
+      </w:r>
+    </w:p>
+    <w:p>
+      <w:pPr>
+        <w:pStyle w:val="ListParagraph"/>
+        <w:numPr>
+          <w:ilvl w:val="1"/>
+          <w:numId w:val="3"/>
+        </w:numPr>
+        <w:rPr>
+          <w:sz w:val="24"/>
+          <w:szCs w:val="24"/>
+          <w:lang w:val="en-US"/>
+        </w:rPr>
+      </w:pPr>
+      <w:r>
+        <w:rPr>
+          <w:sz w:val="24"/>
+          <w:szCs w:val="24"/>
+          <w:lang w:val="en-US"/>
+        </w:rPr>
+        <w:t>Click on Bangalore from the list</w:t>
+      </w:r>
+    </w:p>
+    <w:p>
+      <w:pPr>
+        <w:pStyle w:val="ListParagraph"/>
+        <w:numPr>
+          <w:ilvl w:val="1"/>
+          <w:numId w:val="3"/>
+        </w:numPr>
+        <w:rPr>
+          <w:sz w:val="24"/>
+          <w:szCs w:val="24"/>
+          <w:lang w:val="en-US"/>
+        </w:rPr>
+      </w:pPr>
+      <w:r>
+        <w:rPr>
+          <w:sz w:val="24"/>
+          <w:szCs w:val="24"/>
+          <w:lang w:val="en-US"/>
+        </w:rPr>
+        <w:t>Click on Calendar icon</w:t>
+      </w:r>
+    </w:p>
+    <w:p>
+      <w:pPr>
+        <w:pStyle w:val="ListParagraph"/>
+        <w:numPr>
+          <w:ilvl w:val="1"/>
+          <w:numId w:val="3"/>
+        </w:numPr>
+        <w:rPr>
+          <w:sz w:val="24"/>
+          <w:szCs w:val="24"/>
+          <w:lang w:val="en-US"/>
+        </w:rPr>
+      </w:pPr>
+      <w:r>
+        <w:rPr>
+          <w:sz w:val="24"/>
+          <w:szCs w:val="24"/>
+          <w:lang w:val="en-US"/>
+        </w:rPr>
+        <w:t>Click on 31</w:t>
+      </w:r>
+    </w:p>
+    <w:p>
+      <w:pPr>
+        <w:pStyle w:val="ListParagraph"/>
+        <w:numPr>
+          <w:ilvl w:val="1"/>
+          <w:numId w:val="3"/>
+        </w:numPr>
+        <w:rPr>
+          <w:sz w:val="24"/>
+          <w:szCs w:val="24"/>
+          <w:lang w:val="en-US"/>
+        </w:rPr>
+      </w:pPr>
+      <w:r>
+        <w:rPr>
+          <w:sz w:val="24"/>
+          <w:szCs w:val="24"/>
+          <w:lang w:val="en-US"/>
+        </w:rPr>
+        <w:t>Click on Search buses button</w:t>
+      </w:r>
+    </w:p>
+    <w:p>
+      <w:pPr>
+        <w:pStyle w:val="ListParagraph"/>
+        <w:numPr>
+          <w:ilvl w:val="1"/>
+          <w:numId w:val="3"/>
+        </w:numPr>
+        <w:rPr>
+          <w:sz w:val="24"/>
+          <w:szCs w:val="24"/>
+          <w:lang w:val="en-US"/>
+        </w:rPr>
+      </w:pPr>
+      <w:r>
+        <w:rPr>
+          <w:sz w:val="24"/>
+          <w:szCs w:val="24"/>
+          <w:lang w:val="en-US"/>
+        </w:rPr>
+        <w:t>Display the 1</w:t>
+      </w:r>
+      <w:r>
+        <w:rPr>
+          <w:sz w:val="24"/>
+          <w:szCs w:val="24"/>
+          <w:vertAlign w:val="superscript"/>
+          <w:lang w:val="en-US"/>
+        </w:rPr>
+        <w:t>st</w:t>
+      </w:r>
+      <w:r>
+        <w:rPr>
+          <w:sz w:val="24"/>
+          <w:szCs w:val="24"/>
+          <w:lang w:val="en-US"/>
+        </w:rPr>
+        <w:t xml:space="preserve"> bus from list</w:t>
       </w:r>
     </w:p>
     <w:p>

</xml_diff>

<commit_message>
Date: 30 Oct 2025
</commit_message>
<xml_diff>
--- a/Assignments.docx
+++ b/Assignments.docx
@@ -3638,6 +3638,127 @@
           <w:lang w:val="en-US"/>
         </w:rPr>
         <w:t xml:space="preserve"> bus from list</w:t>
+      </w:r>
+    </w:p>
+    <w:p>
+      <w:pPr>
+        <w:pStyle w:val="ListParagraph"/>
+        <w:numPr>
+          <w:ilvl w:val="0"/>
+          <w:numId w:val="3"/>
+        </w:numPr>
+        <w:rPr>
+          <w:sz w:val="24"/>
+          <w:szCs w:val="24"/>
+          <w:lang w:val="en-US"/>
+        </w:rPr>
+      </w:pPr>
+      <w:r>
+        <w:rPr>
+          <w:sz w:val="24"/>
+          <w:szCs w:val="24"/>
+          <w:lang w:val="en-US"/>
+        </w:rPr>
+        <w:t xml:space="preserve">Open </w:t>
+      </w:r>
+      <w:hyperlink r:id="rId26" w:history="1">
+        <w:r>
+          <w:rPr>
+            <w:rStyle w:val="Hyperlink"/>
+            <w:sz w:val="24"/>
+            <w:szCs w:val="24"/>
+            <w:lang w:val="en-US"/>
+          </w:rPr>
+          <w:t>https://dash.bling-center.com/platform/signIn.html</w:t>
+        </w:r>
+      </w:hyperlink>
+    </w:p>
+    <w:p>
+      <w:pPr>
+        <w:pStyle w:val="ListParagraph"/>
+        <w:numPr>
+          <w:ilvl w:val="1"/>
+          <w:numId w:val="3"/>
+        </w:numPr>
+        <w:rPr>
+          <w:sz w:val="24"/>
+          <w:szCs w:val="24"/>
+          <w:lang w:val="en-US"/>
+        </w:rPr>
+      </w:pPr>
+      <w:r>
+        <w:rPr>
+          <w:sz w:val="24"/>
+          <w:szCs w:val="24"/>
+          <w:lang w:val="en-US"/>
+        </w:rPr>
+        <w:t>Click on forgot password</w:t>
+      </w:r>
+    </w:p>
+    <w:p>
+      <w:pPr>
+        <w:pStyle w:val="ListParagraph"/>
+        <w:numPr>
+          <w:ilvl w:val="1"/>
+          <w:numId w:val="3"/>
+        </w:numPr>
+        <w:rPr>
+          <w:sz w:val="24"/>
+          <w:szCs w:val="24"/>
+          <w:lang w:val="en-US"/>
+        </w:rPr>
+      </w:pPr>
+      <w:r>
+        <w:rPr>
+          <w:sz w:val="24"/>
+          <w:szCs w:val="24"/>
+          <w:lang w:val="en-US"/>
+        </w:rPr>
+        <w:t>Enter your email id</w:t>
+      </w:r>
+    </w:p>
+    <w:p>
+      <w:pPr>
+        <w:pStyle w:val="ListParagraph"/>
+        <w:numPr>
+          <w:ilvl w:val="1"/>
+          <w:numId w:val="3"/>
+        </w:numPr>
+        <w:rPr>
+          <w:sz w:val="24"/>
+          <w:szCs w:val="24"/>
+          <w:lang w:val="en-US"/>
+        </w:rPr>
+      </w:pPr>
+      <w:r>
+        <w:rPr>
+          <w:sz w:val="24"/>
+          <w:szCs w:val="24"/>
+          <w:lang w:val="en-US"/>
+        </w:rPr>
+        <w:t>Click on reset password button</w:t>
+      </w:r>
+    </w:p>
+    <w:p>
+      <w:pPr>
+        <w:pStyle w:val="ListParagraph"/>
+        <w:numPr>
+          <w:ilvl w:val="1"/>
+          <w:numId w:val="3"/>
+        </w:numPr>
+        <w:rPr>
+          <w:sz w:val="24"/>
+          <w:szCs w:val="24"/>
+          <w:lang w:val="en-US"/>
+        </w:rPr>
+      </w:pPr>
+      <w:r>
+        <w:rPr>
+          <w:sz w:val="24"/>
+          <w:szCs w:val="24"/>
+          <w:lang w:val="en-US"/>
+        </w:rPr>
+        <w:t>Display the text (message) in green color.</w:t>
       </w:r>
     </w:p>
     <w:p>

</xml_diff>

<commit_message>
Date: 31 Oct 2025
</commit_message>
<xml_diff>
--- a/Assignments.docx
+++ b/Assignments.docx
@@ -120,23 +120,13 @@
           <w:lang w:val="en-US"/>
         </w:rPr>
       </w:pPr>
-      <w:proofErr w:type="spellStart"/>
-      <w:r>
-        <w:rPr>
-          <w:sz w:val="24"/>
-          <w:szCs w:val="24"/>
-          <w:lang w:val="en-US"/>
-        </w:rPr>
-        <w:t>hra</w:t>
-      </w:r>
-      <w:proofErr w:type="spellEnd"/>
-      <w:r>
-        <w:rPr>
-          <w:sz w:val="24"/>
-          <w:szCs w:val="24"/>
-          <w:lang w:val="en-US"/>
-        </w:rPr>
-        <w:t xml:space="preserve"> = 20% of basic salary</w:t>
+      <w:r>
+        <w:rPr>
+          <w:sz w:val="24"/>
+          <w:szCs w:val="24"/>
+          <w:lang w:val="en-US"/>
+        </w:rPr>
+        <w:t>hra = 20% of basic salary</w:t>
       </w:r>
     </w:p>
     <w:p>
@@ -152,23 +142,13 @@
           <w:lang w:val="en-US"/>
         </w:rPr>
       </w:pPr>
-      <w:proofErr w:type="spellStart"/>
-      <w:r>
-        <w:rPr>
-          <w:sz w:val="24"/>
-          <w:szCs w:val="24"/>
-          <w:lang w:val="en-US"/>
-        </w:rPr>
-        <w:t>pf</w:t>
-      </w:r>
-      <w:proofErr w:type="spellEnd"/>
-      <w:r>
-        <w:rPr>
-          <w:sz w:val="24"/>
-          <w:szCs w:val="24"/>
-          <w:lang w:val="en-US"/>
-        </w:rPr>
-        <w:t xml:space="preserve"> = 5% of basic salary</w:t>
+      <w:r>
+        <w:rPr>
+          <w:sz w:val="24"/>
+          <w:szCs w:val="24"/>
+          <w:lang w:val="en-US"/>
+        </w:rPr>
+        <w:t>pf = 5% of basic salary</w:t>
       </w:r>
     </w:p>
     <w:p>
@@ -190,25 +170,7 @@
           <w:szCs w:val="24"/>
           <w:lang w:val="en-US"/>
         </w:rPr>
-        <w:t xml:space="preserve">gross salary = basic salary + da + </w:t>
-      </w:r>
-      <w:proofErr w:type="spellStart"/>
-      <w:r>
-        <w:rPr>
-          <w:sz w:val="24"/>
-          <w:szCs w:val="24"/>
-          <w:lang w:val="en-US"/>
-        </w:rPr>
-        <w:t>hra</w:t>
-      </w:r>
-      <w:proofErr w:type="spellEnd"/>
-      <w:r>
-        <w:rPr>
-          <w:sz w:val="24"/>
-          <w:szCs w:val="24"/>
-          <w:lang w:val="en-US"/>
-        </w:rPr>
-        <w:t>;</w:t>
+        <w:t>gross salary = basic salary + da + hra;</w:t>
       </w:r>
     </w:p>
     <w:p>
@@ -230,18 +192,8 @@
           <w:szCs w:val="24"/>
           <w:lang w:val="en-US"/>
         </w:rPr>
-        <w:t xml:space="preserve">net salary = gross salary – </w:t>
-      </w:r>
-      <w:proofErr w:type="spellStart"/>
-      <w:r>
-        <w:rPr>
-          <w:sz w:val="24"/>
-          <w:szCs w:val="24"/>
-          <w:lang w:val="en-US"/>
-        </w:rPr>
-        <w:t>pf</w:t>
-      </w:r>
-      <w:proofErr w:type="spellEnd"/>
+        <w:t>net salary = gross salary – pf</w:t>
+      </w:r>
     </w:p>
     <w:p>
       <w:pPr>
@@ -262,36 +214,8 @@
           <w:szCs w:val="24"/>
           <w:lang w:val="en-US"/>
         </w:rPr>
-        <w:t>Accept a number from user and check whether it is +</w:t>
-      </w:r>
-      <w:proofErr w:type="spellStart"/>
-      <w:r>
-        <w:rPr>
-          <w:sz w:val="24"/>
-          <w:szCs w:val="24"/>
-          <w:lang w:val="en-US"/>
-        </w:rPr>
-        <w:t>ve</w:t>
-      </w:r>
-      <w:proofErr w:type="spellEnd"/>
-      <w:r>
-        <w:rPr>
-          <w:sz w:val="24"/>
-          <w:szCs w:val="24"/>
-          <w:lang w:val="en-US"/>
-        </w:rPr>
-        <w:t xml:space="preserve"> or –</w:t>
-      </w:r>
-      <w:proofErr w:type="spellStart"/>
-      <w:r>
-        <w:rPr>
-          <w:sz w:val="24"/>
-          <w:szCs w:val="24"/>
-          <w:lang w:val="en-US"/>
-        </w:rPr>
-        <w:t>ve</w:t>
-      </w:r>
-      <w:proofErr w:type="spellEnd"/>
+        <w:t>Accept a number from user and check whether it is +ve or –ve</w:t>
+      </w:r>
     </w:p>
     <w:p>
       <w:pPr>
@@ -378,25 +302,7 @@
           <w:szCs w:val="24"/>
           <w:lang w:val="en-US"/>
         </w:rPr>
-        <w:t xml:space="preserve">Accept age from user and show the message as "You are valid for voting" if age is </w:t>
-      </w:r>
-      <w:proofErr w:type="spellStart"/>
-      <w:r>
-        <w:rPr>
-          <w:sz w:val="24"/>
-          <w:szCs w:val="24"/>
-          <w:lang w:val="en-US"/>
-        </w:rPr>
-        <w:t>grater</w:t>
-      </w:r>
-      <w:proofErr w:type="spellEnd"/>
-      <w:r>
-        <w:rPr>
-          <w:sz w:val="24"/>
-          <w:szCs w:val="24"/>
-          <w:lang w:val="en-US"/>
-        </w:rPr>
-        <w:t xml:space="preserve"> than or equal to 18 otherwise display the message as "You are not valid for voting"</w:t>
+        <w:t>Accept age from user and show the message as "You are valid for voting" if age is grater than or equal to 18 otherwise display the message as "You are not valid for voting"</w:t>
       </w:r>
     </w:p>
     <w:p>
@@ -501,17 +407,8 @@
           <w:lang w:val="en-US"/>
         </w:rPr>
         <w:tab/>
-      </w:r>
-      <w:proofErr w:type="spellStart"/>
-      <w:r>
-        <w:rPr>
-          <w:sz w:val="24"/>
-          <w:szCs w:val="24"/>
-          <w:lang w:val="en-US"/>
-        </w:rPr>
         <w:t>Dist</w:t>
       </w:r>
-      <w:proofErr w:type="spellEnd"/>
       <w:r>
         <w:rPr>
           <w:sz w:val="24"/>
@@ -748,7 +645,6 @@
           <w:lang w:val="en-US"/>
         </w:rPr>
       </w:pPr>
-      <w:proofErr w:type="spellStart"/>
       <w:r>
         <w:rPr>
           <w:sz w:val="24"/>
@@ -757,7 +653,6 @@
         </w:rPr>
         <w:t>AccountNo</w:t>
       </w:r>
-      <w:proofErr w:type="spellEnd"/>
     </w:p>
     <w:p>
       <w:pPr>
@@ -772,7 +667,6 @@
           <w:lang w:val="en-US"/>
         </w:rPr>
       </w:pPr>
-      <w:proofErr w:type="spellStart"/>
       <w:r>
         <w:rPr>
           <w:sz w:val="24"/>
@@ -781,7 +675,6 @@
         </w:rPr>
         <w:t>AccountHolderName</w:t>
       </w:r>
-      <w:proofErr w:type="spellEnd"/>
     </w:p>
     <w:p>
       <w:pPr>
@@ -862,23 +755,13 @@
           <w:lang w:val="en-US"/>
         </w:rPr>
       </w:pPr>
-      <w:proofErr w:type="spellStart"/>
-      <w:r>
-        <w:rPr>
-          <w:sz w:val="24"/>
-          <w:szCs w:val="24"/>
-          <w:lang w:val="en-US"/>
-        </w:rPr>
-        <w:t>DisplayData</w:t>
-      </w:r>
-      <w:proofErr w:type="spellEnd"/>
-      <w:r>
-        <w:rPr>
-          <w:sz w:val="24"/>
-          <w:szCs w:val="24"/>
-          <w:lang w:val="en-US"/>
-        </w:rPr>
-        <w:t>()</w:t>
+      <w:r>
+        <w:rPr>
+          <w:sz w:val="24"/>
+          <w:szCs w:val="24"/>
+          <w:lang w:val="en-US"/>
+        </w:rPr>
+        <w:t>DisplayData()</w:t>
       </w:r>
     </w:p>
     <w:p>
@@ -939,25 +822,7 @@
           <w:szCs w:val="24"/>
           <w:lang w:val="en-US"/>
         </w:rPr>
-        <w:t xml:space="preserve">Try </w:t>
-      </w:r>
-      <w:proofErr w:type="gramStart"/>
-      <w:r>
-        <w:rPr>
-          <w:sz w:val="24"/>
-          <w:szCs w:val="24"/>
-          <w:lang w:val="en-US"/>
-        </w:rPr>
-        <w:t>getPageSource(</w:t>
-      </w:r>
-      <w:proofErr w:type="gramEnd"/>
-      <w:r>
-        <w:rPr>
-          <w:sz w:val="24"/>
-          <w:szCs w:val="24"/>
-          <w:lang w:val="en-US"/>
-        </w:rPr>
-        <w:t>) on any web site. What is the return type and use of this method?</w:t>
+        <w:t>Try getPageSource() on any web site. What is the return type and use of this method?</w:t>
       </w:r>
     </w:p>
     <w:p>
@@ -1012,25 +877,7 @@
           <w:szCs w:val="24"/>
           <w:lang w:val="en-US"/>
         </w:rPr>
-        <w:t>Enter username as your name (</w:t>
-      </w:r>
-      <w:proofErr w:type="spellStart"/>
-      <w:r>
-        <w:rPr>
-          <w:sz w:val="24"/>
-          <w:szCs w:val="24"/>
-          <w:lang w:val="en-US"/>
-        </w:rPr>
-        <w:t>amita</w:t>
-      </w:r>
-      <w:proofErr w:type="spellEnd"/>
-      <w:r>
-        <w:rPr>
-          <w:sz w:val="24"/>
-          <w:szCs w:val="24"/>
-          <w:lang w:val="en-US"/>
-        </w:rPr>
-        <w:t>)</w:t>
+        <w:t>Enter username as your name (amita)</w:t>
       </w:r>
     </w:p>
     <w:p>
@@ -1149,7 +996,6 @@
         </w:rPr>
         <w:t>Enter username as your name (</w:t>
       </w:r>
-      <w:proofErr w:type="spellStart"/>
       <w:r>
         <w:rPr>
           <w:sz w:val="24"/>
@@ -1158,7 +1004,6 @@
         </w:rPr>
         <w:t>trupti</w:t>
       </w:r>
-      <w:proofErr w:type="spellEnd"/>
       <w:r>
         <w:rPr>
           <w:sz w:val="24"/>
@@ -1298,25 +1143,7 @@
           <w:szCs w:val="24"/>
           <w:lang w:val="en-US"/>
         </w:rPr>
-        <w:t>Enter username as your name (</w:t>
-      </w:r>
-      <w:proofErr w:type="spellStart"/>
-      <w:r>
-        <w:rPr>
-          <w:sz w:val="24"/>
-          <w:szCs w:val="24"/>
-          <w:lang w:val="en-US"/>
-        </w:rPr>
-        <w:t>trupti</w:t>
-      </w:r>
-      <w:proofErr w:type="spellEnd"/>
-      <w:r>
-        <w:rPr>
-          <w:sz w:val="24"/>
-          <w:szCs w:val="24"/>
-          <w:lang w:val="en-US"/>
-        </w:rPr>
-        <w:t>)</w:t>
+        <w:t>Enter username as your name (trupti)</w:t>
       </w:r>
     </w:p>
     <w:p>
@@ -1638,25 +1465,7 @@
           <w:szCs w:val="24"/>
           <w:lang w:val="en-US"/>
         </w:rPr>
-        <w:t>Enter username as your name (</w:t>
-      </w:r>
-      <w:proofErr w:type="spellStart"/>
-      <w:r>
-        <w:rPr>
-          <w:sz w:val="24"/>
-          <w:szCs w:val="24"/>
-          <w:lang w:val="en-US"/>
-        </w:rPr>
-        <w:t>trupti</w:t>
-      </w:r>
-      <w:proofErr w:type="spellEnd"/>
-      <w:r>
-        <w:rPr>
-          <w:sz w:val="24"/>
-          <w:szCs w:val="24"/>
-          <w:lang w:val="en-US"/>
-        </w:rPr>
-        <w:t>)</w:t>
+        <w:t>Enter username as your name (trupti)</w:t>
       </w:r>
     </w:p>
     <w:p>
@@ -1793,25 +1602,7 @@
           <w:szCs w:val="24"/>
           <w:lang w:val="en-US"/>
         </w:rPr>
-        <w:t>Enter username as your name (</w:t>
-      </w:r>
-      <w:proofErr w:type="spellStart"/>
-      <w:r>
-        <w:rPr>
-          <w:sz w:val="24"/>
-          <w:szCs w:val="24"/>
-          <w:lang w:val="en-US"/>
-        </w:rPr>
-        <w:t>trupti</w:t>
-      </w:r>
-      <w:proofErr w:type="spellEnd"/>
-      <w:r>
-        <w:rPr>
-          <w:sz w:val="24"/>
-          <w:szCs w:val="24"/>
-          <w:lang w:val="en-US"/>
-        </w:rPr>
-        <w:t>)</w:t>
+        <w:t>Enter username as your name (trupti)</w:t>
       </w:r>
     </w:p>
     <w:p>
@@ -2294,25 +2085,7 @@
           <w:szCs w:val="24"/>
           <w:lang w:val="en-US"/>
         </w:rPr>
-        <w:t>Enter username as your name (</w:t>
-      </w:r>
-      <w:proofErr w:type="spellStart"/>
-      <w:r>
-        <w:rPr>
-          <w:sz w:val="24"/>
-          <w:szCs w:val="24"/>
-          <w:lang w:val="en-US"/>
-        </w:rPr>
-        <w:t>trupti</w:t>
-      </w:r>
-      <w:proofErr w:type="spellEnd"/>
-      <w:r>
-        <w:rPr>
-          <w:sz w:val="24"/>
-          <w:szCs w:val="24"/>
-          <w:lang w:val="en-US"/>
-        </w:rPr>
-        <w:t>)</w:t>
+        <w:t>Enter username as your name (trupti)</w:t>
       </w:r>
     </w:p>
     <w:p>
@@ -3409,25 +3182,7 @@
           <w:szCs w:val="24"/>
           <w:lang w:val="en-US"/>
         </w:rPr>
-        <w:t xml:space="preserve">Enter first 4 characters from your city (Kolhapur – </w:t>
-      </w:r>
-      <w:proofErr w:type="spellStart"/>
-      <w:r>
-        <w:rPr>
-          <w:sz w:val="24"/>
-          <w:szCs w:val="24"/>
-          <w:lang w:val="en-US"/>
-        </w:rPr>
-        <w:t>kolh</w:t>
-      </w:r>
-      <w:proofErr w:type="spellEnd"/>
-      <w:r>
-        <w:rPr>
-          <w:sz w:val="24"/>
-          <w:szCs w:val="24"/>
-          <w:lang w:val="en-US"/>
-        </w:rPr>
-        <w:t>)</w:t>
+        <w:t>Enter first 4 characters from your city (Kolhapur – kolh)</w:t>
       </w:r>
     </w:p>
     <w:p>
@@ -3759,6 +3514,68 @@
           <w:lang w:val="en-US"/>
         </w:rPr>
         <w:t>Display the text (message) in green color.</w:t>
+      </w:r>
+    </w:p>
+    <w:p>
+      <w:pPr>
+        <w:pStyle w:val="ListParagraph"/>
+        <w:numPr>
+          <w:ilvl w:val="0"/>
+          <w:numId w:val="3"/>
+        </w:numPr>
+        <w:rPr>
+          <w:sz w:val="26"/>
+          <w:szCs w:val="24"/>
+          <w:lang w:val="en-US"/>
+        </w:rPr>
+      </w:pPr>
+      <w:r>
+        <w:rPr>
+          <w:sz w:val="26"/>
+          <w:szCs w:val="24"/>
+          <w:lang w:val="en-US"/>
+        </w:rPr>
+        <w:t>Complete the redbus assignment with ExplicitWait</w:t>
+      </w:r>
+      <w:r>
+        <w:rPr>
+          <w:sz w:val="26"/>
+          <w:szCs w:val="24"/>
+          <w:lang w:val="en-US"/>
+        </w:rPr>
+        <w:br/>
+      </w:r>
+      <w:r>
+        <w:rPr>
+          <w:rFonts w:ascii="Consolas" w:hAnsi="Consolas" w:cs="Consolas"/>
+          <w:color w:val="3F7F5F"/>
+          <w:sz w:val="32"/>
+          <w:szCs w:val="32"/>
+          <w:shd w:val="clear" w:color="auto" w:fill="E8F2FE"/>
+        </w:rPr>
+        <w:t>wait.until(ExpectedConditions.visibilityOfElementLocated(By.xpath(""))).click();</w:t>
+      </w:r>
+    </w:p>
+    <w:p>
+      <w:pPr>
+        <w:pStyle w:val="ListParagraph"/>
+        <w:numPr>
+          <w:ilvl w:val="0"/>
+          <w:numId w:val="3"/>
+        </w:numPr>
+        <w:rPr>
+          <w:sz w:val="24"/>
+          <w:szCs w:val="24"/>
+          <w:lang w:val="en-US"/>
+        </w:rPr>
+      </w:pPr>
+      <w:r>
+        <w:rPr>
+          <w:sz w:val="24"/>
+          <w:szCs w:val="24"/>
+          <w:lang w:val="en-US"/>
+        </w:rPr>
+        <w:t>Complete the redbus assignment with FluentWait</w:t>
       </w:r>
     </w:p>
     <w:p>
@@ -4057,9 +3874,9 @@
     </w:lvl>
   </w:abstractNum>
   <w:abstractNum w:abstractNumId="3">
-    <w:nsid w:val="68A312EE"/>
+    <w:nsid w:val="4E5B4A02"/>
     <w:multiLevelType w:val="hybridMultilevel"/>
-    <w:tmpl w:val="DF86D600"/>
+    <w:tmpl w:val="E8BC0844"/>
     <w:lvl w:ilvl="0" w:tplc="4009000F">
       <w:start w:val="1"/>
       <w:numFmt w:val="decimal"/>
@@ -4081,7 +3898,7 @@
         <w:ind w:left="1440" w:hanging="360"/>
       </w:pPr>
     </w:lvl>
-    <w:lvl w:ilvl="2" w:tplc="4009001B">
+    <w:lvl w:ilvl="2" w:tplc="4009001B" w:tentative="1">
       <w:start w:val="1"/>
       <w:numFmt w:val="lowerRoman"/>
       <w:lvlText w:val="%3."/>
@@ -4145,8 +3962,97 @@
       </w:pPr>
     </w:lvl>
   </w:abstractNum>
+  <w:abstractNum w:abstractNumId="4">
+    <w:nsid w:val="68A312EE"/>
+    <w:multiLevelType w:val="hybridMultilevel"/>
+    <w:tmpl w:val="DF86D600"/>
+    <w:lvl w:ilvl="0" w:tplc="4009000F">
+      <w:start w:val="1"/>
+      <w:numFmt w:val="decimal"/>
+      <w:lvlText w:val="%1."/>
+      <w:lvlJc w:val="left"/>
+      <w:pPr>
+        <w:ind w:left="720" w:hanging="360"/>
+      </w:pPr>
+      <w:rPr>
+        <w:rFonts w:hint="default"/>
+      </w:rPr>
+    </w:lvl>
+    <w:lvl w:ilvl="1" w:tplc="40090019">
+      <w:start w:val="1"/>
+      <w:numFmt w:val="lowerLetter"/>
+      <w:lvlText w:val="%2."/>
+      <w:lvlJc w:val="left"/>
+      <w:pPr>
+        <w:ind w:left="1440" w:hanging="360"/>
+      </w:pPr>
+    </w:lvl>
+    <w:lvl w:ilvl="2" w:tplc="4009001B">
+      <w:start w:val="1"/>
+      <w:numFmt w:val="lowerRoman"/>
+      <w:lvlText w:val="%3."/>
+      <w:lvlJc w:val="right"/>
+      <w:pPr>
+        <w:ind w:left="2160" w:hanging="180"/>
+      </w:pPr>
+    </w:lvl>
+    <w:lvl w:ilvl="3" w:tplc="4009000F" w:tentative="1">
+      <w:start w:val="1"/>
+      <w:numFmt w:val="decimal"/>
+      <w:lvlText w:val="%4."/>
+      <w:lvlJc w:val="left"/>
+      <w:pPr>
+        <w:ind w:left="2880" w:hanging="360"/>
+      </w:pPr>
+    </w:lvl>
+    <w:lvl w:ilvl="4" w:tplc="40090019" w:tentative="1">
+      <w:start w:val="1"/>
+      <w:numFmt w:val="lowerLetter"/>
+      <w:lvlText w:val="%5."/>
+      <w:lvlJc w:val="left"/>
+      <w:pPr>
+        <w:ind w:left="3600" w:hanging="360"/>
+      </w:pPr>
+    </w:lvl>
+    <w:lvl w:ilvl="5" w:tplc="4009001B" w:tentative="1">
+      <w:start w:val="1"/>
+      <w:numFmt w:val="lowerRoman"/>
+      <w:lvlText w:val="%6."/>
+      <w:lvlJc w:val="right"/>
+      <w:pPr>
+        <w:ind w:left="4320" w:hanging="180"/>
+      </w:pPr>
+    </w:lvl>
+    <w:lvl w:ilvl="6" w:tplc="4009000F" w:tentative="1">
+      <w:start w:val="1"/>
+      <w:numFmt w:val="decimal"/>
+      <w:lvlText w:val="%7."/>
+      <w:lvlJc w:val="left"/>
+      <w:pPr>
+        <w:ind w:left="5040" w:hanging="360"/>
+      </w:pPr>
+    </w:lvl>
+    <w:lvl w:ilvl="7" w:tplc="40090019" w:tentative="1">
+      <w:start w:val="1"/>
+      <w:numFmt w:val="lowerLetter"/>
+      <w:lvlText w:val="%8."/>
+      <w:lvlJc w:val="left"/>
+      <w:pPr>
+        <w:ind w:left="5760" w:hanging="360"/>
+      </w:pPr>
+    </w:lvl>
+    <w:lvl w:ilvl="8" w:tplc="4009001B" w:tentative="1">
+      <w:start w:val="1"/>
+      <w:numFmt w:val="lowerRoman"/>
+      <w:lvlText w:val="%9."/>
+      <w:lvlJc w:val="right"/>
+      <w:pPr>
+        <w:ind w:left="6480" w:hanging="180"/>
+      </w:pPr>
+    </w:lvl>
+  </w:abstractNum>
   <w:num w:numId="1">
-    <w:abstractNumId w:val="3"/>
+    <w:abstractNumId w:val="4"/>
   </w:num>
   <w:num w:numId="2">
     <w:abstractNumId w:val="2"/>
@@ -4156,6 +4062,9 @@
   </w:num>
   <w:num w:numId="4">
     <w:abstractNumId w:val="1"/>
+  </w:num>
+  <w:num w:numId="5">
+    <w:abstractNumId w:val="3"/>
   </w:num>
 </w:numbering>
 </file>

</xml_diff>

<commit_message>
Date: 03 Nov 2025
</commit_message>
<xml_diff>
--- a/Assignments.docx
+++ b/Assignments.docx
@@ -120,13 +120,23 @@
           <w:lang w:val="en-US"/>
         </w:rPr>
       </w:pPr>
-      <w:r>
-        <w:rPr>
-          <w:sz w:val="24"/>
-          <w:szCs w:val="24"/>
-          <w:lang w:val="en-US"/>
-        </w:rPr>
-        <w:t>hra = 20% of basic salary</w:t>
+      <w:proofErr w:type="spellStart"/>
+      <w:r>
+        <w:rPr>
+          <w:sz w:val="24"/>
+          <w:szCs w:val="24"/>
+          <w:lang w:val="en-US"/>
+        </w:rPr>
+        <w:t>hra</w:t>
+      </w:r>
+      <w:proofErr w:type="spellEnd"/>
+      <w:r>
+        <w:rPr>
+          <w:sz w:val="24"/>
+          <w:szCs w:val="24"/>
+          <w:lang w:val="en-US"/>
+        </w:rPr>
+        <w:t xml:space="preserve"> = 20% of basic salary</w:t>
       </w:r>
     </w:p>
     <w:p>
@@ -142,13 +152,23 @@
           <w:lang w:val="en-US"/>
         </w:rPr>
       </w:pPr>
-      <w:r>
-        <w:rPr>
-          <w:sz w:val="24"/>
-          <w:szCs w:val="24"/>
-          <w:lang w:val="en-US"/>
-        </w:rPr>
-        <w:t>pf = 5% of basic salary</w:t>
+      <w:proofErr w:type="spellStart"/>
+      <w:r>
+        <w:rPr>
+          <w:sz w:val="24"/>
+          <w:szCs w:val="24"/>
+          <w:lang w:val="en-US"/>
+        </w:rPr>
+        <w:t>pf</w:t>
+      </w:r>
+      <w:proofErr w:type="spellEnd"/>
+      <w:r>
+        <w:rPr>
+          <w:sz w:val="24"/>
+          <w:szCs w:val="24"/>
+          <w:lang w:val="en-US"/>
+        </w:rPr>
+        <w:t xml:space="preserve"> = 5% of basic salary</w:t>
       </w:r>
     </w:p>
     <w:p>
@@ -170,7 +190,25 @@
           <w:szCs w:val="24"/>
           <w:lang w:val="en-US"/>
         </w:rPr>
-        <w:t>gross salary = basic salary + da + hra;</w:t>
+        <w:t xml:space="preserve">gross salary = basic salary + da + </w:t>
+      </w:r>
+      <w:proofErr w:type="spellStart"/>
+      <w:r>
+        <w:rPr>
+          <w:sz w:val="24"/>
+          <w:szCs w:val="24"/>
+          <w:lang w:val="en-US"/>
+        </w:rPr>
+        <w:t>hra</w:t>
+      </w:r>
+      <w:proofErr w:type="spellEnd"/>
+      <w:r>
+        <w:rPr>
+          <w:sz w:val="24"/>
+          <w:szCs w:val="24"/>
+          <w:lang w:val="en-US"/>
+        </w:rPr>
+        <w:t>;</w:t>
       </w:r>
     </w:p>
     <w:p>
@@ -192,8 +230,18 @@
           <w:szCs w:val="24"/>
           <w:lang w:val="en-US"/>
         </w:rPr>
-        <w:t>net salary = gross salary – pf</w:t>
-      </w:r>
+        <w:t xml:space="preserve">net salary = gross salary – </w:t>
+      </w:r>
+      <w:proofErr w:type="spellStart"/>
+      <w:r>
+        <w:rPr>
+          <w:sz w:val="24"/>
+          <w:szCs w:val="24"/>
+          <w:lang w:val="en-US"/>
+        </w:rPr>
+        <w:t>pf</w:t>
+      </w:r>
+      <w:proofErr w:type="spellEnd"/>
     </w:p>
     <w:p>
       <w:pPr>
@@ -214,8 +262,36 @@
           <w:szCs w:val="24"/>
           <w:lang w:val="en-US"/>
         </w:rPr>
-        <w:t>Accept a number from user and check whether it is +ve or –ve</w:t>
-      </w:r>
+        <w:t>Accept a number from user and check whether it is +</w:t>
+      </w:r>
+      <w:proofErr w:type="spellStart"/>
+      <w:r>
+        <w:rPr>
+          <w:sz w:val="24"/>
+          <w:szCs w:val="24"/>
+          <w:lang w:val="en-US"/>
+        </w:rPr>
+        <w:t>ve</w:t>
+      </w:r>
+      <w:proofErr w:type="spellEnd"/>
+      <w:r>
+        <w:rPr>
+          <w:sz w:val="24"/>
+          <w:szCs w:val="24"/>
+          <w:lang w:val="en-US"/>
+        </w:rPr>
+        <w:t xml:space="preserve"> or –</w:t>
+      </w:r>
+      <w:proofErr w:type="spellStart"/>
+      <w:r>
+        <w:rPr>
+          <w:sz w:val="24"/>
+          <w:szCs w:val="24"/>
+          <w:lang w:val="en-US"/>
+        </w:rPr>
+        <w:t>ve</w:t>
+      </w:r>
+      <w:proofErr w:type="spellEnd"/>
     </w:p>
     <w:p>
       <w:pPr>
@@ -302,7 +378,25 @@
           <w:szCs w:val="24"/>
           <w:lang w:val="en-US"/>
         </w:rPr>
-        <w:t>Accept age from user and show the message as "You are valid for voting" if age is grater than or equal to 18 otherwise display the message as "You are not valid for voting"</w:t>
+        <w:t xml:space="preserve">Accept age from user and show the message as "You are valid for voting" if age is </w:t>
+      </w:r>
+      <w:proofErr w:type="spellStart"/>
+      <w:r>
+        <w:rPr>
+          <w:sz w:val="24"/>
+          <w:szCs w:val="24"/>
+          <w:lang w:val="en-US"/>
+        </w:rPr>
+        <w:t>grater</w:t>
+      </w:r>
+      <w:proofErr w:type="spellEnd"/>
+      <w:r>
+        <w:rPr>
+          <w:sz w:val="24"/>
+          <w:szCs w:val="24"/>
+          <w:lang w:val="en-US"/>
+        </w:rPr>
+        <w:t xml:space="preserve"> than or equal to 18 otherwise display the message as "You are not valid for voting"</w:t>
       </w:r>
     </w:p>
     <w:p>
@@ -407,8 +501,17 @@
           <w:lang w:val="en-US"/>
         </w:rPr>
         <w:tab/>
+      </w:r>
+      <w:proofErr w:type="spellStart"/>
+      <w:r>
+        <w:rPr>
+          <w:sz w:val="24"/>
+          <w:szCs w:val="24"/>
+          <w:lang w:val="en-US"/>
+        </w:rPr>
         <w:t>Dist</w:t>
       </w:r>
+      <w:proofErr w:type="spellEnd"/>
       <w:r>
         <w:rPr>
           <w:sz w:val="24"/>
@@ -645,6 +748,7 @@
           <w:lang w:val="en-US"/>
         </w:rPr>
       </w:pPr>
+      <w:proofErr w:type="spellStart"/>
       <w:r>
         <w:rPr>
           <w:sz w:val="24"/>
@@ -653,6 +757,7 @@
         </w:rPr>
         <w:t>AccountNo</w:t>
       </w:r>
+      <w:proofErr w:type="spellEnd"/>
     </w:p>
     <w:p>
       <w:pPr>
@@ -667,6 +772,7 @@
           <w:lang w:val="en-US"/>
         </w:rPr>
       </w:pPr>
+      <w:proofErr w:type="spellStart"/>
       <w:r>
         <w:rPr>
           <w:sz w:val="24"/>
@@ -675,6 +781,7 @@
         </w:rPr>
         <w:t>AccountHolderName</w:t>
       </w:r>
+      <w:proofErr w:type="spellEnd"/>
     </w:p>
     <w:p>
       <w:pPr>
@@ -755,13 +862,23 @@
           <w:lang w:val="en-US"/>
         </w:rPr>
       </w:pPr>
-      <w:r>
-        <w:rPr>
-          <w:sz w:val="24"/>
-          <w:szCs w:val="24"/>
-          <w:lang w:val="en-US"/>
-        </w:rPr>
-        <w:t>DisplayData()</w:t>
+      <w:proofErr w:type="spellStart"/>
+      <w:r>
+        <w:rPr>
+          <w:sz w:val="24"/>
+          <w:szCs w:val="24"/>
+          <w:lang w:val="en-US"/>
+        </w:rPr>
+        <w:t>DisplayData</w:t>
+      </w:r>
+      <w:proofErr w:type="spellEnd"/>
+      <w:r>
+        <w:rPr>
+          <w:sz w:val="24"/>
+          <w:szCs w:val="24"/>
+          <w:lang w:val="en-US"/>
+        </w:rPr>
+        <w:t>()</w:t>
       </w:r>
     </w:p>
     <w:p>
@@ -822,7 +939,25 @@
           <w:szCs w:val="24"/>
           <w:lang w:val="en-US"/>
         </w:rPr>
-        <w:t>Try getPageSource() on any web site. What is the return type and use of this method?</w:t>
+        <w:t xml:space="preserve">Try </w:t>
+      </w:r>
+      <w:proofErr w:type="gramStart"/>
+      <w:r>
+        <w:rPr>
+          <w:sz w:val="24"/>
+          <w:szCs w:val="24"/>
+          <w:lang w:val="en-US"/>
+        </w:rPr>
+        <w:t>getPageSource(</w:t>
+      </w:r>
+      <w:proofErr w:type="gramEnd"/>
+      <w:r>
+        <w:rPr>
+          <w:sz w:val="24"/>
+          <w:szCs w:val="24"/>
+          <w:lang w:val="en-US"/>
+        </w:rPr>
+        <w:t>) on any web site. What is the return type and use of this method?</w:t>
       </w:r>
     </w:p>
     <w:p>
@@ -877,7 +1012,25 @@
           <w:szCs w:val="24"/>
           <w:lang w:val="en-US"/>
         </w:rPr>
-        <w:t>Enter username as your name (amita)</w:t>
+        <w:t>Enter username as your name (</w:t>
+      </w:r>
+      <w:proofErr w:type="spellStart"/>
+      <w:r>
+        <w:rPr>
+          <w:sz w:val="24"/>
+          <w:szCs w:val="24"/>
+          <w:lang w:val="en-US"/>
+        </w:rPr>
+        <w:t>amita</w:t>
+      </w:r>
+      <w:proofErr w:type="spellEnd"/>
+      <w:r>
+        <w:rPr>
+          <w:sz w:val="24"/>
+          <w:szCs w:val="24"/>
+          <w:lang w:val="en-US"/>
+        </w:rPr>
+        <w:t>)</w:t>
       </w:r>
     </w:p>
     <w:p>
@@ -996,6 +1149,7 @@
         </w:rPr>
         <w:t>Enter username as your name (</w:t>
       </w:r>
+      <w:proofErr w:type="spellStart"/>
       <w:r>
         <w:rPr>
           <w:sz w:val="24"/>
@@ -1004,6 +1158,7 @@
         </w:rPr>
         <w:t>trupti</w:t>
       </w:r>
+      <w:proofErr w:type="spellEnd"/>
       <w:r>
         <w:rPr>
           <w:sz w:val="24"/>
@@ -1143,7 +1298,25 @@
           <w:szCs w:val="24"/>
           <w:lang w:val="en-US"/>
         </w:rPr>
-        <w:t>Enter username as your name (trupti)</w:t>
+        <w:t>Enter username as your name (</w:t>
+      </w:r>
+      <w:proofErr w:type="spellStart"/>
+      <w:r>
+        <w:rPr>
+          <w:sz w:val="24"/>
+          <w:szCs w:val="24"/>
+          <w:lang w:val="en-US"/>
+        </w:rPr>
+        <w:t>trupti</w:t>
+      </w:r>
+      <w:proofErr w:type="spellEnd"/>
+      <w:r>
+        <w:rPr>
+          <w:sz w:val="24"/>
+          <w:szCs w:val="24"/>
+          <w:lang w:val="en-US"/>
+        </w:rPr>
+        <w:t>)</w:t>
       </w:r>
     </w:p>
     <w:p>
@@ -1465,7 +1638,25 @@
           <w:szCs w:val="24"/>
           <w:lang w:val="en-US"/>
         </w:rPr>
-        <w:t>Enter username as your name (trupti)</w:t>
+        <w:t>Enter username as your name (</w:t>
+      </w:r>
+      <w:proofErr w:type="spellStart"/>
+      <w:r>
+        <w:rPr>
+          <w:sz w:val="24"/>
+          <w:szCs w:val="24"/>
+          <w:lang w:val="en-US"/>
+        </w:rPr>
+        <w:t>trupti</w:t>
+      </w:r>
+      <w:proofErr w:type="spellEnd"/>
+      <w:r>
+        <w:rPr>
+          <w:sz w:val="24"/>
+          <w:szCs w:val="24"/>
+          <w:lang w:val="en-US"/>
+        </w:rPr>
+        <w:t>)</w:t>
       </w:r>
     </w:p>
     <w:p>
@@ -1602,7 +1793,25 @@
           <w:szCs w:val="24"/>
           <w:lang w:val="en-US"/>
         </w:rPr>
-        <w:t>Enter username as your name (trupti)</w:t>
+        <w:t>Enter username as your name (</w:t>
+      </w:r>
+      <w:proofErr w:type="spellStart"/>
+      <w:r>
+        <w:rPr>
+          <w:sz w:val="24"/>
+          <w:szCs w:val="24"/>
+          <w:lang w:val="en-US"/>
+        </w:rPr>
+        <w:t>trupti</w:t>
+      </w:r>
+      <w:proofErr w:type="spellEnd"/>
+      <w:r>
+        <w:rPr>
+          <w:sz w:val="24"/>
+          <w:szCs w:val="24"/>
+          <w:lang w:val="en-US"/>
+        </w:rPr>
+        <w:t>)</w:t>
       </w:r>
     </w:p>
     <w:p>
@@ -2085,7 +2294,25 @@
           <w:szCs w:val="24"/>
           <w:lang w:val="en-US"/>
         </w:rPr>
-        <w:t>Enter username as your name (trupti)</w:t>
+        <w:t>Enter username as your name (</w:t>
+      </w:r>
+      <w:proofErr w:type="spellStart"/>
+      <w:r>
+        <w:rPr>
+          <w:sz w:val="24"/>
+          <w:szCs w:val="24"/>
+          <w:lang w:val="en-US"/>
+        </w:rPr>
+        <w:t>trupti</w:t>
+      </w:r>
+      <w:proofErr w:type="spellEnd"/>
+      <w:r>
+        <w:rPr>
+          <w:sz w:val="24"/>
+          <w:szCs w:val="24"/>
+          <w:lang w:val="en-US"/>
+        </w:rPr>
+        <w:t>)</w:t>
       </w:r>
     </w:p>
     <w:p>
@@ -3182,7 +3409,25 @@
           <w:szCs w:val="24"/>
           <w:lang w:val="en-US"/>
         </w:rPr>
-        <w:t>Enter first 4 characters from your city (Kolhapur – kolh)</w:t>
+        <w:t xml:space="preserve">Enter first 4 characters from your city (Kolhapur – </w:t>
+      </w:r>
+      <w:proofErr w:type="spellStart"/>
+      <w:r>
+        <w:rPr>
+          <w:sz w:val="24"/>
+          <w:szCs w:val="24"/>
+          <w:lang w:val="en-US"/>
+        </w:rPr>
+        <w:t>kolh</w:t>
+      </w:r>
+      <w:proofErr w:type="spellEnd"/>
+      <w:r>
+        <w:rPr>
+          <w:sz w:val="24"/>
+          <w:szCs w:val="24"/>
+          <w:lang w:val="en-US"/>
+        </w:rPr>
+        <w:t>)</w:t>
       </w:r>
     </w:p>
     <w:p>
@@ -3585,14 +3830,1115 @@
           <w:ilvl w:val="0"/>
           <w:numId w:val="3"/>
         </w:numPr>
-        <w:rPr>
-          <w:sz w:val="24"/>
-          <w:szCs w:val="24"/>
-          <w:lang w:val="en-US"/>
-        </w:rPr>
-      </w:pPr>
-      <w:bookmarkStart w:id="0" w:name="_GoBack"/>
-      <w:bookmarkEnd w:id="0"/>
+        <w:spacing w:line="254" w:lineRule="auto"/>
+        <w:rPr>
+          <w:sz w:val="24"/>
+          <w:szCs w:val="24"/>
+          <w:lang w:val="en-US"/>
+        </w:rPr>
+      </w:pPr>
+      <w:r>
+        <w:rPr>
+          <w:sz w:val="24"/>
+          <w:szCs w:val="24"/>
+          <w:lang w:val="en-US"/>
+        </w:rPr>
+        <w:t xml:space="preserve">Open </w:t>
+      </w:r>
+      <w:hyperlink r:id="rId27" w:history="1">
+        <w:r>
+          <w:rPr>
+            <w:rStyle w:val="Hyperlink"/>
+            <w:sz w:val="24"/>
+            <w:szCs w:val="24"/>
+            <w:lang w:val="en-US"/>
+          </w:rPr>
+          <w:t>https://opensource-demo.orangehrmlive.com/web/index.php/auth/login</w:t>
+        </w:r>
+      </w:hyperlink>
+    </w:p>
+    <w:p>
+      <w:pPr>
+        <w:pStyle w:val="ListParagraph"/>
+        <w:numPr>
+          <w:ilvl w:val="1"/>
+          <w:numId w:val="3"/>
+        </w:numPr>
+        <w:spacing w:line="254" w:lineRule="auto"/>
+        <w:rPr>
+          <w:sz w:val="24"/>
+          <w:szCs w:val="24"/>
+          <w:lang w:val="en-US"/>
+        </w:rPr>
+      </w:pPr>
+      <w:r>
+        <w:rPr>
+          <w:sz w:val="24"/>
+          <w:szCs w:val="24"/>
+          <w:lang w:val="en-US"/>
+        </w:rPr>
+        <w:t>Login with Admin (admin, admin123)</w:t>
+      </w:r>
+    </w:p>
+    <w:p>
+      <w:pPr>
+        <w:pStyle w:val="ListParagraph"/>
+        <w:numPr>
+          <w:ilvl w:val="1"/>
+          <w:numId w:val="3"/>
+        </w:numPr>
+        <w:spacing w:line="254" w:lineRule="auto"/>
+        <w:rPr>
+          <w:sz w:val="24"/>
+          <w:szCs w:val="24"/>
+          <w:lang w:val="en-US"/>
+        </w:rPr>
+      </w:pPr>
+      <w:r>
+        <w:rPr>
+          <w:sz w:val="24"/>
+          <w:szCs w:val="24"/>
+          <w:lang w:val="en-US"/>
+        </w:rPr>
+        <w:t>Click on PIM</w:t>
+      </w:r>
+    </w:p>
+    <w:p>
+      <w:pPr>
+        <w:pStyle w:val="ListParagraph"/>
+        <w:numPr>
+          <w:ilvl w:val="1"/>
+          <w:numId w:val="3"/>
+        </w:numPr>
+        <w:spacing w:line="254" w:lineRule="auto"/>
+        <w:rPr>
+          <w:sz w:val="24"/>
+          <w:szCs w:val="24"/>
+          <w:lang w:val="en-US"/>
+        </w:rPr>
+      </w:pPr>
+      <w:r>
+        <w:rPr>
+          <w:sz w:val="24"/>
+          <w:szCs w:val="24"/>
+          <w:lang w:val="en-US"/>
+        </w:rPr>
+        <w:t>Click on + Add button</w:t>
+      </w:r>
+    </w:p>
+    <w:p>
+      <w:pPr>
+        <w:pStyle w:val="ListParagraph"/>
+        <w:numPr>
+          <w:ilvl w:val="1"/>
+          <w:numId w:val="3"/>
+        </w:numPr>
+        <w:spacing w:line="254" w:lineRule="auto"/>
+        <w:rPr>
+          <w:sz w:val="24"/>
+          <w:szCs w:val="24"/>
+          <w:lang w:val="en-US"/>
+        </w:rPr>
+      </w:pPr>
+      <w:r>
+        <w:rPr>
+          <w:sz w:val="24"/>
+          <w:szCs w:val="24"/>
+          <w:lang w:val="en-US"/>
+        </w:rPr>
+        <w:t>Enter First Name</w:t>
+      </w:r>
+    </w:p>
+    <w:p>
+      <w:pPr>
+        <w:pStyle w:val="ListParagraph"/>
+        <w:numPr>
+          <w:ilvl w:val="1"/>
+          <w:numId w:val="3"/>
+        </w:numPr>
+        <w:spacing w:line="254" w:lineRule="auto"/>
+        <w:rPr>
+          <w:sz w:val="24"/>
+          <w:szCs w:val="24"/>
+          <w:lang w:val="en-US"/>
+        </w:rPr>
+      </w:pPr>
+      <w:r>
+        <w:rPr>
+          <w:sz w:val="24"/>
+          <w:szCs w:val="24"/>
+          <w:lang w:val="en-US"/>
+        </w:rPr>
+        <w:t>Enter Middle Name</w:t>
+      </w:r>
+    </w:p>
+    <w:p>
+      <w:pPr>
+        <w:pStyle w:val="ListParagraph"/>
+        <w:numPr>
+          <w:ilvl w:val="1"/>
+          <w:numId w:val="3"/>
+        </w:numPr>
+        <w:spacing w:line="254" w:lineRule="auto"/>
+        <w:rPr>
+          <w:sz w:val="24"/>
+          <w:szCs w:val="24"/>
+          <w:lang w:val="en-US"/>
+        </w:rPr>
+      </w:pPr>
+      <w:r>
+        <w:rPr>
+          <w:sz w:val="24"/>
+          <w:szCs w:val="24"/>
+          <w:lang w:val="en-US"/>
+        </w:rPr>
+        <w:t>Enter Last Name</w:t>
+      </w:r>
+    </w:p>
+    <w:p>
+      <w:pPr>
+        <w:pStyle w:val="ListParagraph"/>
+        <w:numPr>
+          <w:ilvl w:val="1"/>
+          <w:numId w:val="3"/>
+        </w:numPr>
+        <w:spacing w:line="254" w:lineRule="auto"/>
+        <w:rPr>
+          <w:sz w:val="24"/>
+          <w:szCs w:val="24"/>
+          <w:lang w:val="en-US"/>
+        </w:rPr>
+      </w:pPr>
+      <w:r>
+        <w:rPr>
+          <w:sz w:val="24"/>
+          <w:szCs w:val="24"/>
+          <w:lang w:val="en-US"/>
+        </w:rPr>
+        <w:t>Click on Create Login Details</w:t>
+      </w:r>
+    </w:p>
+    <w:p>
+      <w:pPr>
+        <w:pStyle w:val="ListParagraph"/>
+        <w:numPr>
+          <w:ilvl w:val="1"/>
+          <w:numId w:val="3"/>
+        </w:numPr>
+        <w:spacing w:line="254" w:lineRule="auto"/>
+        <w:rPr>
+          <w:sz w:val="24"/>
+          <w:szCs w:val="24"/>
+          <w:lang w:val="en-US"/>
+        </w:rPr>
+      </w:pPr>
+      <w:r>
+        <w:rPr>
+          <w:sz w:val="24"/>
+          <w:szCs w:val="24"/>
+          <w:lang w:val="en-US"/>
+        </w:rPr>
+        <w:t>Enter User Name</w:t>
+      </w:r>
+    </w:p>
+    <w:p>
+      <w:pPr>
+        <w:pStyle w:val="ListParagraph"/>
+        <w:numPr>
+          <w:ilvl w:val="1"/>
+          <w:numId w:val="3"/>
+        </w:numPr>
+        <w:spacing w:line="254" w:lineRule="auto"/>
+        <w:rPr>
+          <w:sz w:val="24"/>
+          <w:szCs w:val="24"/>
+          <w:lang w:val="en-US"/>
+        </w:rPr>
+      </w:pPr>
+      <w:r>
+        <w:rPr>
+          <w:sz w:val="24"/>
+          <w:szCs w:val="24"/>
+          <w:lang w:val="en-US"/>
+        </w:rPr>
+        <w:t>Enter Password</w:t>
+      </w:r>
+    </w:p>
+    <w:p>
+      <w:pPr>
+        <w:pStyle w:val="ListParagraph"/>
+        <w:numPr>
+          <w:ilvl w:val="1"/>
+          <w:numId w:val="3"/>
+        </w:numPr>
+        <w:spacing w:line="254" w:lineRule="auto"/>
+        <w:rPr>
+          <w:sz w:val="24"/>
+          <w:szCs w:val="24"/>
+          <w:lang w:val="en-US"/>
+        </w:rPr>
+      </w:pPr>
+      <w:r>
+        <w:rPr>
+          <w:sz w:val="24"/>
+          <w:szCs w:val="24"/>
+          <w:lang w:val="en-US"/>
+        </w:rPr>
+        <w:t>Enter Confirm Password</w:t>
+      </w:r>
+    </w:p>
+    <w:p>
+      <w:pPr>
+        <w:pStyle w:val="ListParagraph"/>
+        <w:numPr>
+          <w:ilvl w:val="1"/>
+          <w:numId w:val="3"/>
+        </w:numPr>
+        <w:spacing w:line="254" w:lineRule="auto"/>
+        <w:rPr>
+          <w:sz w:val="24"/>
+          <w:szCs w:val="24"/>
+          <w:lang w:val="en-US"/>
+        </w:rPr>
+      </w:pPr>
+      <w:r>
+        <w:rPr>
+          <w:sz w:val="24"/>
+          <w:szCs w:val="24"/>
+          <w:lang w:val="en-US"/>
+        </w:rPr>
+        <w:t>Click on Save Button</w:t>
+      </w:r>
+    </w:p>
+    <w:p>
+      <w:pPr>
+        <w:pStyle w:val="ListParagraph"/>
+        <w:numPr>
+          <w:ilvl w:val="1"/>
+          <w:numId w:val="3"/>
+        </w:numPr>
+        <w:spacing w:line="254" w:lineRule="auto"/>
+        <w:rPr>
+          <w:sz w:val="24"/>
+          <w:szCs w:val="24"/>
+          <w:lang w:val="en-US"/>
+        </w:rPr>
+      </w:pPr>
+      <w:r>
+        <w:rPr>
+          <w:sz w:val="24"/>
+          <w:szCs w:val="24"/>
+          <w:lang w:val="en-US"/>
+        </w:rPr>
+        <w:t>Logout</w:t>
+      </w:r>
+    </w:p>
+    <w:p>
+      <w:pPr>
+        <w:pStyle w:val="ListParagraph"/>
+        <w:numPr>
+          <w:ilvl w:val="1"/>
+          <w:numId w:val="3"/>
+        </w:numPr>
+        <w:spacing w:line="254" w:lineRule="auto"/>
+        <w:rPr>
+          <w:sz w:val="24"/>
+          <w:szCs w:val="24"/>
+          <w:lang w:val="en-US"/>
+        </w:rPr>
+      </w:pPr>
+      <w:r>
+        <w:rPr>
+          <w:sz w:val="24"/>
+          <w:szCs w:val="24"/>
+          <w:lang w:val="en-US"/>
+        </w:rPr>
+        <w:t xml:space="preserve">Login using data provided in step no h &amp; </w:t>
+      </w:r>
+      <w:proofErr w:type="spellStart"/>
+      <w:r>
+        <w:rPr>
+          <w:sz w:val="24"/>
+          <w:szCs w:val="24"/>
+          <w:lang w:val="en-US"/>
+        </w:rPr>
+        <w:t>i</w:t>
+      </w:r>
+      <w:proofErr w:type="spellEnd"/>
+    </w:p>
+    <w:p>
+      <w:pPr>
+        <w:pStyle w:val="ListParagraph"/>
+        <w:numPr>
+          <w:ilvl w:val="1"/>
+          <w:numId w:val="3"/>
+        </w:numPr>
+        <w:spacing w:line="254" w:lineRule="auto"/>
+        <w:rPr>
+          <w:sz w:val="24"/>
+          <w:szCs w:val="24"/>
+          <w:lang w:val="en-US"/>
+        </w:rPr>
+      </w:pPr>
+      <w:r>
+        <w:rPr>
+          <w:sz w:val="24"/>
+          <w:szCs w:val="24"/>
+          <w:lang w:val="en-US"/>
+        </w:rPr>
+        <w:lastRenderedPageBreak/>
+        <w:t>Display name of employee on logout link</w:t>
+      </w:r>
+    </w:p>
+    <w:p>
+      <w:pPr>
+        <w:pStyle w:val="ListParagraph"/>
+        <w:numPr>
+          <w:ilvl w:val="1"/>
+          <w:numId w:val="3"/>
+        </w:numPr>
+        <w:spacing w:line="254" w:lineRule="auto"/>
+        <w:rPr>
+          <w:sz w:val="24"/>
+          <w:szCs w:val="24"/>
+          <w:lang w:val="en-US"/>
+        </w:rPr>
+      </w:pPr>
+      <w:r>
+        <w:rPr>
+          <w:sz w:val="24"/>
+          <w:szCs w:val="24"/>
+          <w:lang w:val="en-US"/>
+        </w:rPr>
+        <w:t>Click on My Info</w:t>
+      </w:r>
+    </w:p>
+    <w:p>
+      <w:pPr>
+        <w:pStyle w:val="ListParagraph"/>
+        <w:numPr>
+          <w:ilvl w:val="1"/>
+          <w:numId w:val="3"/>
+        </w:numPr>
+        <w:spacing w:line="254" w:lineRule="auto"/>
+        <w:rPr>
+          <w:sz w:val="24"/>
+          <w:szCs w:val="24"/>
+          <w:lang w:val="en-US"/>
+        </w:rPr>
+      </w:pPr>
+      <w:r>
+        <w:rPr>
+          <w:sz w:val="24"/>
+          <w:szCs w:val="24"/>
+          <w:lang w:val="en-US"/>
+        </w:rPr>
+        <w:t>Display the Employee ID</w:t>
+      </w:r>
+    </w:p>
+    <w:p>
+      <w:pPr>
+        <w:pStyle w:val="ListParagraph"/>
+        <w:numPr>
+          <w:ilvl w:val="1"/>
+          <w:numId w:val="3"/>
+        </w:numPr>
+        <w:spacing w:line="254" w:lineRule="auto"/>
+        <w:rPr>
+          <w:sz w:val="24"/>
+          <w:szCs w:val="24"/>
+          <w:lang w:val="en-US"/>
+        </w:rPr>
+      </w:pPr>
+      <w:r>
+        <w:rPr>
+          <w:sz w:val="24"/>
+          <w:szCs w:val="24"/>
+          <w:lang w:val="en-US"/>
+        </w:rPr>
+        <w:t>Logout</w:t>
+      </w:r>
+    </w:p>
+    <w:p>
+      <w:pPr>
+        <w:pStyle w:val="ListParagraph"/>
+        <w:numPr>
+          <w:ilvl w:val="1"/>
+          <w:numId w:val="3"/>
+        </w:numPr>
+        <w:spacing w:line="254" w:lineRule="auto"/>
+        <w:rPr>
+          <w:sz w:val="24"/>
+          <w:szCs w:val="24"/>
+          <w:lang w:val="en-US"/>
+        </w:rPr>
+      </w:pPr>
+      <w:r>
+        <w:rPr>
+          <w:sz w:val="24"/>
+          <w:szCs w:val="24"/>
+          <w:lang w:val="en-US"/>
+        </w:rPr>
+        <w:t>Login with admin</w:t>
+      </w:r>
+    </w:p>
+    <w:p>
+      <w:pPr>
+        <w:pStyle w:val="ListParagraph"/>
+        <w:numPr>
+          <w:ilvl w:val="1"/>
+          <w:numId w:val="3"/>
+        </w:numPr>
+        <w:spacing w:line="254" w:lineRule="auto"/>
+        <w:rPr>
+          <w:sz w:val="24"/>
+          <w:szCs w:val="24"/>
+          <w:lang w:val="en-US"/>
+        </w:rPr>
+      </w:pPr>
+      <w:r>
+        <w:rPr>
+          <w:sz w:val="24"/>
+          <w:szCs w:val="24"/>
+          <w:lang w:val="en-US"/>
+        </w:rPr>
+        <w:t>Click on Admin</w:t>
+      </w:r>
+    </w:p>
+    <w:p>
+      <w:pPr>
+        <w:pStyle w:val="ListParagraph"/>
+        <w:numPr>
+          <w:ilvl w:val="1"/>
+          <w:numId w:val="3"/>
+        </w:numPr>
+        <w:spacing w:line="254" w:lineRule="auto"/>
+        <w:rPr>
+          <w:sz w:val="24"/>
+          <w:szCs w:val="24"/>
+          <w:lang w:val="en-US"/>
+        </w:rPr>
+      </w:pPr>
+      <w:r>
+        <w:rPr>
+          <w:sz w:val="24"/>
+          <w:szCs w:val="24"/>
+          <w:lang w:val="en-US"/>
+        </w:rPr>
+        <w:t>Enter user name</w:t>
+      </w:r>
+    </w:p>
+    <w:p>
+      <w:pPr>
+        <w:pStyle w:val="ListParagraph"/>
+        <w:numPr>
+          <w:ilvl w:val="1"/>
+          <w:numId w:val="3"/>
+        </w:numPr>
+        <w:spacing w:line="254" w:lineRule="auto"/>
+        <w:rPr>
+          <w:sz w:val="24"/>
+          <w:szCs w:val="24"/>
+          <w:lang w:val="en-US"/>
+        </w:rPr>
+      </w:pPr>
+      <w:r>
+        <w:rPr>
+          <w:sz w:val="24"/>
+          <w:szCs w:val="24"/>
+          <w:lang w:val="en-US"/>
+        </w:rPr>
+        <w:t xml:space="preserve">Click on Search </w:t>
+      </w:r>
+    </w:p>
+    <w:p>
+      <w:pPr>
+        <w:pStyle w:val="ListParagraph"/>
+        <w:numPr>
+          <w:ilvl w:val="1"/>
+          <w:numId w:val="3"/>
+        </w:numPr>
+        <w:spacing w:line="254" w:lineRule="auto"/>
+        <w:rPr>
+          <w:sz w:val="24"/>
+          <w:szCs w:val="24"/>
+          <w:lang w:val="en-US"/>
+        </w:rPr>
+      </w:pPr>
+      <w:r>
+        <w:rPr>
+          <w:sz w:val="24"/>
+          <w:szCs w:val="24"/>
+          <w:lang w:val="en-US"/>
+        </w:rPr>
+        <w:t>Delete the record displayed</w:t>
+      </w:r>
+    </w:p>
+    <w:p>
+      <w:pPr>
+        <w:pStyle w:val="ListParagraph"/>
+        <w:numPr>
+          <w:ilvl w:val="1"/>
+          <w:numId w:val="3"/>
+        </w:numPr>
+        <w:rPr>
+          <w:sz w:val="26"/>
+          <w:szCs w:val="24"/>
+          <w:lang w:val="en-US"/>
+        </w:rPr>
+      </w:pPr>
+      <w:r>
+        <w:rPr>
+          <w:sz w:val="24"/>
+          <w:szCs w:val="24"/>
+          <w:lang w:val="en-US"/>
+        </w:rPr>
+        <w:t>Logout</w:t>
+      </w:r>
+    </w:p>
+    <w:p>
+      <w:pPr>
+        <w:pStyle w:val="ListParagraph"/>
+        <w:numPr>
+          <w:ilvl w:val="0"/>
+          <w:numId w:val="3"/>
+        </w:numPr>
+        <w:spacing w:line="254" w:lineRule="auto"/>
+        <w:rPr>
+          <w:sz w:val="24"/>
+          <w:szCs w:val="24"/>
+          <w:lang w:val="en-US"/>
+        </w:rPr>
+      </w:pPr>
+      <w:r>
+        <w:rPr>
+          <w:sz w:val="24"/>
+          <w:szCs w:val="24"/>
+          <w:lang w:val="en-US"/>
+        </w:rPr>
+        <w:t xml:space="preserve">Open </w:t>
+      </w:r>
+      <w:hyperlink r:id="rId28" w:history="1">
+        <w:r>
+          <w:rPr>
+            <w:rStyle w:val="Hyperlink"/>
+            <w:sz w:val="24"/>
+            <w:szCs w:val="24"/>
+            <w:lang w:val="en-US"/>
+          </w:rPr>
+          <w:t>https://www.rediff.com/</w:t>
+        </w:r>
+      </w:hyperlink>
+      <w:r>
+        <w:rPr>
+          <w:sz w:val="24"/>
+          <w:szCs w:val="24"/>
+          <w:lang w:val="en-US"/>
+        </w:rPr>
+        <w:t xml:space="preserve"> </w:t>
+      </w:r>
+    </w:p>
+    <w:p>
+      <w:pPr>
+        <w:pStyle w:val="ListParagraph"/>
+        <w:numPr>
+          <w:ilvl w:val="1"/>
+          <w:numId w:val="3"/>
+        </w:numPr>
+        <w:spacing w:line="254" w:lineRule="auto"/>
+        <w:rPr>
+          <w:sz w:val="24"/>
+          <w:szCs w:val="24"/>
+          <w:lang w:val="en-US"/>
+        </w:rPr>
+      </w:pPr>
+      <w:r>
+        <w:rPr>
+          <w:sz w:val="24"/>
+          <w:szCs w:val="24"/>
+          <w:lang w:val="en-US"/>
+        </w:rPr>
+        <w:t>Click on Money</w:t>
+      </w:r>
+    </w:p>
+    <w:p>
+      <w:pPr>
+        <w:pStyle w:val="ListParagraph"/>
+        <w:numPr>
+          <w:ilvl w:val="1"/>
+          <w:numId w:val="3"/>
+        </w:numPr>
+        <w:spacing w:line="254" w:lineRule="auto"/>
+        <w:rPr>
+          <w:sz w:val="24"/>
+          <w:szCs w:val="24"/>
+          <w:lang w:val="en-US"/>
+        </w:rPr>
+      </w:pPr>
+      <w:r>
+        <w:rPr>
+          <w:sz w:val="24"/>
+          <w:szCs w:val="24"/>
+          <w:lang w:val="en-US"/>
+        </w:rPr>
+        <w:t>Click on More Gainers</w:t>
+      </w:r>
+    </w:p>
+    <w:p>
+      <w:pPr>
+        <w:pStyle w:val="ListParagraph"/>
+        <w:numPr>
+          <w:ilvl w:val="1"/>
+          <w:numId w:val="3"/>
+        </w:numPr>
+        <w:spacing w:line="254" w:lineRule="auto"/>
+        <w:rPr>
+          <w:sz w:val="24"/>
+          <w:szCs w:val="24"/>
+          <w:lang w:val="en-US"/>
+        </w:rPr>
+      </w:pPr>
+      <w:r>
+        <w:rPr>
+          <w:sz w:val="24"/>
+          <w:szCs w:val="24"/>
+          <w:lang w:val="en-US"/>
+        </w:rPr>
+        <w:t>Display title of all the headers</w:t>
+      </w:r>
+    </w:p>
+    <w:p>
+      <w:pPr>
+        <w:pStyle w:val="ListParagraph"/>
+        <w:numPr>
+          <w:ilvl w:val="1"/>
+          <w:numId w:val="3"/>
+        </w:numPr>
+        <w:spacing w:line="254" w:lineRule="auto"/>
+        <w:rPr>
+          <w:sz w:val="24"/>
+          <w:szCs w:val="24"/>
+          <w:lang w:val="en-US"/>
+        </w:rPr>
+      </w:pPr>
+      <w:r>
+        <w:rPr>
+          <w:sz w:val="24"/>
+          <w:szCs w:val="24"/>
+          <w:lang w:val="en-US"/>
+        </w:rPr>
+        <w:t>Display total no of rows</w:t>
+      </w:r>
+    </w:p>
+    <w:p>
+      <w:pPr>
+        <w:pStyle w:val="ListParagraph"/>
+        <w:numPr>
+          <w:ilvl w:val="1"/>
+          <w:numId w:val="3"/>
+        </w:numPr>
+        <w:spacing w:line="254" w:lineRule="auto"/>
+        <w:rPr>
+          <w:sz w:val="24"/>
+          <w:szCs w:val="24"/>
+          <w:lang w:val="en-US"/>
+        </w:rPr>
+      </w:pPr>
+      <w:r>
+        <w:rPr>
+          <w:sz w:val="24"/>
+          <w:szCs w:val="24"/>
+          <w:lang w:val="en-US"/>
+        </w:rPr>
+        <w:t>Display any row randomly</w:t>
+      </w:r>
+    </w:p>
+    <w:p>
+      <w:pPr>
+        <w:pStyle w:val="ListParagraph"/>
+        <w:numPr>
+          <w:ilvl w:val="1"/>
+          <w:numId w:val="3"/>
+        </w:numPr>
+        <w:spacing w:line="254" w:lineRule="auto"/>
+        <w:rPr>
+          <w:sz w:val="24"/>
+          <w:szCs w:val="24"/>
+          <w:lang w:val="en-US"/>
+        </w:rPr>
+      </w:pPr>
+      <w:r>
+        <w:rPr>
+          <w:sz w:val="24"/>
+          <w:szCs w:val="24"/>
+          <w:lang w:val="en-US"/>
+        </w:rPr>
+        <w:t>Display list of all the companies (Company name only)</w:t>
+      </w:r>
+    </w:p>
+    <w:p>
+      <w:pPr>
+        <w:pStyle w:val="ListParagraph"/>
+        <w:numPr>
+          <w:ilvl w:val="1"/>
+          <w:numId w:val="3"/>
+        </w:numPr>
+        <w:rPr>
+          <w:sz w:val="24"/>
+          <w:szCs w:val="24"/>
+          <w:lang w:val="en-US"/>
+        </w:rPr>
+      </w:pPr>
+      <w:r>
+        <w:rPr>
+          <w:sz w:val="24"/>
+          <w:szCs w:val="24"/>
+          <w:lang w:val="en-US"/>
+        </w:rPr>
+        <w:t>Read all current price and display the highest price.</w:t>
+      </w:r>
+      <w:r>
+        <w:rPr>
+          <w:sz w:val="24"/>
+          <w:szCs w:val="24"/>
+          <w:lang w:val="en-US"/>
+        </w:rPr>
+        <w:br/>
+        <w:t>(Read all the current price, store in array and then sort an array so you will get highest price)</w:t>
+      </w:r>
+    </w:p>
+    <w:p>
+      <w:pPr>
+        <w:pStyle w:val="ListParagraph"/>
+        <w:numPr>
+          <w:ilvl w:val="0"/>
+          <w:numId w:val="3"/>
+        </w:numPr>
+        <w:spacing w:line="254" w:lineRule="auto"/>
+        <w:rPr>
+          <w:sz w:val="24"/>
+          <w:szCs w:val="24"/>
+          <w:lang w:val="en-US"/>
+        </w:rPr>
+      </w:pPr>
+      <w:r>
+        <w:rPr>
+          <w:sz w:val="24"/>
+          <w:szCs w:val="24"/>
+          <w:lang w:val="en-US"/>
+        </w:rPr>
+        <w:t xml:space="preserve">Open </w:t>
+      </w:r>
+      <w:hyperlink r:id="rId29" w:history="1">
+        <w:r>
+          <w:rPr>
+            <w:rStyle w:val="Hyperlink"/>
+            <w:sz w:val="24"/>
+            <w:szCs w:val="24"/>
+            <w:lang w:val="en-US"/>
+          </w:rPr>
+          <w:t>https://demoqa.com</w:t>
+        </w:r>
+        <w:bookmarkStart w:id="0" w:name="_GoBack"/>
+        <w:bookmarkEnd w:id="0"/>
+        <w:r>
+          <w:rPr>
+            <w:rStyle w:val="Hyperlink"/>
+            <w:sz w:val="24"/>
+            <w:szCs w:val="24"/>
+            <w:lang w:val="en-US"/>
+          </w:rPr>
+          <w:t>/</w:t>
+        </w:r>
+        <w:r>
+          <w:rPr>
+            <w:rStyle w:val="Hyperlink"/>
+            <w:sz w:val="24"/>
+            <w:szCs w:val="24"/>
+            <w:lang w:val="en-US"/>
+          </w:rPr>
+          <w:t>webtables</w:t>
+        </w:r>
+      </w:hyperlink>
+      <w:r>
+        <w:rPr>
+          <w:sz w:val="24"/>
+          <w:szCs w:val="24"/>
+          <w:lang w:val="en-US"/>
+        </w:rPr>
+        <w:t xml:space="preserve"> </w:t>
+      </w:r>
+    </w:p>
+    <w:p>
+      <w:pPr>
+        <w:pStyle w:val="ListParagraph"/>
+        <w:numPr>
+          <w:ilvl w:val="1"/>
+          <w:numId w:val="3"/>
+        </w:numPr>
+        <w:spacing w:line="254" w:lineRule="auto"/>
+        <w:rPr>
+          <w:sz w:val="24"/>
+          <w:szCs w:val="24"/>
+          <w:lang w:val="en-US"/>
+        </w:rPr>
+      </w:pPr>
+      <w:r>
+        <w:rPr>
+          <w:sz w:val="24"/>
+          <w:szCs w:val="24"/>
+          <w:lang w:val="en-US"/>
+        </w:rPr>
+        <w:t>Try to display all header columns</w:t>
+      </w:r>
+    </w:p>
+    <w:p>
+      <w:pPr>
+        <w:pStyle w:val="ListParagraph"/>
+        <w:numPr>
+          <w:ilvl w:val="1"/>
+          <w:numId w:val="3"/>
+        </w:numPr>
+        <w:spacing w:line="254" w:lineRule="auto"/>
+        <w:rPr>
+          <w:sz w:val="24"/>
+          <w:szCs w:val="24"/>
+          <w:lang w:val="en-US"/>
+        </w:rPr>
+      </w:pPr>
+      <w:r>
+        <w:rPr>
+          <w:sz w:val="24"/>
+          <w:szCs w:val="24"/>
+          <w:lang w:val="en-US"/>
+        </w:rPr>
+        <w:t>Click on Add button</w:t>
+      </w:r>
+    </w:p>
+    <w:p>
+      <w:pPr>
+        <w:pStyle w:val="ListParagraph"/>
+        <w:numPr>
+          <w:ilvl w:val="1"/>
+          <w:numId w:val="3"/>
+        </w:numPr>
+        <w:spacing w:line="254" w:lineRule="auto"/>
+        <w:rPr>
+          <w:sz w:val="24"/>
+          <w:szCs w:val="24"/>
+          <w:lang w:val="en-US"/>
+        </w:rPr>
+      </w:pPr>
+      <w:r>
+        <w:rPr>
+          <w:sz w:val="24"/>
+          <w:szCs w:val="24"/>
+          <w:lang w:val="en-US"/>
+        </w:rPr>
+        <w:t>Enter all the data</w:t>
+      </w:r>
+    </w:p>
+    <w:p>
+      <w:pPr>
+        <w:pStyle w:val="ListParagraph"/>
+        <w:numPr>
+          <w:ilvl w:val="1"/>
+          <w:numId w:val="3"/>
+        </w:numPr>
+        <w:spacing w:line="254" w:lineRule="auto"/>
+        <w:rPr>
+          <w:sz w:val="24"/>
+          <w:szCs w:val="24"/>
+          <w:lang w:val="en-US"/>
+        </w:rPr>
+      </w:pPr>
+      <w:r>
+        <w:rPr>
+          <w:sz w:val="24"/>
+          <w:szCs w:val="24"/>
+          <w:lang w:val="en-US"/>
+        </w:rPr>
+        <w:t>Search the first name in First Name column</w:t>
+      </w:r>
+    </w:p>
+    <w:p>
+      <w:pPr>
+        <w:pStyle w:val="ListParagraph"/>
+        <w:numPr>
+          <w:ilvl w:val="1"/>
+          <w:numId w:val="3"/>
+        </w:numPr>
+        <w:spacing w:line="254" w:lineRule="auto"/>
+        <w:rPr>
+          <w:sz w:val="24"/>
+          <w:szCs w:val="24"/>
+          <w:lang w:val="en-US"/>
+        </w:rPr>
+      </w:pPr>
+      <w:r>
+        <w:rPr>
+          <w:sz w:val="24"/>
+          <w:szCs w:val="24"/>
+          <w:lang w:val="en-US"/>
+        </w:rPr>
+        <w:t>Click on delete button in the same row (Don’t copy the xpath of delete button from last row)</w:t>
+      </w:r>
+    </w:p>
+    <w:p>
+      <w:pPr>
+        <w:pStyle w:val="ListParagraph"/>
+        <w:numPr>
+          <w:ilvl w:val="0"/>
+          <w:numId w:val="3"/>
+        </w:numPr>
+        <w:spacing w:line="254" w:lineRule="auto"/>
+        <w:rPr>
+          <w:sz w:val="24"/>
+          <w:szCs w:val="24"/>
+          <w:lang w:val="en-US"/>
+        </w:rPr>
+      </w:pPr>
+      <w:r>
+        <w:rPr>
+          <w:sz w:val="24"/>
+          <w:szCs w:val="24"/>
+          <w:lang w:val="en-US"/>
+        </w:rPr>
+        <w:t xml:space="preserve">Open </w:t>
+      </w:r>
+      <w:hyperlink r:id="rId30" w:history="1">
+        <w:r>
+          <w:rPr>
+            <w:rStyle w:val="Hyperlink"/>
+            <w:sz w:val="24"/>
+            <w:szCs w:val="24"/>
+            <w:lang w:val="en-US"/>
+          </w:rPr>
+          <w:t>https://www.iplt20.com/points-table/men/2024</w:t>
+        </w:r>
+      </w:hyperlink>
+      <w:r>
+        <w:rPr>
+          <w:sz w:val="24"/>
+          <w:szCs w:val="24"/>
+          <w:lang w:val="en-US"/>
+        </w:rPr>
+        <w:t xml:space="preserve"> </w:t>
+      </w:r>
+    </w:p>
+    <w:p>
+      <w:pPr>
+        <w:pStyle w:val="ListParagraph"/>
+        <w:numPr>
+          <w:ilvl w:val="1"/>
+          <w:numId w:val="3"/>
+        </w:numPr>
+        <w:spacing w:line="254" w:lineRule="auto"/>
+        <w:rPr>
+          <w:sz w:val="24"/>
+          <w:szCs w:val="24"/>
+          <w:lang w:val="en-US"/>
+        </w:rPr>
+      </w:pPr>
+      <w:r>
+        <w:rPr>
+          <w:sz w:val="24"/>
+          <w:szCs w:val="24"/>
+          <w:lang w:val="en-US"/>
+        </w:rPr>
+        <w:t>Display list of all the Teams</w:t>
+      </w:r>
+    </w:p>
+    <w:p>
+      <w:pPr>
+        <w:pStyle w:val="ListParagraph"/>
+        <w:numPr>
+          <w:ilvl w:val="1"/>
+          <w:numId w:val="3"/>
+        </w:numPr>
+        <w:spacing w:line="254" w:lineRule="auto"/>
+        <w:rPr>
+          <w:sz w:val="24"/>
+          <w:szCs w:val="24"/>
+          <w:lang w:val="en-US"/>
+        </w:rPr>
+      </w:pPr>
+      <w:r>
+        <w:rPr>
+          <w:sz w:val="24"/>
+          <w:szCs w:val="24"/>
+          <w:lang w:val="en-US"/>
+        </w:rPr>
+        <w:t>Display all result of each team about N W L</w:t>
+      </w:r>
+    </w:p>
+    <w:p>
+      <w:pPr>
+        <w:pStyle w:val="ListParagraph"/>
+        <w:rPr>
+          <w:sz w:val="24"/>
+          <w:szCs w:val="24"/>
+          <w:lang w:val="en-US"/>
+        </w:rPr>
+      </w:pPr>
+      <w:r>
+        <w:rPr>
+          <w:sz w:val="24"/>
+          <w:szCs w:val="24"/>
+          <w:lang w:val="en-US"/>
+        </w:rPr>
+        <w:t>Display count of N, W &amp; L</w:t>
+      </w:r>
+      <w:r>
+        <w:rPr>
+          <w:sz w:val="24"/>
+          <w:szCs w:val="24"/>
+          <w:lang w:val="en-US"/>
+        </w:rPr>
+        <w:br/>
+        <w:t>Display the result as follow</w:t>
+      </w:r>
+      <w:r>
+        <w:rPr>
+          <w:sz w:val="24"/>
+          <w:szCs w:val="24"/>
+          <w:lang w:val="en-US"/>
+        </w:rPr>
+        <w:br/>
+        <w:t>KKR</w:t>
+      </w:r>
+      <w:r>
+        <w:rPr>
+          <w:sz w:val="24"/>
+          <w:szCs w:val="24"/>
+          <w:lang w:val="en-US"/>
+        </w:rPr>
+        <w:tab/>
+        <w:t>NNWWW</w:t>
+      </w:r>
+      <w:r>
+        <w:rPr>
+          <w:sz w:val="24"/>
+          <w:szCs w:val="24"/>
+          <w:lang w:val="en-US"/>
+        </w:rPr>
+        <w:tab/>
+        <w:t>N-2, W-3, L-0</w:t>
+      </w:r>
+    </w:p>
+    <w:p>
+      <w:pPr>
+        <w:pStyle w:val="ListParagraph"/>
+        <w:numPr>
+          <w:ilvl w:val="0"/>
+          <w:numId w:val="3"/>
+        </w:numPr>
+        <w:rPr>
+          <w:sz w:val="24"/>
+          <w:szCs w:val="24"/>
+          <w:lang w:val="en-US"/>
+        </w:rPr>
+      </w:pPr>
     </w:p>
     <w:sectPr>
       <w:pgSz w:w="11906" w:h="16838"/>

</xml_diff>

<commit_message>
Date: 06 Nov 2025
</commit_message>
<xml_diff>
--- a/Assignments.docx
+++ b/Assignments.docx
@@ -4637,27 +4637,7 @@
             <w:szCs w:val="24"/>
             <w:lang w:val="en-US"/>
           </w:rPr>
-          <w:t>https://demoqa.com</w:t>
-        </w:r>
-        <w:bookmarkStart w:id="0" w:name="_GoBack"/>
-        <w:bookmarkEnd w:id="0"/>
-        <w:r>
-          <w:rPr>
-            <w:rStyle w:val="Hyperlink"/>
-            <w:sz w:val="24"/>
-            <w:szCs w:val="24"/>
-            <w:lang w:val="en-US"/>
-          </w:rPr>
-          <w:t>/</w:t>
-        </w:r>
-        <w:r>
-          <w:rPr>
-            <w:rStyle w:val="Hyperlink"/>
-            <w:sz w:val="24"/>
-            <w:szCs w:val="24"/>
-            <w:lang w:val="en-US"/>
-          </w:rPr>
-          <w:t>webtables</w:t>
+          <w:t>https://demoqa.com/webtables</w:t>
         </w:r>
       </w:hyperlink>
       <w:r>
@@ -4924,6 +4904,129 @@
         </w:rPr>
         <w:tab/>
         <w:t>N-2, W-3, L-0</w:t>
+      </w:r>
+    </w:p>
+    <w:p>
+      <w:pPr>
+        <w:pStyle w:val="ListParagraph"/>
+        <w:numPr>
+          <w:ilvl w:val="0"/>
+          <w:numId w:val="4"/>
+        </w:numPr>
+        <w:spacing w:line="254" w:lineRule="auto"/>
+        <w:rPr>
+          <w:sz w:val="24"/>
+          <w:szCs w:val="24"/>
+          <w:lang w:val="en-US"/>
+        </w:rPr>
+      </w:pPr>
+      <w:r>
+        <w:rPr>
+          <w:sz w:val="24"/>
+          <w:szCs w:val="24"/>
+          <w:lang w:val="en-US"/>
+        </w:rPr>
+        <w:t xml:space="preserve">Open </w:t>
+      </w:r>
+      <w:hyperlink r:id="rId31" w:history="1">
+        <w:r>
+          <w:rPr>
+            <w:rStyle w:val="Hyperlink"/>
+            <w:sz w:val="24"/>
+            <w:szCs w:val="24"/>
+            <w:lang w:val="en-US"/>
+          </w:rPr>
+          <w:t>https://sampleapp.tricen</w:t>
+        </w:r>
+        <w:bookmarkStart w:id="0" w:name="_GoBack"/>
+        <w:bookmarkEnd w:id="0"/>
+        <w:r>
+          <w:rPr>
+            <w:rStyle w:val="Hyperlink"/>
+            <w:sz w:val="24"/>
+            <w:szCs w:val="24"/>
+            <w:lang w:val="en-US"/>
+          </w:rPr>
+          <w:t>t</w:t>
+        </w:r>
+        <w:r>
+          <w:rPr>
+            <w:rStyle w:val="Hyperlink"/>
+            <w:sz w:val="24"/>
+            <w:szCs w:val="24"/>
+            <w:lang w:val="en-US"/>
+          </w:rPr>
+          <w:t>is.com/101/index.php</w:t>
+        </w:r>
+      </w:hyperlink>
+    </w:p>
+    <w:p>
+      <w:pPr>
+        <w:pStyle w:val="ListParagraph"/>
+        <w:numPr>
+          <w:ilvl w:val="1"/>
+          <w:numId w:val="4"/>
+        </w:numPr>
+        <w:spacing w:line="254" w:lineRule="auto"/>
+        <w:rPr>
+          <w:sz w:val="24"/>
+          <w:szCs w:val="24"/>
+          <w:lang w:val="en-US"/>
+        </w:rPr>
+      </w:pPr>
+      <w:r>
+        <w:rPr>
+          <w:sz w:val="24"/>
+          <w:szCs w:val="24"/>
+          <w:lang w:val="en-US"/>
+        </w:rPr>
+        <w:t>Click on Automobile</w:t>
+      </w:r>
+    </w:p>
+    <w:p>
+      <w:pPr>
+        <w:pStyle w:val="ListParagraph"/>
+        <w:numPr>
+          <w:ilvl w:val="1"/>
+          <w:numId w:val="4"/>
+        </w:numPr>
+        <w:spacing w:line="254" w:lineRule="auto"/>
+        <w:rPr>
+          <w:sz w:val="24"/>
+          <w:szCs w:val="24"/>
+          <w:lang w:val="en-US"/>
+        </w:rPr>
+      </w:pPr>
+      <w:r>
+        <w:rPr>
+          <w:sz w:val="24"/>
+          <w:szCs w:val="24"/>
+          <w:lang w:val="en-US"/>
+        </w:rPr>
+        <w:t>Click on Enter Insurant Data</w:t>
+      </w:r>
+    </w:p>
+    <w:p>
+      <w:pPr>
+        <w:pStyle w:val="ListParagraph"/>
+        <w:numPr>
+          <w:ilvl w:val="1"/>
+          <w:numId w:val="4"/>
+        </w:numPr>
+        <w:spacing w:line="254" w:lineRule="auto"/>
+        <w:rPr>
+          <w:sz w:val="24"/>
+          <w:szCs w:val="24"/>
+          <w:lang w:val="en-US"/>
+        </w:rPr>
+      </w:pPr>
+      <w:r>
+        <w:rPr>
+          <w:sz w:val="24"/>
+          <w:szCs w:val="24"/>
+          <w:lang w:val="en-US"/>
+        </w:rPr>
+        <w:t>Upload your picture</w:t>
       </w:r>
     </w:p>
     <w:p>

</xml_diff>

<commit_message>
Date: 07 Nov 2025
</commit_message>
<xml_diff>
--- a/Assignments.docx
+++ b/Assignments.docx
@@ -4911,9 +4911,8 @@
         <w:pStyle w:val="ListParagraph"/>
         <w:numPr>
           <w:ilvl w:val="0"/>
-          <w:numId w:val="4"/>
-        </w:numPr>
-        <w:spacing w:line="254" w:lineRule="auto"/>
+          <w:numId w:val="3"/>
+        </w:numPr>
         <w:rPr>
           <w:sz w:val="24"/>
           <w:szCs w:val="24"/>
@@ -4936,10 +4935,101 @@
             <w:szCs w:val="24"/>
             <w:lang w:val="en-US"/>
           </w:rPr>
-          <w:t>https://sampleapp.tricen</w:t>
+          <w:t>https://sampleapp.tricentis.com/101/index.php</w:t>
         </w:r>
-        <w:bookmarkStart w:id="0" w:name="_GoBack"/>
-        <w:bookmarkEnd w:id="0"/>
+      </w:hyperlink>
+    </w:p>
+    <w:p>
+      <w:pPr>
+        <w:pStyle w:val="ListParagraph"/>
+        <w:numPr>
+          <w:ilvl w:val="1"/>
+          <w:numId w:val="4"/>
+        </w:numPr>
+        <w:spacing w:line="254" w:lineRule="auto"/>
+        <w:rPr>
+          <w:sz w:val="24"/>
+          <w:szCs w:val="24"/>
+          <w:lang w:val="en-US"/>
+        </w:rPr>
+      </w:pPr>
+      <w:r>
+        <w:rPr>
+          <w:sz w:val="24"/>
+          <w:szCs w:val="24"/>
+          <w:lang w:val="en-US"/>
+        </w:rPr>
+        <w:t>Click on Automobile</w:t>
+      </w:r>
+    </w:p>
+    <w:p>
+      <w:pPr>
+        <w:pStyle w:val="ListParagraph"/>
+        <w:numPr>
+          <w:ilvl w:val="1"/>
+          <w:numId w:val="4"/>
+        </w:numPr>
+        <w:spacing w:line="254" w:lineRule="auto"/>
+        <w:rPr>
+          <w:sz w:val="24"/>
+          <w:szCs w:val="24"/>
+          <w:lang w:val="en-US"/>
+        </w:rPr>
+      </w:pPr>
+      <w:r>
+        <w:rPr>
+          <w:sz w:val="24"/>
+          <w:szCs w:val="24"/>
+          <w:lang w:val="en-US"/>
+        </w:rPr>
+        <w:t>Click on Enter Insurant Data</w:t>
+      </w:r>
+    </w:p>
+    <w:p>
+      <w:pPr>
+        <w:pStyle w:val="ListParagraph"/>
+        <w:numPr>
+          <w:ilvl w:val="1"/>
+          <w:numId w:val="4"/>
+        </w:numPr>
+        <w:spacing w:line="254" w:lineRule="auto"/>
+        <w:rPr>
+          <w:sz w:val="24"/>
+          <w:szCs w:val="24"/>
+          <w:lang w:val="en-US"/>
+        </w:rPr>
+      </w:pPr>
+      <w:r>
+        <w:rPr>
+          <w:sz w:val="24"/>
+          <w:szCs w:val="24"/>
+          <w:lang w:val="en-US"/>
+        </w:rPr>
+        <w:t>Upload your picture</w:t>
+      </w:r>
+    </w:p>
+    <w:p>
+      <w:pPr>
+        <w:pStyle w:val="ListParagraph"/>
+        <w:numPr>
+          <w:ilvl w:val="0"/>
+          <w:numId w:val="3"/>
+        </w:numPr>
+        <w:rPr>
+          <w:sz w:val="24"/>
+          <w:szCs w:val="24"/>
+          <w:lang w:val="en-US"/>
+        </w:rPr>
+      </w:pPr>
+      <w:r>
+        <w:rPr>
+          <w:sz w:val="24"/>
+          <w:szCs w:val="24"/>
+          <w:lang w:val="en-US"/>
+        </w:rPr>
+        <w:t xml:space="preserve">Open </w:t>
+      </w:r>
+      <w:hyperlink r:id="rId32" w:history="1">
         <w:r>
           <w:rPr>
             <w:rStyle w:val="Hyperlink"/>
@@ -4947,16 +5037,7 @@
             <w:szCs w:val="24"/>
             <w:lang w:val="en-US"/>
           </w:rPr>
-          <w:t>t</w:t>
-        </w:r>
-        <w:r>
-          <w:rPr>
-            <w:rStyle w:val="Hyperlink"/>
-            <w:sz w:val="24"/>
-            <w:szCs w:val="24"/>
-            <w:lang w:val="en-US"/>
-          </w:rPr>
-          <w:t>is.com/101/index.php</w:t>
+          <w:t>https://istqb.in/</w:t>
         </w:r>
       </w:hyperlink>
     </w:p>
@@ -4965,68 +5046,21 @@
         <w:pStyle w:val="ListParagraph"/>
         <w:numPr>
           <w:ilvl w:val="1"/>
-          <w:numId w:val="4"/>
-        </w:numPr>
-        <w:spacing w:line="254" w:lineRule="auto"/>
-        <w:rPr>
-          <w:sz w:val="24"/>
-          <w:szCs w:val="24"/>
-          <w:lang w:val="en-US"/>
-        </w:rPr>
-      </w:pPr>
-      <w:r>
-        <w:rPr>
-          <w:sz w:val="24"/>
-          <w:szCs w:val="24"/>
-          <w:lang w:val="en-US"/>
-        </w:rPr>
-        <w:t>Click on Automobile</w:t>
-      </w:r>
-    </w:p>
-    <w:p>
-      <w:pPr>
-        <w:pStyle w:val="ListParagraph"/>
-        <w:numPr>
-          <w:ilvl w:val="1"/>
-          <w:numId w:val="4"/>
-        </w:numPr>
-        <w:spacing w:line="254" w:lineRule="auto"/>
-        <w:rPr>
-          <w:sz w:val="24"/>
-          <w:szCs w:val="24"/>
-          <w:lang w:val="en-US"/>
-        </w:rPr>
-      </w:pPr>
-      <w:r>
-        <w:rPr>
-          <w:sz w:val="24"/>
-          <w:szCs w:val="24"/>
-          <w:lang w:val="en-US"/>
-        </w:rPr>
-        <w:t>Click on Enter Insurant Data</w:t>
-      </w:r>
-    </w:p>
-    <w:p>
-      <w:pPr>
-        <w:pStyle w:val="ListParagraph"/>
-        <w:numPr>
-          <w:ilvl w:val="1"/>
-          <w:numId w:val="4"/>
-        </w:numPr>
-        <w:spacing w:line="254" w:lineRule="auto"/>
-        <w:rPr>
-          <w:sz w:val="24"/>
-          <w:szCs w:val="24"/>
-          <w:lang w:val="en-US"/>
-        </w:rPr>
-      </w:pPr>
-      <w:r>
-        <w:rPr>
-          <w:sz w:val="24"/>
-          <w:szCs w:val="24"/>
-          <w:lang w:val="en-US"/>
-        </w:rPr>
-        <w:t>Upload your picture</w:t>
+          <w:numId w:val="3"/>
+        </w:numPr>
+        <w:rPr>
+          <w:sz w:val="24"/>
+          <w:szCs w:val="24"/>
+          <w:lang w:val="en-US"/>
+        </w:rPr>
+      </w:pPr>
+      <w:r>
+        <w:rPr>
+          <w:sz w:val="24"/>
+          <w:szCs w:val="24"/>
+          <w:lang w:val="en-US"/>
+        </w:rPr>
+        <w:t>Display all 8 menus</w:t>
       </w:r>
     </w:p>
     <w:p>
@@ -5042,6 +5076,8 @@
           <w:lang w:val="en-US"/>
         </w:rPr>
       </w:pPr>
+      <w:bookmarkStart w:id="0" w:name="_GoBack"/>
+      <w:bookmarkEnd w:id="0"/>
     </w:p>
     <w:sectPr>
       <w:pgSz w:w="11906" w:h="16838"/>

</xml_diff>

<commit_message>
Date: 10 Nov 2025
</commit_message>
<xml_diff>
--- a/Assignments.docx
+++ b/Assignments.docx
@@ -5061,6 +5061,278 @@
           <w:lang w:val="en-US"/>
         </w:rPr>
         <w:t>Display all 8 menus</w:t>
+      </w:r>
+    </w:p>
+    <w:p>
+      <w:pPr>
+        <w:pStyle w:val="ListParagraph"/>
+        <w:numPr>
+          <w:ilvl w:val="0"/>
+          <w:numId w:val="3"/>
+        </w:numPr>
+        <w:spacing w:line="254" w:lineRule="auto"/>
+        <w:rPr>
+          <w:sz w:val="24"/>
+          <w:szCs w:val="24"/>
+          <w:lang w:val="en-US"/>
+        </w:rPr>
+      </w:pPr>
+      <w:r>
+        <w:rPr>
+          <w:sz w:val="24"/>
+          <w:szCs w:val="24"/>
+          <w:lang w:val="en-US"/>
+        </w:rPr>
+        <w:t xml:space="preserve">Open </w:t>
+      </w:r>
+      <w:hyperlink r:id="rId33" w:history="1">
+        <w:r>
+          <w:rPr>
+            <w:rStyle w:val="Hyperlink"/>
+            <w:sz w:val="24"/>
+            <w:szCs w:val="24"/>
+            <w:lang w:val="en-US"/>
+          </w:rPr>
+          <w:t>https://omayo.blogspot.com/</w:t>
+        </w:r>
+      </w:hyperlink>
+    </w:p>
+    <w:p>
+      <w:pPr>
+        <w:pStyle w:val="ListParagraph"/>
+        <w:numPr>
+          <w:ilvl w:val="1"/>
+          <w:numId w:val="3"/>
+        </w:numPr>
+        <w:spacing w:line="254" w:lineRule="auto"/>
+        <w:rPr>
+          <w:sz w:val="24"/>
+          <w:szCs w:val="24"/>
+          <w:lang w:val="en-US"/>
+        </w:rPr>
+      </w:pPr>
+      <w:r>
+        <w:rPr>
+          <w:sz w:val="24"/>
+          <w:szCs w:val="24"/>
+          <w:lang w:val="en-US"/>
+        </w:rPr>
+        <w:t xml:space="preserve">Click on </w:t>
+      </w:r>
+      <w:proofErr w:type="spellStart"/>
+      <w:r>
+        <w:rPr>
+          <w:sz w:val="24"/>
+          <w:szCs w:val="24"/>
+          <w:lang w:val="en-US"/>
+        </w:rPr>
+        <w:t>ClickToGetAlert</w:t>
+      </w:r>
+      <w:proofErr w:type="spellEnd"/>
+      <w:r>
+        <w:rPr>
+          <w:sz w:val="24"/>
+          <w:szCs w:val="24"/>
+          <w:lang w:val="en-US"/>
+        </w:rPr>
+        <w:t xml:space="preserve"> button</w:t>
+      </w:r>
+    </w:p>
+    <w:p>
+      <w:pPr>
+        <w:pStyle w:val="ListParagraph"/>
+        <w:numPr>
+          <w:ilvl w:val="1"/>
+          <w:numId w:val="3"/>
+        </w:numPr>
+        <w:spacing w:line="254" w:lineRule="auto"/>
+        <w:rPr>
+          <w:sz w:val="24"/>
+          <w:szCs w:val="24"/>
+          <w:lang w:val="en-US"/>
+        </w:rPr>
+      </w:pPr>
+      <w:r>
+        <w:rPr>
+          <w:sz w:val="24"/>
+          <w:szCs w:val="24"/>
+          <w:lang w:val="en-US"/>
+        </w:rPr>
+        <w:t>Display the text on alert</w:t>
+      </w:r>
+    </w:p>
+    <w:p>
+      <w:pPr>
+        <w:pStyle w:val="ListParagraph"/>
+        <w:numPr>
+          <w:ilvl w:val="1"/>
+          <w:numId w:val="3"/>
+        </w:numPr>
+        <w:spacing w:line="254" w:lineRule="auto"/>
+        <w:rPr>
+          <w:sz w:val="24"/>
+          <w:szCs w:val="24"/>
+          <w:lang w:val="en-US"/>
+        </w:rPr>
+      </w:pPr>
+      <w:r>
+        <w:rPr>
+          <w:sz w:val="24"/>
+          <w:szCs w:val="24"/>
+          <w:lang w:val="en-US"/>
+        </w:rPr>
+        <w:t>Click on Ok button</w:t>
+      </w:r>
+    </w:p>
+    <w:p>
+      <w:pPr>
+        <w:pStyle w:val="ListParagraph"/>
+        <w:numPr>
+          <w:ilvl w:val="1"/>
+          <w:numId w:val="3"/>
+        </w:numPr>
+        <w:spacing w:line="254" w:lineRule="auto"/>
+        <w:rPr>
+          <w:sz w:val="24"/>
+          <w:szCs w:val="24"/>
+          <w:lang w:val="en-US"/>
+        </w:rPr>
+      </w:pPr>
+      <w:r>
+        <w:rPr>
+          <w:sz w:val="24"/>
+          <w:szCs w:val="24"/>
+          <w:lang w:val="en-US"/>
+        </w:rPr>
+        <w:t xml:space="preserve">Click on </w:t>
+      </w:r>
+      <w:proofErr w:type="spellStart"/>
+      <w:r>
+        <w:rPr>
+          <w:sz w:val="24"/>
+          <w:szCs w:val="24"/>
+          <w:lang w:val="en-US"/>
+        </w:rPr>
+        <w:t>GetPrompt</w:t>
+      </w:r>
+      <w:proofErr w:type="spellEnd"/>
+      <w:r>
+        <w:rPr>
+          <w:sz w:val="24"/>
+          <w:szCs w:val="24"/>
+          <w:lang w:val="en-US"/>
+        </w:rPr>
+        <w:t xml:space="preserve"> Button</w:t>
+      </w:r>
+    </w:p>
+    <w:p>
+      <w:pPr>
+        <w:pStyle w:val="ListParagraph"/>
+        <w:numPr>
+          <w:ilvl w:val="1"/>
+          <w:numId w:val="3"/>
+        </w:numPr>
+        <w:spacing w:line="254" w:lineRule="auto"/>
+        <w:rPr>
+          <w:sz w:val="24"/>
+          <w:szCs w:val="24"/>
+          <w:lang w:val="en-US"/>
+        </w:rPr>
+      </w:pPr>
+      <w:r>
+        <w:rPr>
+          <w:sz w:val="24"/>
+          <w:szCs w:val="24"/>
+          <w:lang w:val="en-US"/>
+        </w:rPr>
+        <w:lastRenderedPageBreak/>
+        <w:t xml:space="preserve">Enter your name </w:t>
+      </w:r>
+    </w:p>
+    <w:p>
+      <w:pPr>
+        <w:pStyle w:val="ListParagraph"/>
+        <w:numPr>
+          <w:ilvl w:val="1"/>
+          <w:numId w:val="3"/>
+        </w:numPr>
+        <w:spacing w:line="254" w:lineRule="auto"/>
+        <w:rPr>
+          <w:sz w:val="24"/>
+          <w:szCs w:val="24"/>
+          <w:lang w:val="en-US"/>
+        </w:rPr>
+      </w:pPr>
+      <w:r>
+        <w:rPr>
+          <w:sz w:val="24"/>
+          <w:szCs w:val="24"/>
+          <w:lang w:val="en-US"/>
+        </w:rPr>
+        <w:t>Click on Ok button</w:t>
+      </w:r>
+    </w:p>
+    <w:p>
+      <w:pPr>
+        <w:pStyle w:val="ListParagraph"/>
+        <w:numPr>
+          <w:ilvl w:val="1"/>
+          <w:numId w:val="3"/>
+        </w:numPr>
+        <w:spacing w:line="254" w:lineRule="auto"/>
+        <w:rPr>
+          <w:sz w:val="24"/>
+          <w:szCs w:val="24"/>
+          <w:lang w:val="en-US"/>
+        </w:rPr>
+      </w:pPr>
+      <w:r>
+        <w:rPr>
+          <w:sz w:val="24"/>
+          <w:szCs w:val="24"/>
+          <w:lang w:val="en-US"/>
+        </w:rPr>
+        <w:t xml:space="preserve">Click on </w:t>
+      </w:r>
+      <w:proofErr w:type="spellStart"/>
+      <w:r>
+        <w:rPr>
+          <w:sz w:val="24"/>
+          <w:szCs w:val="24"/>
+          <w:lang w:val="en-US"/>
+        </w:rPr>
+        <w:t>GetConfirmation</w:t>
+      </w:r>
+      <w:proofErr w:type="spellEnd"/>
+      <w:r>
+        <w:rPr>
+          <w:sz w:val="24"/>
+          <w:szCs w:val="24"/>
+          <w:lang w:val="en-US"/>
+        </w:rPr>
+        <w:t xml:space="preserve"> Button </w:t>
+      </w:r>
+    </w:p>
+    <w:p>
+      <w:pPr>
+        <w:pStyle w:val="ListParagraph"/>
+        <w:numPr>
+          <w:ilvl w:val="1"/>
+          <w:numId w:val="3"/>
+        </w:numPr>
+        <w:rPr>
+          <w:sz w:val="24"/>
+          <w:szCs w:val="24"/>
+          <w:lang w:val="en-US"/>
+        </w:rPr>
+      </w:pPr>
+      <w:r>
+        <w:rPr>
+          <w:sz w:val="24"/>
+          <w:szCs w:val="24"/>
+          <w:lang w:val="en-US"/>
+        </w:rPr>
+        <w:t>Click on Cancel button</w:t>
       </w:r>
     </w:p>
     <w:p>

</xml_diff>

<commit_message>
Date: 12 Nov 2025
</commit_message>
<xml_diff>
--- a/Assignments.docx
+++ b/Assignments.docx
@@ -5342,14 +5342,340 @@
           <w:ilvl w:val="0"/>
           <w:numId w:val="3"/>
         </w:numPr>
-        <w:rPr>
-          <w:sz w:val="24"/>
-          <w:szCs w:val="24"/>
-          <w:lang w:val="en-US"/>
-        </w:rPr>
-      </w:pPr>
-      <w:bookmarkStart w:id="0" w:name="_GoBack"/>
-      <w:bookmarkEnd w:id="0"/>
+        <w:spacing w:line="256" w:lineRule="auto"/>
+        <w:rPr>
+          <w:sz w:val="24"/>
+          <w:szCs w:val="24"/>
+          <w:lang w:val="en-US"/>
+        </w:rPr>
+      </w:pPr>
+      <w:r>
+        <w:rPr>
+          <w:sz w:val="24"/>
+          <w:szCs w:val="24"/>
+          <w:lang w:val="en-US"/>
+        </w:rPr>
+        <w:t xml:space="preserve">Open </w:t>
+      </w:r>
+      <w:hyperlink r:id="rId34" w:history="1">
+        <w:r>
+          <w:rPr>
+            <w:rStyle w:val="Hyperlink"/>
+            <w:sz w:val="24"/>
+            <w:szCs w:val="24"/>
+            <w:lang w:val="en-US"/>
+          </w:rPr>
+          <w:t>https://www.irctc.co.in/nget/profile/user-registration</w:t>
+        </w:r>
+      </w:hyperlink>
+    </w:p>
+    <w:p>
+      <w:pPr>
+        <w:pStyle w:val="ListParagraph"/>
+        <w:numPr>
+          <w:ilvl w:val="1"/>
+          <w:numId w:val="3"/>
+        </w:numPr>
+        <w:spacing w:line="256" w:lineRule="auto"/>
+        <w:rPr>
+          <w:sz w:val="24"/>
+          <w:szCs w:val="24"/>
+          <w:lang w:val="en-US"/>
+        </w:rPr>
+      </w:pPr>
+      <w:r>
+        <w:rPr>
+          <w:sz w:val="24"/>
+          <w:szCs w:val="24"/>
+          <w:lang w:val="en-US"/>
+        </w:rPr>
+        <w:t>Complete the registration process.</w:t>
+      </w:r>
+    </w:p>
+    <w:p>
+      <w:pPr>
+        <w:pStyle w:val="ListParagraph"/>
+        <w:numPr>
+          <w:ilvl w:val="1"/>
+          <w:numId w:val="3"/>
+        </w:numPr>
+        <w:spacing w:line="256" w:lineRule="auto"/>
+        <w:rPr>
+          <w:sz w:val="24"/>
+          <w:szCs w:val="24"/>
+          <w:lang w:val="en-US"/>
+        </w:rPr>
+      </w:pPr>
+      <w:r>
+        <w:rPr>
+          <w:sz w:val="24"/>
+          <w:szCs w:val="24"/>
+          <w:lang w:val="en-US"/>
+        </w:rPr>
+        <w:t>Display the messages after clicking on Submit button.</w:t>
+      </w:r>
+    </w:p>
+    <w:p>
+      <w:pPr>
+        <w:pStyle w:val="ListParagraph"/>
+        <w:numPr>
+          <w:ilvl w:val="0"/>
+          <w:numId w:val="3"/>
+        </w:numPr>
+        <w:spacing w:line="256" w:lineRule="auto"/>
+        <w:rPr>
+          <w:sz w:val="24"/>
+          <w:szCs w:val="24"/>
+          <w:lang w:val="en-US"/>
+        </w:rPr>
+      </w:pPr>
+      <w:r>
+        <w:rPr>
+          <w:sz w:val="24"/>
+          <w:szCs w:val="24"/>
+          <w:lang w:val="en-US"/>
+        </w:rPr>
+        <w:t xml:space="preserve">Open </w:t>
+      </w:r>
+      <w:hyperlink r:id="rId35" w:history="1">
+        <w:r>
+          <w:rPr>
+            <w:rStyle w:val="Hyperlink"/>
+            <w:sz w:val="24"/>
+            <w:szCs w:val="24"/>
+            <w:lang w:val="en-US"/>
+          </w:rPr>
+          <w:t>https://asa</w:t>
+        </w:r>
+        <w:r>
+          <w:rPr>
+            <w:rStyle w:val="Hyperlink"/>
+            <w:sz w:val="24"/>
+            <w:szCs w:val="24"/>
+            <w:lang w:val="en-US"/>
+          </w:rPr>
+          <w:t>n</w:t>
+        </w:r>
+        <w:r>
+          <w:rPr>
+            <w:rStyle w:val="Hyperlink"/>
+            <w:sz w:val="24"/>
+            <w:szCs w:val="24"/>
+            <w:lang w:val="en-US"/>
+          </w:rPr>
+          <w:t>a.com/</w:t>
+        </w:r>
+      </w:hyperlink>
+    </w:p>
+    <w:p>
+      <w:pPr>
+        <w:pStyle w:val="ListParagraph"/>
+        <w:numPr>
+          <w:ilvl w:val="1"/>
+          <w:numId w:val="3"/>
+        </w:numPr>
+        <w:spacing w:line="256" w:lineRule="auto"/>
+        <w:rPr>
+          <w:sz w:val="24"/>
+          <w:szCs w:val="24"/>
+          <w:lang w:val="en-US"/>
+        </w:rPr>
+      </w:pPr>
+      <w:r>
+        <w:rPr>
+          <w:sz w:val="24"/>
+          <w:szCs w:val="24"/>
+          <w:lang w:val="en-US"/>
+        </w:rPr>
+        <w:t>Click on login button</w:t>
+      </w:r>
+    </w:p>
+    <w:p>
+      <w:pPr>
+        <w:pStyle w:val="ListParagraph"/>
+        <w:numPr>
+          <w:ilvl w:val="0"/>
+          <w:numId w:val="3"/>
+        </w:numPr>
+        <w:spacing w:line="256" w:lineRule="auto"/>
+        <w:rPr>
+          <w:sz w:val="24"/>
+          <w:szCs w:val="24"/>
+          <w:lang w:val="en-US"/>
+        </w:rPr>
+      </w:pPr>
+      <w:r>
+        <w:rPr>
+          <w:sz w:val="24"/>
+          <w:szCs w:val="24"/>
+          <w:lang w:val="en-US"/>
+        </w:rPr>
+        <w:t xml:space="preserve">Open </w:t>
+      </w:r>
+      <w:hyperlink r:id="rId36" w:history="1">
+        <w:r>
+          <w:rPr>
+            <w:rStyle w:val="Hyperlink"/>
+            <w:sz w:val="24"/>
+            <w:szCs w:val="24"/>
+            <w:lang w:val="en-US"/>
+          </w:rPr>
+          <w:t>https://www.jotform.com/fo</w:t>
+        </w:r>
+        <w:bookmarkStart w:id="0" w:name="_GoBack"/>
+        <w:bookmarkEnd w:id="0"/>
+        <w:r>
+          <w:rPr>
+            <w:rStyle w:val="Hyperlink"/>
+            <w:sz w:val="24"/>
+            <w:szCs w:val="24"/>
+            <w:lang w:val="en-US"/>
+          </w:rPr>
+          <w:t>r</w:t>
+        </w:r>
+        <w:r>
+          <w:rPr>
+            <w:rStyle w:val="Hyperlink"/>
+            <w:sz w:val="24"/>
+            <w:szCs w:val="24"/>
+            <w:lang w:val="en-US"/>
+          </w:rPr>
+          <w:t>m-templates/exam-registration-form</w:t>
+        </w:r>
+      </w:hyperlink>
+    </w:p>
+    <w:p>
+      <w:pPr>
+        <w:pStyle w:val="ListParagraph"/>
+        <w:numPr>
+          <w:ilvl w:val="1"/>
+          <w:numId w:val="3"/>
+        </w:numPr>
+        <w:spacing w:line="256" w:lineRule="auto"/>
+        <w:rPr>
+          <w:sz w:val="24"/>
+          <w:szCs w:val="24"/>
+          <w:lang w:val="en-US"/>
+        </w:rPr>
+      </w:pPr>
+      <w:r>
+        <w:rPr>
+          <w:sz w:val="24"/>
+          <w:szCs w:val="24"/>
+          <w:lang w:val="en-US"/>
+        </w:rPr>
+        <w:t>Complete the registration process</w:t>
+      </w:r>
+    </w:p>
+    <w:p>
+      <w:pPr>
+        <w:pStyle w:val="ListParagraph"/>
+        <w:numPr>
+          <w:ilvl w:val="0"/>
+          <w:numId w:val="3"/>
+        </w:numPr>
+        <w:spacing w:line="254" w:lineRule="auto"/>
+        <w:rPr>
+          <w:sz w:val="24"/>
+          <w:szCs w:val="24"/>
+          <w:lang w:val="en-US"/>
+        </w:rPr>
+      </w:pPr>
+      <w:r>
+        <w:rPr>
+          <w:sz w:val="24"/>
+          <w:szCs w:val="24"/>
+          <w:lang w:val="en-US"/>
+        </w:rPr>
+        <w:t xml:space="preserve">Open </w:t>
+      </w:r>
+      <w:hyperlink r:id="rId37" w:history="1">
+        <w:r>
+          <w:rPr>
+            <w:rStyle w:val="Hyperlink"/>
+            <w:sz w:val="24"/>
+            <w:szCs w:val="24"/>
+            <w:lang w:val="en-US"/>
+          </w:rPr>
+          <w:t>https://www.nimblework.com/resources/?tx_post_tag=case-studies</w:t>
+        </w:r>
+      </w:hyperlink>
+      <w:r>
+        <w:rPr>
+          <w:sz w:val="24"/>
+          <w:szCs w:val="24"/>
+          <w:lang w:val="en-US"/>
+        </w:rPr>
+        <w:t xml:space="preserve"> </w:t>
+      </w:r>
+    </w:p>
+    <w:p>
+      <w:pPr>
+        <w:pStyle w:val="ListParagraph"/>
+        <w:numPr>
+          <w:ilvl w:val="1"/>
+          <w:numId w:val="3"/>
+        </w:numPr>
+        <w:spacing w:line="254" w:lineRule="auto"/>
+        <w:rPr>
+          <w:sz w:val="24"/>
+          <w:szCs w:val="24"/>
+          <w:lang w:val="en-US"/>
+        </w:rPr>
+      </w:pPr>
+      <w:r>
+        <w:rPr>
+          <w:sz w:val="24"/>
+          <w:szCs w:val="24"/>
+          <w:lang w:val="en-US"/>
+        </w:rPr>
+        <w:t>Click on The image of chat</w:t>
+      </w:r>
+    </w:p>
+    <w:p>
+      <w:pPr>
+        <w:pStyle w:val="ListParagraph"/>
+        <w:numPr>
+          <w:ilvl w:val="1"/>
+          <w:numId w:val="3"/>
+        </w:numPr>
+        <w:spacing w:line="254" w:lineRule="auto"/>
+        <w:rPr>
+          <w:sz w:val="24"/>
+          <w:szCs w:val="24"/>
+          <w:lang w:val="en-US"/>
+        </w:rPr>
+      </w:pPr>
+      <w:r>
+        <w:rPr>
+          <w:sz w:val="24"/>
+          <w:szCs w:val="24"/>
+          <w:lang w:val="en-US"/>
+        </w:rPr>
+        <w:t>Type Hello in the chat text box</w:t>
+      </w:r>
+    </w:p>
+    <w:p>
+      <w:pPr>
+        <w:pStyle w:val="ListParagraph"/>
+        <w:numPr>
+          <w:ilvl w:val="0"/>
+          <w:numId w:val="3"/>
+        </w:numPr>
+        <w:rPr>
+          <w:sz w:val="24"/>
+          <w:szCs w:val="24"/>
+          <w:lang w:val="en-US"/>
+        </w:rPr>
+      </w:pPr>
+      <w:r>
+        <w:rPr>
+          <w:sz w:val="24"/>
+          <w:szCs w:val="24"/>
+          <w:lang w:val="en-US"/>
+        </w:rPr>
+        <w:t>Hit Enter</w:t>
+      </w:r>
     </w:p>
     <w:sectPr>
       <w:pgSz w:w="11906" w:h="16838"/>
@@ -5808,6 +6134,95 @@
       </w:pPr>
     </w:lvl>
   </w:abstractNum>
+  <w:abstractNum w:abstractNumId="5">
+    <w:nsid w:val="73D636EC"/>
+    <w:multiLevelType w:val="hybridMultilevel"/>
+    <w:tmpl w:val="00CAB3BC"/>
+    <w:lvl w:ilvl="0" w:tplc="4009000F">
+      <w:start w:val="1"/>
+      <w:numFmt w:val="decimal"/>
+      <w:lvlText w:val="%1."/>
+      <w:lvlJc w:val="left"/>
+      <w:pPr>
+        <w:ind w:left="720" w:hanging="360"/>
+      </w:pPr>
+      <w:rPr>
+        <w:rFonts w:hint="default"/>
+      </w:rPr>
+    </w:lvl>
+    <w:lvl w:ilvl="1" w:tplc="40090019" w:tentative="1">
+      <w:start w:val="1"/>
+      <w:numFmt w:val="lowerLetter"/>
+      <w:lvlText w:val="%2."/>
+      <w:lvlJc w:val="left"/>
+      <w:pPr>
+        <w:ind w:left="1440" w:hanging="360"/>
+      </w:pPr>
+    </w:lvl>
+    <w:lvl w:ilvl="2" w:tplc="4009001B" w:tentative="1">
+      <w:start w:val="1"/>
+      <w:numFmt w:val="lowerRoman"/>
+      <w:lvlText w:val="%3."/>
+      <w:lvlJc w:val="right"/>
+      <w:pPr>
+        <w:ind w:left="2160" w:hanging="180"/>
+      </w:pPr>
+    </w:lvl>
+    <w:lvl w:ilvl="3" w:tplc="4009000F" w:tentative="1">
+      <w:start w:val="1"/>
+      <w:numFmt w:val="decimal"/>
+      <w:lvlText w:val="%4."/>
+      <w:lvlJc w:val="left"/>
+      <w:pPr>
+        <w:ind w:left="2880" w:hanging="360"/>
+      </w:pPr>
+    </w:lvl>
+    <w:lvl w:ilvl="4" w:tplc="40090019" w:tentative="1">
+      <w:start w:val="1"/>
+      <w:numFmt w:val="lowerLetter"/>
+      <w:lvlText w:val="%5."/>
+      <w:lvlJc w:val="left"/>
+      <w:pPr>
+        <w:ind w:left="3600" w:hanging="360"/>
+      </w:pPr>
+    </w:lvl>
+    <w:lvl w:ilvl="5" w:tplc="4009001B" w:tentative="1">
+      <w:start w:val="1"/>
+      <w:numFmt w:val="lowerRoman"/>
+      <w:lvlText w:val="%6."/>
+      <w:lvlJc w:val="right"/>
+      <w:pPr>
+        <w:ind w:left="4320" w:hanging="180"/>
+      </w:pPr>
+    </w:lvl>
+    <w:lvl w:ilvl="6" w:tplc="4009000F" w:tentative="1">
+      <w:start w:val="1"/>
+      <w:numFmt w:val="decimal"/>
+      <w:lvlText w:val="%7."/>
+      <w:lvlJc w:val="left"/>
+      <w:pPr>
+        <w:ind w:left="5040" w:hanging="360"/>
+      </w:pPr>
+    </w:lvl>
+    <w:lvl w:ilvl="7" w:tplc="40090019" w:tentative="1">
+      <w:start w:val="1"/>
+      <w:numFmt w:val="lowerLetter"/>
+      <w:lvlText w:val="%8."/>
+      <w:lvlJc w:val="left"/>
+      <w:pPr>
+        <w:ind w:left="5760" w:hanging="360"/>
+      </w:pPr>
+    </w:lvl>
+    <w:lvl w:ilvl="8" w:tplc="4009001B" w:tentative="1">
+      <w:start w:val="1"/>
+      <w:numFmt w:val="lowerRoman"/>
+      <w:lvlText w:val="%9."/>
+      <w:lvlJc w:val="right"/>
+      <w:pPr>
+        <w:ind w:left="6480" w:hanging="180"/>
+      </w:pPr>
+    </w:lvl>
+  </w:abstractNum>
   <w:num w:numId="1">
     <w:abstractNumId w:val="4"/>
   </w:num>
@@ -5822,6 +6237,9 @@
   </w:num>
   <w:num w:numId="5">
     <w:abstractNumId w:val="3"/>
+  </w:num>
+  <w:num w:numId="6">
+    <w:abstractNumId w:val="5"/>
   </w:num>
 </w:numbering>
 </file>

</xml_diff>

<commit_message>
Date: 25 Nov 2025
</commit_message>
<xml_diff>
--- a/Assignments.docx
+++ b/Assignments.docx
@@ -5445,25 +5445,7 @@
             <w:szCs w:val="24"/>
             <w:lang w:val="en-US"/>
           </w:rPr>
-          <w:t>https://asa</w:t>
-        </w:r>
-        <w:r>
-          <w:rPr>
-            <w:rStyle w:val="Hyperlink"/>
-            <w:sz w:val="24"/>
-            <w:szCs w:val="24"/>
-            <w:lang w:val="en-US"/>
-          </w:rPr>
-          <w:t>n</w:t>
-        </w:r>
-        <w:r>
-          <w:rPr>
-            <w:rStyle w:val="Hyperlink"/>
-            <w:sz w:val="24"/>
-            <w:szCs w:val="24"/>
-            <w:lang w:val="en-US"/>
-          </w:rPr>
-          <w:t>a.com/</w:t>
+          <w:t>https://asana.com/</w:t>
         </w:r>
       </w:hyperlink>
     </w:p>
@@ -5520,27 +5502,7 @@
             <w:szCs w:val="24"/>
             <w:lang w:val="en-US"/>
           </w:rPr>
-          <w:t>https://www.jotform.com/fo</w:t>
-        </w:r>
-        <w:bookmarkStart w:id="0" w:name="_GoBack"/>
-        <w:bookmarkEnd w:id="0"/>
-        <w:r>
-          <w:rPr>
-            <w:rStyle w:val="Hyperlink"/>
-            <w:sz w:val="24"/>
-            <w:szCs w:val="24"/>
-            <w:lang w:val="en-US"/>
-          </w:rPr>
-          <w:t>r</w:t>
-        </w:r>
-        <w:r>
-          <w:rPr>
-            <w:rStyle w:val="Hyperlink"/>
-            <w:sz w:val="24"/>
-            <w:szCs w:val="24"/>
-            <w:lang w:val="en-US"/>
-          </w:rPr>
-          <w:t>m-templates/exam-registration-form</w:t>
+          <w:t>https://www.jotform.com/form-templates/exam-registration-form</w:t>
         </w:r>
       </w:hyperlink>
     </w:p>
@@ -5676,6 +5638,512 @@
         </w:rPr>
         <w:t>Hit Enter</w:t>
       </w:r>
+    </w:p>
+    <w:p>
+      <w:pPr>
+        <w:rPr>
+          <w:sz w:val="24"/>
+          <w:szCs w:val="24"/>
+          <w:lang w:val="en-US"/>
+        </w:rPr>
+      </w:pPr>
+      <w:r>
+        <w:rPr>
+          <w:sz w:val="24"/>
+          <w:szCs w:val="24"/>
+          <w:lang w:val="en-US"/>
+        </w:rPr>
+        <w:br w:type="page"/>
+      </w:r>
+    </w:p>
+    <w:p>
+      <w:pPr>
+        <w:rPr>
+          <w:b/>
+          <w:bCs/>
+          <w:sz w:val="24"/>
+          <w:szCs w:val="22"/>
+          <w:lang w:val="en-US"/>
+        </w:rPr>
+      </w:pPr>
+      <w:r>
+        <w:rPr>
+          <w:b/>
+          <w:bCs/>
+          <w:sz w:val="24"/>
+          <w:szCs w:val="22"/>
+          <w:lang w:val="en-US"/>
+        </w:rPr>
+        <w:lastRenderedPageBreak/>
+        <w:t>TestNG Assignment</w:t>
+      </w:r>
+    </w:p>
+    <w:p>
+      <w:pPr>
+        <w:pStyle w:val="ListParagraph"/>
+        <w:numPr>
+          <w:ilvl w:val="0"/>
+          <w:numId w:val="7"/>
+        </w:numPr>
+        <w:rPr>
+          <w:sz w:val="24"/>
+          <w:szCs w:val="22"/>
+          <w:lang w:val="en-US"/>
+        </w:rPr>
+      </w:pPr>
+      <w:r>
+        <w:rPr>
+          <w:sz w:val="24"/>
+          <w:szCs w:val="22"/>
+          <w:lang w:val="en-US"/>
+        </w:rPr>
+        <w:t>Create a TestNG Class with name D05BigBasketAssignment</w:t>
+      </w:r>
+    </w:p>
+    <w:p>
+      <w:pPr>
+        <w:pStyle w:val="ListParagraph"/>
+        <w:numPr>
+          <w:ilvl w:val="1"/>
+          <w:numId w:val="7"/>
+        </w:numPr>
+        <w:rPr>
+          <w:sz w:val="24"/>
+          <w:szCs w:val="22"/>
+          <w:lang w:val="en-US"/>
+        </w:rPr>
+      </w:pPr>
+      <w:r>
+        <w:rPr>
+          <w:sz w:val="24"/>
+          <w:szCs w:val="22"/>
+          <w:lang w:val="en-US"/>
+        </w:rPr>
+        <w:t xml:space="preserve">Launch </w:t>
+      </w:r>
+      <w:hyperlink r:id="rId38" w:history="1">
+        <w:r>
+          <w:rPr>
+            <w:rStyle w:val="Hyperlink"/>
+            <w:sz w:val="24"/>
+            <w:szCs w:val="22"/>
+            <w:lang w:val="en-US"/>
+          </w:rPr>
+          <w:t>https://www.bigbasket.com/</w:t>
+        </w:r>
+      </w:hyperlink>
+    </w:p>
+    <w:p>
+      <w:pPr>
+        <w:pStyle w:val="ListParagraph"/>
+        <w:numPr>
+          <w:ilvl w:val="1"/>
+          <w:numId w:val="7"/>
+        </w:numPr>
+        <w:rPr>
+          <w:sz w:val="24"/>
+          <w:szCs w:val="22"/>
+          <w:lang w:val="en-US"/>
+        </w:rPr>
+      </w:pPr>
+      <w:r>
+        <w:rPr>
+          <w:sz w:val="24"/>
+          <w:szCs w:val="22"/>
+          <w:lang w:val="en-US"/>
+        </w:rPr>
+        <w:t>Print the title</w:t>
+      </w:r>
+    </w:p>
+    <w:p>
+      <w:pPr>
+        <w:pStyle w:val="ListParagraph"/>
+        <w:numPr>
+          <w:ilvl w:val="1"/>
+          <w:numId w:val="7"/>
+        </w:numPr>
+        <w:rPr>
+          <w:b/>
+          <w:bCs/>
+          <w:sz w:val="24"/>
+          <w:szCs w:val="22"/>
+          <w:lang w:val="en-US"/>
+        </w:rPr>
+      </w:pPr>
+      <w:r>
+        <w:rPr>
+          <w:b/>
+          <w:bCs/>
+          <w:sz w:val="24"/>
+          <w:szCs w:val="22"/>
+          <w:lang w:val="en-US"/>
+        </w:rPr>
+        <w:t>Click on Exotic Fruits link</w:t>
+      </w:r>
+    </w:p>
+    <w:p>
+      <w:pPr>
+        <w:pStyle w:val="ListParagraph"/>
+        <w:numPr>
+          <w:ilvl w:val="1"/>
+          <w:numId w:val="7"/>
+        </w:numPr>
+        <w:rPr>
+          <w:sz w:val="24"/>
+          <w:szCs w:val="22"/>
+          <w:lang w:val="en-US"/>
+        </w:rPr>
+      </w:pPr>
+      <w:r>
+        <w:rPr>
+          <w:sz w:val="24"/>
+          <w:szCs w:val="22"/>
+          <w:lang w:val="en-US"/>
+        </w:rPr>
+        <w:t>Print the title</w:t>
+      </w:r>
+    </w:p>
+    <w:p>
+      <w:pPr>
+        <w:pStyle w:val="ListParagraph"/>
+        <w:numPr>
+          <w:ilvl w:val="1"/>
+          <w:numId w:val="7"/>
+        </w:numPr>
+        <w:rPr>
+          <w:sz w:val="24"/>
+          <w:szCs w:val="22"/>
+          <w:lang w:val="en-US"/>
+        </w:rPr>
+      </w:pPr>
+      <w:r>
+        <w:rPr>
+          <w:sz w:val="24"/>
+          <w:szCs w:val="22"/>
+          <w:lang w:val="en-US"/>
+        </w:rPr>
+        <w:t xml:space="preserve">Launch </w:t>
+      </w:r>
+      <w:hyperlink r:id="rId39" w:history="1">
+        <w:r>
+          <w:rPr>
+            <w:rStyle w:val="Hyperlink"/>
+            <w:sz w:val="24"/>
+            <w:szCs w:val="22"/>
+            <w:lang w:val="en-US"/>
+          </w:rPr>
+          <w:t>https://www.bigbasket.com/</w:t>
+        </w:r>
+      </w:hyperlink>
+    </w:p>
+    <w:p>
+      <w:pPr>
+        <w:pStyle w:val="ListParagraph"/>
+        <w:numPr>
+          <w:ilvl w:val="1"/>
+          <w:numId w:val="7"/>
+        </w:numPr>
+        <w:rPr>
+          <w:sz w:val="24"/>
+          <w:szCs w:val="22"/>
+          <w:lang w:val="en-US"/>
+        </w:rPr>
+      </w:pPr>
+      <w:r>
+        <w:rPr>
+          <w:sz w:val="24"/>
+          <w:szCs w:val="22"/>
+          <w:lang w:val="en-US"/>
+        </w:rPr>
+        <w:t>Print the title</w:t>
+      </w:r>
+    </w:p>
+    <w:p>
+      <w:pPr>
+        <w:pStyle w:val="ListParagraph"/>
+        <w:numPr>
+          <w:ilvl w:val="1"/>
+          <w:numId w:val="7"/>
+        </w:numPr>
+        <w:rPr>
+          <w:b/>
+          <w:bCs/>
+          <w:sz w:val="24"/>
+          <w:szCs w:val="22"/>
+          <w:lang w:val="en-US"/>
+        </w:rPr>
+      </w:pPr>
+      <w:r>
+        <w:rPr>
+          <w:b/>
+          <w:bCs/>
+          <w:sz w:val="24"/>
+          <w:szCs w:val="22"/>
+          <w:lang w:val="en-US"/>
+        </w:rPr>
+        <w:t>Click on Tea link</w:t>
+      </w:r>
+    </w:p>
+    <w:p>
+      <w:pPr>
+        <w:pStyle w:val="ListParagraph"/>
+        <w:numPr>
+          <w:ilvl w:val="1"/>
+          <w:numId w:val="7"/>
+        </w:numPr>
+        <w:rPr>
+          <w:sz w:val="24"/>
+          <w:szCs w:val="22"/>
+          <w:lang w:val="en-US"/>
+        </w:rPr>
+      </w:pPr>
+      <w:r>
+        <w:rPr>
+          <w:sz w:val="24"/>
+          <w:szCs w:val="22"/>
+          <w:lang w:val="en-US"/>
+        </w:rPr>
+        <w:t>Print the title</w:t>
+      </w:r>
+    </w:p>
+    <w:p>
+      <w:pPr>
+        <w:pStyle w:val="ListParagraph"/>
+        <w:numPr>
+          <w:ilvl w:val="1"/>
+          <w:numId w:val="7"/>
+        </w:numPr>
+        <w:rPr>
+          <w:sz w:val="24"/>
+          <w:szCs w:val="22"/>
+          <w:lang w:val="en-US"/>
+        </w:rPr>
+      </w:pPr>
+      <w:r>
+        <w:rPr>
+          <w:sz w:val="24"/>
+          <w:szCs w:val="22"/>
+          <w:lang w:val="en-US"/>
+        </w:rPr>
+        <w:t xml:space="preserve">Launch </w:t>
+      </w:r>
+      <w:hyperlink r:id="rId40" w:history="1">
+        <w:r>
+          <w:rPr>
+            <w:rStyle w:val="Hyperlink"/>
+            <w:sz w:val="24"/>
+            <w:szCs w:val="22"/>
+            <w:lang w:val="en-US"/>
+          </w:rPr>
+          <w:t>https://www.bigbasket.com/</w:t>
+        </w:r>
+      </w:hyperlink>
+    </w:p>
+    <w:p>
+      <w:pPr>
+        <w:pStyle w:val="ListParagraph"/>
+        <w:numPr>
+          <w:ilvl w:val="1"/>
+          <w:numId w:val="7"/>
+        </w:numPr>
+        <w:rPr>
+          <w:sz w:val="24"/>
+          <w:szCs w:val="22"/>
+          <w:lang w:val="en-US"/>
+        </w:rPr>
+      </w:pPr>
+      <w:r>
+        <w:rPr>
+          <w:sz w:val="24"/>
+          <w:szCs w:val="22"/>
+          <w:lang w:val="en-US"/>
+        </w:rPr>
+        <w:t>Print the title</w:t>
+      </w:r>
+    </w:p>
+    <w:p>
+      <w:pPr>
+        <w:pStyle w:val="ListParagraph"/>
+        <w:numPr>
+          <w:ilvl w:val="1"/>
+          <w:numId w:val="7"/>
+        </w:numPr>
+        <w:rPr>
+          <w:b/>
+          <w:bCs/>
+          <w:sz w:val="24"/>
+          <w:szCs w:val="22"/>
+          <w:lang w:val="en-US"/>
+        </w:rPr>
+      </w:pPr>
+      <w:r>
+        <w:rPr>
+          <w:b/>
+          <w:bCs/>
+          <w:sz w:val="24"/>
+          <w:szCs w:val="22"/>
+          <w:lang w:val="en-US"/>
+        </w:rPr>
+        <w:t>Click on Ghee link</w:t>
+      </w:r>
+    </w:p>
+    <w:p>
+      <w:pPr>
+        <w:pStyle w:val="ListParagraph"/>
+        <w:numPr>
+          <w:ilvl w:val="1"/>
+          <w:numId w:val="7"/>
+        </w:numPr>
+        <w:rPr>
+          <w:sz w:val="24"/>
+          <w:szCs w:val="22"/>
+          <w:lang w:val="en-US"/>
+        </w:rPr>
+      </w:pPr>
+      <w:r>
+        <w:rPr>
+          <w:sz w:val="24"/>
+          <w:szCs w:val="22"/>
+          <w:lang w:val="en-US"/>
+        </w:rPr>
+        <w:t>Print the title</w:t>
+      </w:r>
+    </w:p>
+    <w:p>
+      <w:pPr>
+        <w:pStyle w:val="ListParagraph"/>
+        <w:numPr>
+          <w:ilvl w:val="1"/>
+          <w:numId w:val="7"/>
+        </w:numPr>
+        <w:rPr>
+          <w:sz w:val="24"/>
+          <w:szCs w:val="22"/>
+          <w:lang w:val="en-US"/>
+        </w:rPr>
+      </w:pPr>
+      <w:r>
+        <w:rPr>
+          <w:sz w:val="24"/>
+          <w:szCs w:val="22"/>
+          <w:lang w:val="en-US"/>
+        </w:rPr>
+        <w:t xml:space="preserve">Launch </w:t>
+      </w:r>
+      <w:hyperlink r:id="rId41" w:history="1">
+        <w:r>
+          <w:rPr>
+            <w:rStyle w:val="Hyperlink"/>
+            <w:sz w:val="24"/>
+            <w:szCs w:val="22"/>
+            <w:lang w:val="en-US"/>
+          </w:rPr>
+          <w:t>https://www.bigbasket.com/</w:t>
+        </w:r>
+      </w:hyperlink>
+    </w:p>
+    <w:p>
+      <w:pPr>
+        <w:pStyle w:val="ListParagraph"/>
+        <w:numPr>
+          <w:ilvl w:val="1"/>
+          <w:numId w:val="7"/>
+        </w:numPr>
+        <w:rPr>
+          <w:sz w:val="24"/>
+          <w:szCs w:val="22"/>
+          <w:lang w:val="en-US"/>
+        </w:rPr>
+      </w:pPr>
+      <w:r>
+        <w:rPr>
+          <w:sz w:val="24"/>
+          <w:szCs w:val="22"/>
+          <w:lang w:val="en-US"/>
+        </w:rPr>
+        <w:t>Print the title</w:t>
+      </w:r>
+    </w:p>
+    <w:p>
+      <w:pPr>
+        <w:pStyle w:val="ListParagraph"/>
+        <w:numPr>
+          <w:ilvl w:val="1"/>
+          <w:numId w:val="7"/>
+        </w:numPr>
+        <w:rPr>
+          <w:b/>
+          <w:bCs/>
+          <w:sz w:val="24"/>
+          <w:szCs w:val="22"/>
+          <w:lang w:val="en-US"/>
+        </w:rPr>
+      </w:pPr>
+      <w:r>
+        <w:rPr>
+          <w:b/>
+          <w:bCs/>
+          <w:sz w:val="24"/>
+          <w:szCs w:val="22"/>
+          <w:lang w:val="en-US"/>
+        </w:rPr>
+        <w:t xml:space="preserve">Click on </w:t>
+      </w:r>
+      <w:proofErr w:type="spellStart"/>
+      <w:r>
+        <w:rPr>
+          <w:b/>
+          <w:bCs/>
+          <w:sz w:val="24"/>
+          <w:szCs w:val="22"/>
+          <w:lang w:val="en-US"/>
+        </w:rPr>
+        <w:t>Nandhini</w:t>
+      </w:r>
+      <w:proofErr w:type="spellEnd"/>
+      <w:r>
+        <w:rPr>
+          <w:b/>
+          <w:bCs/>
+          <w:sz w:val="24"/>
+          <w:szCs w:val="22"/>
+          <w:lang w:val="en-US"/>
+        </w:rPr>
+        <w:t xml:space="preserve"> link</w:t>
+      </w:r>
+    </w:p>
+    <w:p>
+      <w:pPr>
+        <w:pStyle w:val="ListParagraph"/>
+        <w:numPr>
+          <w:ilvl w:val="1"/>
+          <w:numId w:val="7"/>
+        </w:numPr>
+        <w:rPr>
+          <w:sz w:val="24"/>
+          <w:szCs w:val="22"/>
+          <w:lang w:val="en-US"/>
+        </w:rPr>
+      </w:pPr>
+      <w:r>
+        <w:rPr>
+          <w:sz w:val="24"/>
+          <w:szCs w:val="22"/>
+          <w:lang w:val="en-US"/>
+        </w:rPr>
+        <w:t>Print the title</w:t>
+      </w:r>
+    </w:p>
+    <w:p>
+      <w:pPr>
+        <w:rPr>
+          <w:sz w:val="24"/>
+          <w:szCs w:val="24"/>
+          <w:lang w:val="en-US"/>
+        </w:rPr>
+      </w:pPr>
+      <w:bookmarkStart w:id="0" w:name="_GoBack"/>
+      <w:bookmarkEnd w:id="0"/>
     </w:p>
     <w:sectPr>
       <w:pgSz w:w="11906" w:h="16838"/>
@@ -5868,6 +6336,95 @@
     </w:lvl>
   </w:abstractNum>
   <w:abstractNum w:abstractNumId="2">
+    <w:nsid w:val="32D96F09"/>
+    <w:multiLevelType w:val="hybridMultilevel"/>
+    <w:tmpl w:val="3CC0EB00"/>
+    <w:lvl w:ilvl="0" w:tplc="4009000F">
+      <w:start w:val="1"/>
+      <w:numFmt w:val="decimal"/>
+      <w:lvlText w:val="%1."/>
+      <w:lvlJc w:val="left"/>
+      <w:pPr>
+        <w:ind w:left="720" w:hanging="360"/>
+      </w:pPr>
+      <w:rPr>
+        <w:rFonts w:hint="default"/>
+      </w:rPr>
+    </w:lvl>
+    <w:lvl w:ilvl="1" w:tplc="40090019">
+      <w:start w:val="1"/>
+      <w:numFmt w:val="lowerLetter"/>
+      <w:lvlText w:val="%2."/>
+      <w:lvlJc w:val="left"/>
+      <w:pPr>
+        <w:ind w:left="1440" w:hanging="360"/>
+      </w:pPr>
+    </w:lvl>
+    <w:lvl w:ilvl="2" w:tplc="4009001B" w:tentative="1">
+      <w:start w:val="1"/>
+      <w:numFmt w:val="lowerRoman"/>
+      <w:lvlText w:val="%3."/>
+      <w:lvlJc w:val="right"/>
+      <w:pPr>
+        <w:ind w:left="2160" w:hanging="180"/>
+      </w:pPr>
+    </w:lvl>
+    <w:lvl w:ilvl="3" w:tplc="4009000F" w:tentative="1">
+      <w:start w:val="1"/>
+      <w:numFmt w:val="decimal"/>
+      <w:lvlText w:val="%4."/>
+      <w:lvlJc w:val="left"/>
+      <w:pPr>
+        <w:ind w:left="2880" w:hanging="360"/>
+      </w:pPr>
+    </w:lvl>
+    <w:lvl w:ilvl="4" w:tplc="40090019" w:tentative="1">
+      <w:start w:val="1"/>
+      <w:numFmt w:val="lowerLetter"/>
+      <w:lvlText w:val="%5."/>
+      <w:lvlJc w:val="left"/>
+      <w:pPr>
+        <w:ind w:left="3600" w:hanging="360"/>
+      </w:pPr>
+    </w:lvl>
+    <w:lvl w:ilvl="5" w:tplc="4009001B" w:tentative="1">
+      <w:start w:val="1"/>
+      <w:numFmt w:val="lowerRoman"/>
+      <w:lvlText w:val="%6."/>
+      <w:lvlJc w:val="right"/>
+      <w:pPr>
+        <w:ind w:left="4320" w:hanging="180"/>
+      </w:pPr>
+    </w:lvl>
+    <w:lvl w:ilvl="6" w:tplc="4009000F" w:tentative="1">
+      <w:start w:val="1"/>
+      <w:numFmt w:val="decimal"/>
+      <w:lvlText w:val="%7."/>
+      <w:lvlJc w:val="left"/>
+      <w:pPr>
+        <w:ind w:left="5040" w:hanging="360"/>
+      </w:pPr>
+    </w:lvl>
+    <w:lvl w:ilvl="7" w:tplc="40090019" w:tentative="1">
+      <w:start w:val="1"/>
+      <w:numFmt w:val="lowerLetter"/>
+      <w:lvlText w:val="%8."/>
+      <w:lvlJc w:val="left"/>
+      <w:pPr>
+        <w:ind w:left="5760" w:hanging="360"/>
+      </w:pPr>
+    </w:lvl>
+    <w:lvl w:ilvl="8" w:tplc="4009001B" w:tentative="1">
+      <w:start w:val="1"/>
+      <w:numFmt w:val="lowerRoman"/>
+      <w:lvlText w:val="%9."/>
+      <w:lvlJc w:val="right"/>
+      <w:pPr>
+        <w:ind w:left="6480" w:hanging="180"/>
+      </w:pPr>
+    </w:lvl>
+  </w:abstractNum>
+  <w:abstractNum w:abstractNumId="3">
     <w:nsid w:val="394131C0"/>
     <w:multiLevelType w:val="hybridMultilevel"/>
     <w:tmpl w:val="46D85910"/>
@@ -5956,7 +6513,7 @@
       </w:pPr>
     </w:lvl>
   </w:abstractNum>
-  <w:abstractNum w:abstractNumId="3">
+  <w:abstractNum w:abstractNumId="4">
     <w:nsid w:val="4E5B4A02"/>
     <w:multiLevelType w:val="hybridMultilevel"/>
     <w:tmpl w:val="E8BC0844"/>
@@ -6045,7 +6602,7 @@
       </w:pPr>
     </w:lvl>
   </w:abstractNum>
-  <w:abstractNum w:abstractNumId="4">
+  <w:abstractNum w:abstractNumId="5">
     <w:nsid w:val="68A312EE"/>
     <w:multiLevelType w:val="hybridMultilevel"/>
     <w:tmpl w:val="DF86D600"/>
@@ -6134,7 +6691,7 @@
       </w:pPr>
     </w:lvl>
   </w:abstractNum>
-  <w:abstractNum w:abstractNumId="5">
+  <w:abstractNum w:abstractNumId="6">
     <w:nsid w:val="73D636EC"/>
     <w:multiLevelType w:val="hybridMultilevel"/>
     <w:tmpl w:val="00CAB3BC"/>
@@ -6224,10 +6781,10 @@
     </w:lvl>
   </w:abstractNum>
   <w:num w:numId="1">
-    <w:abstractNumId w:val="4"/>
+    <w:abstractNumId w:val="5"/>
   </w:num>
   <w:num w:numId="2">
-    <w:abstractNumId w:val="2"/>
+    <w:abstractNumId w:val="3"/>
   </w:num>
   <w:num w:numId="3">
     <w:abstractNumId w:val="0"/>
@@ -6236,10 +6793,13 @@
     <w:abstractNumId w:val="1"/>
   </w:num>
   <w:num w:numId="5">
-    <w:abstractNumId w:val="3"/>
+    <w:abstractNumId w:val="4"/>
   </w:num>
   <w:num w:numId="6">
-    <w:abstractNumId w:val="5"/>
+    <w:abstractNumId w:val="6"/>
+  </w:num>
+  <w:num w:numId="7">
+    <w:abstractNumId w:val="2"/>
   </w:num>
 </w:numbering>
 </file>

</xml_diff>

<commit_message>
Date: 26 Nov 2025
</commit_message>
<xml_diff>
--- a/Assignments.docx
+++ b/Assignments.docx
@@ -120,23 +120,13 @@
           <w:lang w:val="en-US"/>
         </w:rPr>
       </w:pPr>
-      <w:proofErr w:type="spellStart"/>
-      <w:r>
-        <w:rPr>
-          <w:sz w:val="24"/>
-          <w:szCs w:val="24"/>
-          <w:lang w:val="en-US"/>
-        </w:rPr>
-        <w:t>hra</w:t>
-      </w:r>
-      <w:proofErr w:type="spellEnd"/>
-      <w:r>
-        <w:rPr>
-          <w:sz w:val="24"/>
-          <w:szCs w:val="24"/>
-          <w:lang w:val="en-US"/>
-        </w:rPr>
-        <w:t xml:space="preserve"> = 20% of basic salary</w:t>
+      <w:r>
+        <w:rPr>
+          <w:sz w:val="24"/>
+          <w:szCs w:val="24"/>
+          <w:lang w:val="en-US"/>
+        </w:rPr>
+        <w:t>hra = 20% of basic salary</w:t>
       </w:r>
     </w:p>
     <w:p>
@@ -152,23 +142,13 @@
           <w:lang w:val="en-US"/>
         </w:rPr>
       </w:pPr>
-      <w:proofErr w:type="spellStart"/>
-      <w:r>
-        <w:rPr>
-          <w:sz w:val="24"/>
-          <w:szCs w:val="24"/>
-          <w:lang w:val="en-US"/>
-        </w:rPr>
-        <w:t>pf</w:t>
-      </w:r>
-      <w:proofErr w:type="spellEnd"/>
-      <w:r>
-        <w:rPr>
-          <w:sz w:val="24"/>
-          <w:szCs w:val="24"/>
-          <w:lang w:val="en-US"/>
-        </w:rPr>
-        <w:t xml:space="preserve"> = 5% of basic salary</w:t>
+      <w:r>
+        <w:rPr>
+          <w:sz w:val="24"/>
+          <w:szCs w:val="24"/>
+          <w:lang w:val="en-US"/>
+        </w:rPr>
+        <w:t>pf = 5% of basic salary</w:t>
       </w:r>
     </w:p>
     <w:p>
@@ -190,25 +170,7 @@
           <w:szCs w:val="24"/>
           <w:lang w:val="en-US"/>
         </w:rPr>
-        <w:t xml:space="preserve">gross salary = basic salary + da + </w:t>
-      </w:r>
-      <w:proofErr w:type="spellStart"/>
-      <w:r>
-        <w:rPr>
-          <w:sz w:val="24"/>
-          <w:szCs w:val="24"/>
-          <w:lang w:val="en-US"/>
-        </w:rPr>
-        <w:t>hra</w:t>
-      </w:r>
-      <w:proofErr w:type="spellEnd"/>
-      <w:r>
-        <w:rPr>
-          <w:sz w:val="24"/>
-          <w:szCs w:val="24"/>
-          <w:lang w:val="en-US"/>
-        </w:rPr>
-        <w:t>;</w:t>
+        <w:t>gross salary = basic salary + da + hra;</w:t>
       </w:r>
     </w:p>
     <w:p>
@@ -230,18 +192,8 @@
           <w:szCs w:val="24"/>
           <w:lang w:val="en-US"/>
         </w:rPr>
-        <w:t xml:space="preserve">net salary = gross salary – </w:t>
-      </w:r>
-      <w:proofErr w:type="spellStart"/>
-      <w:r>
-        <w:rPr>
-          <w:sz w:val="24"/>
-          <w:szCs w:val="24"/>
-          <w:lang w:val="en-US"/>
-        </w:rPr>
-        <w:t>pf</w:t>
-      </w:r>
-      <w:proofErr w:type="spellEnd"/>
+        <w:t>net salary = gross salary – pf</w:t>
+      </w:r>
     </w:p>
     <w:p>
       <w:pPr>
@@ -262,36 +214,8 @@
           <w:szCs w:val="24"/>
           <w:lang w:val="en-US"/>
         </w:rPr>
-        <w:t>Accept a number from user and check whether it is +</w:t>
-      </w:r>
-      <w:proofErr w:type="spellStart"/>
-      <w:r>
-        <w:rPr>
-          <w:sz w:val="24"/>
-          <w:szCs w:val="24"/>
-          <w:lang w:val="en-US"/>
-        </w:rPr>
-        <w:t>ve</w:t>
-      </w:r>
-      <w:proofErr w:type="spellEnd"/>
-      <w:r>
-        <w:rPr>
-          <w:sz w:val="24"/>
-          <w:szCs w:val="24"/>
-          <w:lang w:val="en-US"/>
-        </w:rPr>
-        <w:t xml:space="preserve"> or –</w:t>
-      </w:r>
-      <w:proofErr w:type="spellStart"/>
-      <w:r>
-        <w:rPr>
-          <w:sz w:val="24"/>
-          <w:szCs w:val="24"/>
-          <w:lang w:val="en-US"/>
-        </w:rPr>
-        <w:t>ve</w:t>
-      </w:r>
-      <w:proofErr w:type="spellEnd"/>
+        <w:t>Accept a number from user and check whether it is +ve or –ve</w:t>
+      </w:r>
     </w:p>
     <w:p>
       <w:pPr>
@@ -378,25 +302,7 @@
           <w:szCs w:val="24"/>
           <w:lang w:val="en-US"/>
         </w:rPr>
-        <w:t xml:space="preserve">Accept age from user and show the message as "You are valid for voting" if age is </w:t>
-      </w:r>
-      <w:proofErr w:type="spellStart"/>
-      <w:r>
-        <w:rPr>
-          <w:sz w:val="24"/>
-          <w:szCs w:val="24"/>
-          <w:lang w:val="en-US"/>
-        </w:rPr>
-        <w:t>grater</w:t>
-      </w:r>
-      <w:proofErr w:type="spellEnd"/>
-      <w:r>
-        <w:rPr>
-          <w:sz w:val="24"/>
-          <w:szCs w:val="24"/>
-          <w:lang w:val="en-US"/>
-        </w:rPr>
-        <w:t xml:space="preserve"> than or equal to 18 otherwise display the message as "You are not valid for voting"</w:t>
+        <w:t>Accept age from user and show the message as "You are valid for voting" if age is grater than or equal to 18 otherwise display the message as "You are not valid for voting"</w:t>
       </w:r>
     </w:p>
     <w:p>
@@ -501,17 +407,8 @@
           <w:lang w:val="en-US"/>
         </w:rPr>
         <w:tab/>
-      </w:r>
-      <w:proofErr w:type="spellStart"/>
-      <w:r>
-        <w:rPr>
-          <w:sz w:val="24"/>
-          <w:szCs w:val="24"/>
-          <w:lang w:val="en-US"/>
-        </w:rPr>
         <w:t>Dist</w:t>
       </w:r>
-      <w:proofErr w:type="spellEnd"/>
       <w:r>
         <w:rPr>
           <w:sz w:val="24"/>
@@ -748,7 +645,6 @@
           <w:lang w:val="en-US"/>
         </w:rPr>
       </w:pPr>
-      <w:proofErr w:type="spellStart"/>
       <w:r>
         <w:rPr>
           <w:sz w:val="24"/>
@@ -757,7 +653,6 @@
         </w:rPr>
         <w:t>AccountNo</w:t>
       </w:r>
-      <w:proofErr w:type="spellEnd"/>
     </w:p>
     <w:p>
       <w:pPr>
@@ -772,7 +667,6 @@
           <w:lang w:val="en-US"/>
         </w:rPr>
       </w:pPr>
-      <w:proofErr w:type="spellStart"/>
       <w:r>
         <w:rPr>
           <w:sz w:val="24"/>
@@ -781,7 +675,6 @@
         </w:rPr>
         <w:t>AccountHolderName</w:t>
       </w:r>
-      <w:proofErr w:type="spellEnd"/>
     </w:p>
     <w:p>
       <w:pPr>
@@ -862,23 +755,13 @@
           <w:lang w:val="en-US"/>
         </w:rPr>
       </w:pPr>
-      <w:proofErr w:type="spellStart"/>
-      <w:r>
-        <w:rPr>
-          <w:sz w:val="24"/>
-          <w:szCs w:val="24"/>
-          <w:lang w:val="en-US"/>
-        </w:rPr>
-        <w:t>DisplayData</w:t>
-      </w:r>
-      <w:proofErr w:type="spellEnd"/>
-      <w:r>
-        <w:rPr>
-          <w:sz w:val="24"/>
-          <w:szCs w:val="24"/>
-          <w:lang w:val="en-US"/>
-        </w:rPr>
-        <w:t>()</w:t>
+      <w:r>
+        <w:rPr>
+          <w:sz w:val="24"/>
+          <w:szCs w:val="24"/>
+          <w:lang w:val="en-US"/>
+        </w:rPr>
+        <w:t>DisplayData()</w:t>
       </w:r>
     </w:p>
     <w:p>
@@ -939,25 +822,7 @@
           <w:szCs w:val="24"/>
           <w:lang w:val="en-US"/>
         </w:rPr>
-        <w:t xml:space="preserve">Try </w:t>
-      </w:r>
-      <w:proofErr w:type="gramStart"/>
-      <w:r>
-        <w:rPr>
-          <w:sz w:val="24"/>
-          <w:szCs w:val="24"/>
-          <w:lang w:val="en-US"/>
-        </w:rPr>
-        <w:t>getPageSource(</w:t>
-      </w:r>
-      <w:proofErr w:type="gramEnd"/>
-      <w:r>
-        <w:rPr>
-          <w:sz w:val="24"/>
-          <w:szCs w:val="24"/>
-          <w:lang w:val="en-US"/>
-        </w:rPr>
-        <w:t>) on any web site. What is the return type and use of this method?</w:t>
+        <w:t>Try getPageSource() on any web site. What is the return type and use of this method?</w:t>
       </w:r>
     </w:p>
     <w:p>
@@ -1012,25 +877,7 @@
           <w:szCs w:val="24"/>
           <w:lang w:val="en-US"/>
         </w:rPr>
-        <w:t>Enter username as your name (</w:t>
-      </w:r>
-      <w:proofErr w:type="spellStart"/>
-      <w:r>
-        <w:rPr>
-          <w:sz w:val="24"/>
-          <w:szCs w:val="24"/>
-          <w:lang w:val="en-US"/>
-        </w:rPr>
-        <w:t>amita</w:t>
-      </w:r>
-      <w:proofErr w:type="spellEnd"/>
-      <w:r>
-        <w:rPr>
-          <w:sz w:val="24"/>
-          <w:szCs w:val="24"/>
-          <w:lang w:val="en-US"/>
-        </w:rPr>
-        <w:t>)</w:t>
+        <w:t>Enter username as your name (amita)</w:t>
       </w:r>
     </w:p>
     <w:p>
@@ -1149,7 +996,6 @@
         </w:rPr>
         <w:t>Enter username as your name (</w:t>
       </w:r>
-      <w:proofErr w:type="spellStart"/>
       <w:r>
         <w:rPr>
           <w:sz w:val="24"/>
@@ -1158,7 +1004,6 @@
         </w:rPr>
         <w:t>trupti</w:t>
       </w:r>
-      <w:proofErr w:type="spellEnd"/>
       <w:r>
         <w:rPr>
           <w:sz w:val="24"/>
@@ -1298,25 +1143,7 @@
           <w:szCs w:val="24"/>
           <w:lang w:val="en-US"/>
         </w:rPr>
-        <w:t>Enter username as your name (</w:t>
-      </w:r>
-      <w:proofErr w:type="spellStart"/>
-      <w:r>
-        <w:rPr>
-          <w:sz w:val="24"/>
-          <w:szCs w:val="24"/>
-          <w:lang w:val="en-US"/>
-        </w:rPr>
-        <w:t>trupti</w:t>
-      </w:r>
-      <w:proofErr w:type="spellEnd"/>
-      <w:r>
-        <w:rPr>
-          <w:sz w:val="24"/>
-          <w:szCs w:val="24"/>
-          <w:lang w:val="en-US"/>
-        </w:rPr>
-        <w:t>)</w:t>
+        <w:t>Enter username as your name (trupti)</w:t>
       </w:r>
     </w:p>
     <w:p>
@@ -1638,25 +1465,7 @@
           <w:szCs w:val="24"/>
           <w:lang w:val="en-US"/>
         </w:rPr>
-        <w:t>Enter username as your name (</w:t>
-      </w:r>
-      <w:proofErr w:type="spellStart"/>
-      <w:r>
-        <w:rPr>
-          <w:sz w:val="24"/>
-          <w:szCs w:val="24"/>
-          <w:lang w:val="en-US"/>
-        </w:rPr>
-        <w:t>trupti</w:t>
-      </w:r>
-      <w:proofErr w:type="spellEnd"/>
-      <w:r>
-        <w:rPr>
-          <w:sz w:val="24"/>
-          <w:szCs w:val="24"/>
-          <w:lang w:val="en-US"/>
-        </w:rPr>
-        <w:t>)</w:t>
+        <w:t>Enter username as your name (trupti)</w:t>
       </w:r>
     </w:p>
     <w:p>
@@ -1793,25 +1602,7 @@
           <w:szCs w:val="24"/>
           <w:lang w:val="en-US"/>
         </w:rPr>
-        <w:t>Enter username as your name (</w:t>
-      </w:r>
-      <w:proofErr w:type="spellStart"/>
-      <w:r>
-        <w:rPr>
-          <w:sz w:val="24"/>
-          <w:szCs w:val="24"/>
-          <w:lang w:val="en-US"/>
-        </w:rPr>
-        <w:t>trupti</w:t>
-      </w:r>
-      <w:proofErr w:type="spellEnd"/>
-      <w:r>
-        <w:rPr>
-          <w:sz w:val="24"/>
-          <w:szCs w:val="24"/>
-          <w:lang w:val="en-US"/>
-        </w:rPr>
-        <w:t>)</w:t>
+        <w:t>Enter username as your name (trupti)</w:t>
       </w:r>
     </w:p>
     <w:p>
@@ -2294,25 +2085,7 @@
           <w:szCs w:val="24"/>
           <w:lang w:val="en-US"/>
         </w:rPr>
-        <w:t>Enter username as your name (</w:t>
-      </w:r>
-      <w:proofErr w:type="spellStart"/>
-      <w:r>
-        <w:rPr>
-          <w:sz w:val="24"/>
-          <w:szCs w:val="24"/>
-          <w:lang w:val="en-US"/>
-        </w:rPr>
-        <w:t>trupti</w:t>
-      </w:r>
-      <w:proofErr w:type="spellEnd"/>
-      <w:r>
-        <w:rPr>
-          <w:sz w:val="24"/>
-          <w:szCs w:val="24"/>
-          <w:lang w:val="en-US"/>
-        </w:rPr>
-        <w:t>)</w:t>
+        <w:t>Enter username as your name (trupti)</w:t>
       </w:r>
     </w:p>
     <w:p>
@@ -3409,25 +3182,7 @@
           <w:szCs w:val="24"/>
           <w:lang w:val="en-US"/>
         </w:rPr>
-        <w:t xml:space="preserve">Enter first 4 characters from your city (Kolhapur – </w:t>
-      </w:r>
-      <w:proofErr w:type="spellStart"/>
-      <w:r>
-        <w:rPr>
-          <w:sz w:val="24"/>
-          <w:szCs w:val="24"/>
-          <w:lang w:val="en-US"/>
-        </w:rPr>
-        <w:t>kolh</w:t>
-      </w:r>
-      <w:proofErr w:type="spellEnd"/>
-      <w:r>
-        <w:rPr>
-          <w:sz w:val="24"/>
-          <w:szCs w:val="24"/>
-          <w:lang w:val="en-US"/>
-        </w:rPr>
-        <w:t>)</w:t>
+        <w:t>Enter first 4 characters from your city (Kolhapur – kolh)</w:t>
       </w:r>
     </w:p>
     <w:p>
@@ -4132,8 +3887,6 @@
         </w:rPr>
         <w:t>Logout</w:t>
       </w:r>
-      <w:bookmarkStart w:id="0" w:name="_GoBack"/>
-      <w:bookmarkEnd w:id="0"/>
     </w:p>
     <w:p>
       <w:pPr>
@@ -4155,18 +3908,8 @@
           <w:szCs w:val="24"/>
           <w:lang w:val="en-US"/>
         </w:rPr>
-        <w:t xml:space="preserve">Login using data provided in step no h &amp; </w:t>
-      </w:r>
-      <w:proofErr w:type="spellStart"/>
-      <w:r>
-        <w:rPr>
-          <w:sz w:val="24"/>
-          <w:szCs w:val="24"/>
-          <w:lang w:val="en-US"/>
-        </w:rPr>
-        <w:t>i</w:t>
-      </w:r>
-      <w:proofErr w:type="spellEnd"/>
+        <w:t>Login using data provided in step no h &amp; i</w:t>
+      </w:r>
     </w:p>
     <w:p>
       <w:pPr>
@@ -5119,25 +4862,7 @@
           <w:szCs w:val="24"/>
           <w:lang w:val="en-US"/>
         </w:rPr>
-        <w:t xml:space="preserve">Click on </w:t>
-      </w:r>
-      <w:proofErr w:type="spellStart"/>
-      <w:r>
-        <w:rPr>
-          <w:sz w:val="24"/>
-          <w:szCs w:val="24"/>
-          <w:lang w:val="en-US"/>
-        </w:rPr>
-        <w:t>ClickToGetAlert</w:t>
-      </w:r>
-      <w:proofErr w:type="spellEnd"/>
-      <w:r>
-        <w:rPr>
-          <w:sz w:val="24"/>
-          <w:szCs w:val="24"/>
-          <w:lang w:val="en-US"/>
-        </w:rPr>
-        <w:t xml:space="preserve"> button</w:t>
+        <w:t>Click on ClickToGetAlert button</w:t>
       </w:r>
     </w:p>
     <w:p>
@@ -5206,25 +4931,7 @@
           <w:szCs w:val="24"/>
           <w:lang w:val="en-US"/>
         </w:rPr>
-        <w:t xml:space="preserve">Click on </w:t>
-      </w:r>
-      <w:proofErr w:type="spellStart"/>
-      <w:r>
-        <w:rPr>
-          <w:sz w:val="24"/>
-          <w:szCs w:val="24"/>
-          <w:lang w:val="en-US"/>
-        </w:rPr>
-        <w:t>GetPrompt</w:t>
-      </w:r>
-      <w:proofErr w:type="spellEnd"/>
-      <w:r>
-        <w:rPr>
-          <w:sz w:val="24"/>
-          <w:szCs w:val="24"/>
-          <w:lang w:val="en-US"/>
-        </w:rPr>
-        <w:t xml:space="preserve"> Button</w:t>
+        <w:t>Click on GetPrompt Button</w:t>
       </w:r>
     </w:p>
     <w:p>
@@ -5294,25 +5001,7 @@
           <w:szCs w:val="24"/>
           <w:lang w:val="en-US"/>
         </w:rPr>
-        <w:t xml:space="preserve">Click on </w:t>
-      </w:r>
-      <w:proofErr w:type="spellStart"/>
-      <w:r>
-        <w:rPr>
-          <w:sz w:val="24"/>
-          <w:szCs w:val="24"/>
-          <w:lang w:val="en-US"/>
-        </w:rPr>
-        <w:t>GetConfirmation</w:t>
-      </w:r>
-      <w:proofErr w:type="spellEnd"/>
-      <w:r>
-        <w:rPr>
-          <w:sz w:val="24"/>
-          <w:szCs w:val="24"/>
-          <w:lang w:val="en-US"/>
-        </w:rPr>
-        <w:t xml:space="preserve"> Button </w:t>
+        <w:t xml:space="preserve">Click on GetConfirmation Button </w:t>
       </w:r>
     </w:p>
     <w:p>
@@ -5623,7 +5312,7 @@
       <w:pPr>
         <w:pStyle w:val="ListParagraph"/>
         <w:numPr>
-          <w:ilvl w:val="0"/>
+          <w:ilvl w:val="1"/>
           <w:numId w:val="3"/>
         </w:numPr>
         <w:rPr>
@@ -6113,61 +5802,125 @@
           <w:szCs w:val="22"/>
           <w:lang w:val="en-US"/>
         </w:rPr>
-        <w:t xml:space="preserve">Click on </w:t>
-      </w:r>
-      <w:proofErr w:type="spellStart"/>
-      <w:r>
-        <w:rPr>
-          <w:b/>
-          <w:bCs/>
+        <w:t>Click on Nandhini link</w:t>
+      </w:r>
+    </w:p>
+    <w:p>
+      <w:pPr>
+        <w:pStyle w:val="ListParagraph"/>
+        <w:numPr>
+          <w:ilvl w:val="1"/>
+          <w:numId w:val="7"/>
+        </w:numPr>
+        <w:rPr>
           <w:sz w:val="24"/>
           <w:szCs w:val="22"/>
           <w:lang w:val="en-US"/>
         </w:rPr>
-        <w:t>Nandhini</w:t>
-      </w:r>
-      <w:proofErr w:type="spellEnd"/>
-      <w:r>
-        <w:rPr>
-          <w:b/>
-          <w:bCs/>
+      </w:pPr>
+      <w:r>
+        <w:rPr>
           <w:sz w:val="24"/>
           <w:szCs w:val="22"/>
           <w:lang w:val="en-US"/>
         </w:rPr>
-        <w:t xml:space="preserve"> link</w:t>
-      </w:r>
-    </w:p>
-    <w:p>
-      <w:pPr>
-        <w:pStyle w:val="ListParagraph"/>
-        <w:numPr>
-          <w:ilvl w:val="1"/>
+        <w:t>Print the title</w:t>
+      </w:r>
+    </w:p>
+    <w:p>
+      <w:pPr>
+        <w:pStyle w:val="ListParagraph"/>
+        <w:numPr>
+          <w:ilvl w:val="0"/>
           <w:numId w:val="7"/>
         </w:numPr>
         <w:rPr>
           <w:sz w:val="24"/>
-          <w:szCs w:val="22"/>
-          <w:lang w:val="en-US"/>
-        </w:rPr>
-      </w:pPr>
-      <w:r>
-        <w:rPr>
-          <w:sz w:val="24"/>
-          <w:szCs w:val="22"/>
-          <w:lang w:val="en-US"/>
-        </w:rPr>
-        <w:t>Print the title</w:t>
-      </w:r>
-    </w:p>
-    <w:p>
-      <w:pPr>
-        <w:rPr>
-          <w:sz w:val="24"/>
-          <w:szCs w:val="24"/>
-          <w:lang w:val="en-US"/>
-        </w:rPr>
-      </w:pPr>
+          <w:szCs w:val="24"/>
+          <w:lang w:val="en-US"/>
+        </w:rPr>
+      </w:pPr>
+      <w:r>
+        <w:rPr>
+          <w:sz w:val="24"/>
+          <w:szCs w:val="24"/>
+          <w:lang w:val="en-US"/>
+        </w:rPr>
+        <w:t>Complete above assignment via @DataProvider</w:t>
+      </w:r>
+    </w:p>
+    <w:p>
+      <w:pPr>
+        <w:pStyle w:val="ListParagraph"/>
+        <w:numPr>
+          <w:ilvl w:val="0"/>
+          <w:numId w:val="7"/>
+        </w:numPr>
+        <w:rPr>
+          <w:sz w:val="24"/>
+          <w:szCs w:val="24"/>
+          <w:lang w:val="en-US"/>
+        </w:rPr>
+      </w:pPr>
+      <w:r>
+        <w:rPr>
+          <w:sz w:val="24"/>
+          <w:szCs w:val="24"/>
+          <w:lang w:val="en-US"/>
+        </w:rPr>
+        <w:t xml:space="preserve">Complete </w:t>
+      </w:r>
+      <w:hyperlink r:id="rId42" w:history="1">
+        <w:r>
+          <w:rPr>
+            <w:rStyle w:val="Hyperlink"/>
+            <w:sz w:val="24"/>
+            <w:szCs w:val="24"/>
+            <w:lang w:val="en-US"/>
+          </w:rPr>
+          <w:t>https://www.echotrak.com/Login.aspx?ReturnUrl=%2f</w:t>
+        </w:r>
+      </w:hyperlink>
+      <w:r>
+        <w:rPr>
+          <w:sz w:val="24"/>
+          <w:szCs w:val="24"/>
+          <w:lang w:val="en-US"/>
+        </w:rPr>
+        <w:t xml:space="preserve"> assignment us</w:t>
+      </w:r>
+      <w:r>
+        <w:rPr>
+          <w:sz w:val="24"/>
+          <w:szCs w:val="24"/>
+          <w:lang w:val="en-US"/>
+        </w:rPr>
+        <w:t>ing @DataProvider. Pass at least</w:t>
+      </w:r>
+      <w:r>
+        <w:rPr>
+          <w:sz w:val="24"/>
+          <w:szCs w:val="24"/>
+          <w:lang w:val="en-US"/>
+        </w:rPr>
+        <w:t xml:space="preserve"> 5 data set.</w:t>
+      </w:r>
+    </w:p>
+    <w:p>
+      <w:pPr>
+        <w:pStyle w:val="ListParagraph"/>
+        <w:numPr>
+          <w:ilvl w:val="0"/>
+          <w:numId w:val="7"/>
+        </w:numPr>
+        <w:rPr>
+          <w:sz w:val="24"/>
+          <w:szCs w:val="24"/>
+          <w:lang w:val="en-US"/>
+        </w:rPr>
+      </w:pPr>
+      <w:bookmarkStart w:id="0" w:name="_GoBack"/>
+      <w:bookmarkEnd w:id="0"/>
     </w:p>
     <w:sectPr>
       <w:pgSz w:w="11906" w:h="16838"/>

</xml_diff>